<commit_message>
Vectorised single-row Isolation Forest scoring, bit-identical to scikit-learn (35,994 real rows, six models); corrected scale results (about 1 ms per reading, was 7.5); generated speed statements
</commit_message>
<xml_diff>
--- a/docs/TECHNICAL_REPORT.docx
+++ b/docs/TECHNICAL_REPORT.docx
@@ -34673,62 +34673,62 @@
               <w:pStyle w:val="Compact"/>
             </w:pPr>
             <w:r>
-              <w:t xml:space="preserve">130.9</w:t>
-            </w:r>
-          </w:p>
-        </w:tc>
-        <w:tc>
-          <w:tcPr/>
-          <w:p>
-            <w:pPr>
-              <w:pStyle w:val="Compact"/>
-            </w:pPr>
-            <w:r>
-              <w:t xml:space="preserve">7.383</w:t>
-            </w:r>
-          </w:p>
-        </w:tc>
-        <w:tc>
-          <w:tcPr/>
-          <w:p>
-            <w:pPr>
-              <w:pStyle w:val="Compact"/>
-            </w:pPr>
-            <w:r>
-              <w:t xml:space="preserve">9.891</w:t>
-            </w:r>
-          </w:p>
-        </w:tc>
-        <w:tc>
-          <w:tcPr/>
-          <w:p>
-            <w:pPr>
-              <w:pStyle w:val="Compact"/>
-            </w:pPr>
-            <w:r>
-              <w:t xml:space="preserve">11.591</w:t>
-            </w:r>
-          </w:p>
-        </w:tc>
-        <w:tc>
-          <w:tcPr/>
-          <w:p>
-            <w:pPr>
-              <w:pStyle w:val="Compact"/>
-            </w:pPr>
-            <w:r>
-              <w:t xml:space="preserve">5.99</w:t>
-            </w:r>
-          </w:p>
-        </w:tc>
-        <w:tc>
-          <w:tcPr/>
-          <w:p>
-            <w:pPr>
-              <w:pStyle w:val="Compact"/>
-            </w:pPr>
-            <w:r>
-              <w:t xml:space="preserve">1584.4</w:t>
+              <w:t xml:space="preserve">923.8</w:t>
+            </w:r>
+          </w:p>
+        </w:tc>
+        <w:tc>
+          <w:tcPr/>
+          <w:p>
+            <w:pPr>
+              <w:pStyle w:val="Compact"/>
+            </w:pPr>
+            <w:r>
+              <w:t xml:space="preserve">0.921</w:t>
+            </w:r>
+          </w:p>
+        </w:tc>
+        <w:tc>
+          <w:tcPr/>
+          <w:p>
+            <w:pPr>
+              <w:pStyle w:val="Compact"/>
+            </w:pPr>
+            <w:r>
+              <w:t xml:space="preserve">2.368</w:t>
+            </w:r>
+          </w:p>
+        </w:tc>
+        <w:tc>
+          <w:tcPr/>
+          <w:p>
+            <w:pPr>
+              <w:pStyle w:val="Compact"/>
+            </w:pPr>
+            <w:r>
+              <w:t xml:space="preserve">2.787</w:t>
+            </w:r>
+          </w:p>
+        </w:tc>
+        <w:tc>
+          <w:tcPr/>
+          <w:p>
+            <w:pPr>
+              <w:pStyle w:val="Compact"/>
+            </w:pPr>
+            <w:r>
+              <w:t xml:space="preserve">6.92</w:t>
+            </w:r>
+          </w:p>
+        </w:tc>
+        <w:tc>
+          <w:tcPr/>
+          <w:p>
+            <w:pPr>
+              <w:pStyle w:val="Compact"/>
+            </w:pPr>
+            <w:r>
+              <w:t xml:space="preserve">1584.5</w:t>
             </w:r>
           </w:p>
         </w:tc>
@@ -34752,62 +34752,62 @@
               <w:pStyle w:val="Compact"/>
             </w:pPr>
             <w:r>
-              <w:t xml:space="preserve">124.8</w:t>
-            </w:r>
-          </w:p>
-        </w:tc>
-        <w:tc>
-          <w:tcPr/>
-          <w:p>
-            <w:pPr>
-              <w:pStyle w:val="Compact"/>
-            </w:pPr>
-            <w:r>
-              <w:t xml:space="preserve">7.626</w:t>
-            </w:r>
-          </w:p>
-        </w:tc>
-        <w:tc>
-          <w:tcPr/>
-          <w:p>
-            <w:pPr>
-              <w:pStyle w:val="Compact"/>
-            </w:pPr>
-            <w:r>
-              <w:t xml:space="preserve">10.956</w:t>
-            </w:r>
-          </w:p>
-        </w:tc>
-        <w:tc>
-          <w:tcPr/>
-          <w:p>
-            <w:pPr>
-              <w:pStyle w:val="Compact"/>
-            </w:pPr>
-            <w:r>
-              <w:t xml:space="preserve">13.092</w:t>
-            </w:r>
-          </w:p>
-        </w:tc>
-        <w:tc>
-          <w:tcPr/>
-          <w:p>
-            <w:pPr>
-              <w:pStyle w:val="Compact"/>
-            </w:pPr>
-            <w:r>
-              <w:t xml:space="preserve">2.07</w:t>
-            </w:r>
-          </w:p>
-        </w:tc>
-        <w:tc>
-          <w:tcPr/>
-          <w:p>
-            <w:pPr>
-              <w:pStyle w:val="Compact"/>
-            </w:pPr>
-            <w:r>
-              <w:t xml:space="preserve">1584.4</w:t>
+              <w:t xml:space="preserve">851.4</w:t>
+            </w:r>
+          </w:p>
+        </w:tc>
+        <w:tc>
+          <w:tcPr/>
+          <w:p>
+            <w:pPr>
+              <w:pStyle w:val="Compact"/>
+            </w:pPr>
+            <w:r>
+              <w:t xml:space="preserve">0.968</w:t>
+            </w:r>
+          </w:p>
+        </w:tc>
+        <w:tc>
+          <w:tcPr/>
+          <w:p>
+            <w:pPr>
+              <w:pStyle w:val="Compact"/>
+            </w:pPr>
+            <w:r>
+              <w:t xml:space="preserve">2.553</w:t>
+            </w:r>
+          </w:p>
+        </w:tc>
+        <w:tc>
+          <w:tcPr/>
+          <w:p>
+            <w:pPr>
+              <w:pStyle w:val="Compact"/>
+            </w:pPr>
+            <w:r>
+              <w:t xml:space="preserve">2.994</w:t>
+            </w:r>
+          </w:p>
+        </w:tc>
+        <w:tc>
+          <w:tcPr/>
+          <w:p>
+            <w:pPr>
+              <w:pStyle w:val="Compact"/>
+            </w:pPr>
+            <w:r>
+              <w:t xml:space="preserve">3.05</w:t>
+            </w:r>
+          </w:p>
+        </w:tc>
+        <w:tc>
+          <w:tcPr/>
+          <w:p>
+            <w:pPr>
+              <w:pStyle w:val="Compact"/>
+            </w:pPr>
+            <w:r>
+              <w:t xml:space="preserve">1584.5</w:t>
             </w:r>
           </w:p>
         </w:tc>
@@ -34831,62 +34831,62 @@
               <w:pStyle w:val="Compact"/>
             </w:pPr>
             <w:r>
-              <w:t xml:space="preserve">124.8</w:t>
-            </w:r>
-          </w:p>
-        </w:tc>
-        <w:tc>
-          <w:tcPr/>
-          <w:p>
-            <w:pPr>
-              <w:pStyle w:val="Compact"/>
-            </w:pPr>
-            <w:r>
-              <w:t xml:space="preserve">7.638</w:t>
-            </w:r>
-          </w:p>
-        </w:tc>
-        <w:tc>
-          <w:tcPr/>
-          <w:p>
-            <w:pPr>
-              <w:pStyle w:val="Compact"/>
-            </w:pPr>
-            <w:r>
-              <w:t xml:space="preserve">10.952</w:t>
-            </w:r>
-          </w:p>
-        </w:tc>
-        <w:tc>
-          <w:tcPr/>
-          <w:p>
-            <w:pPr>
-              <w:pStyle w:val="Compact"/>
-            </w:pPr>
-            <w:r>
-              <w:t xml:space="preserve">13.594</w:t>
-            </w:r>
-          </w:p>
-        </w:tc>
-        <w:tc>
-          <w:tcPr/>
-          <w:p>
-            <w:pPr>
-              <w:pStyle w:val="Compact"/>
-            </w:pPr>
-            <w:r>
-              <w:t xml:space="preserve">1.9</w:t>
-            </w:r>
-          </w:p>
-        </w:tc>
-        <w:tc>
-          <w:tcPr/>
-          <w:p>
-            <w:pPr>
-              <w:pStyle w:val="Compact"/>
-            </w:pPr>
-            <w:r>
-              <w:t xml:space="preserve">1584.4</w:t>
+              <w:t xml:space="preserve">836.6</w:t>
+            </w:r>
+          </w:p>
+        </w:tc>
+        <w:tc>
+          <w:tcPr/>
+          <w:p>
+            <w:pPr>
+              <w:pStyle w:val="Compact"/>
+            </w:pPr>
+            <w:r>
+              <w:t xml:space="preserve">0.968</w:t>
+            </w:r>
+          </w:p>
+        </w:tc>
+        <w:tc>
+          <w:tcPr/>
+          <w:p>
+            <w:pPr>
+              <w:pStyle w:val="Compact"/>
+            </w:pPr>
+            <w:r>
+              <w:t xml:space="preserve">2.559</w:t>
+            </w:r>
+          </w:p>
+        </w:tc>
+        <w:tc>
+          <w:tcPr/>
+          <w:p>
+            <w:pPr>
+              <w:pStyle w:val="Compact"/>
+            </w:pPr>
+            <w:r>
+              <w:t xml:space="preserve">3.065</w:t>
+            </w:r>
+          </w:p>
+        </w:tc>
+        <w:tc>
+          <w:tcPr/>
+          <w:p>
+            <w:pPr>
+              <w:pStyle w:val="Compact"/>
+            </w:pPr>
+            <w:r>
+              <w:t xml:space="preserve">2.99</w:t>
+            </w:r>
+          </w:p>
+        </w:tc>
+        <w:tc>
+          <w:tcPr/>
+          <w:p>
+            <w:pPr>
+              <w:pStyle w:val="Compact"/>
+            </w:pPr>
+            <w:r>
+              <w:t xml:space="preserve">1584.5</w:t>
             </w:r>
           </w:p>
         </w:tc>
@@ -34910,62 +34910,62 @@
               <w:pStyle w:val="Compact"/>
             </w:pPr>
             <w:r>
-              <w:t xml:space="preserve">123.9</w:t>
-            </w:r>
-          </w:p>
-        </w:tc>
-        <w:tc>
-          <w:tcPr/>
-          <w:p>
-            <w:pPr>
-              <w:pStyle w:val="Compact"/>
-            </w:pPr>
-            <w:r>
-              <w:t xml:space="preserve">7.682</w:t>
-            </w:r>
-          </w:p>
-        </w:tc>
-        <w:tc>
-          <w:tcPr/>
-          <w:p>
-            <w:pPr>
-              <w:pStyle w:val="Compact"/>
-            </w:pPr>
-            <w:r>
-              <w:t xml:space="preserve">10.978</w:t>
-            </w:r>
-          </w:p>
-        </w:tc>
-        <w:tc>
-          <w:tcPr/>
-          <w:p>
-            <w:pPr>
-              <w:pStyle w:val="Compact"/>
-            </w:pPr>
-            <w:r>
-              <w:t xml:space="preserve">13.824</w:t>
-            </w:r>
-          </w:p>
-        </w:tc>
-        <w:tc>
-          <w:tcPr/>
-          <w:p>
-            <w:pPr>
-              <w:pStyle w:val="Compact"/>
-            </w:pPr>
-            <w:r>
-              <w:t xml:space="preserve">1.26</w:t>
-            </w:r>
-          </w:p>
-        </w:tc>
-        <w:tc>
-          <w:tcPr/>
-          <w:p>
-            <w:pPr>
-              <w:pStyle w:val="Compact"/>
-            </w:pPr>
-            <w:r>
-              <w:t xml:space="preserve">1584.4</w:t>
+              <w:t xml:space="preserve">819.0</w:t>
+            </w:r>
+          </w:p>
+        </w:tc>
+        <w:tc>
+          <w:tcPr/>
+          <w:p>
+            <w:pPr>
+              <w:pStyle w:val="Compact"/>
+            </w:pPr>
+            <w:r>
+              <w:t xml:space="preserve">0.986</w:t>
+            </w:r>
+          </w:p>
+        </w:tc>
+        <w:tc>
+          <w:tcPr/>
+          <w:p>
+            <w:pPr>
+              <w:pStyle w:val="Compact"/>
+            </w:pPr>
+            <w:r>
+              <w:t xml:space="preserve">2.555</w:t>
+            </w:r>
+          </w:p>
+        </w:tc>
+        <w:tc>
+          <w:tcPr/>
+          <w:p>
+            <w:pPr>
+              <w:pStyle w:val="Compact"/>
+            </w:pPr>
+            <w:r>
+              <w:t xml:space="preserve">3.109</w:t>
+            </w:r>
+          </w:p>
+        </w:tc>
+        <w:tc>
+          <w:tcPr/>
+          <w:p>
+            <w:pPr>
+              <w:pStyle w:val="Compact"/>
+            </w:pPr>
+            <w:r>
+              <w:t xml:space="preserve">1.78</w:t>
+            </w:r>
+          </w:p>
+        </w:tc>
+        <w:tc>
+          <w:tcPr/>
+          <w:p>
+            <w:pPr>
+              <w:pStyle w:val="Compact"/>
+            </w:pPr>
+            <w:r>
+              <w:t xml:space="preserve">1584.5</w:t>
             </w:r>
           </w:p>
         </w:tc>
@@ -35080,40 +35080,40 @@
               <w:pStyle w:val="Compact"/>
             </w:pPr>
             <w:r>
-              <w:t xml:space="preserve">1395.4</w:t>
-            </w:r>
-          </w:p>
-        </w:tc>
-        <w:tc>
-          <w:tcPr/>
-          <w:p>
-            <w:pPr>
-              <w:pStyle w:val="Compact"/>
-            </w:pPr>
-            <w:r>
-              <w:t xml:space="preserve">0.521</w:t>
-            </w:r>
-          </w:p>
-        </w:tc>
-        <w:tc>
-          <w:tcPr/>
-          <w:p>
-            <w:pPr>
-              <w:pStyle w:val="Compact"/>
-            </w:pPr>
-            <w:r>
-              <w:t xml:space="preserve">1.948</w:t>
-            </w:r>
-          </w:p>
-        </w:tc>
-        <w:tc>
-          <w:tcPr/>
-          <w:p>
-            <w:pPr>
-              <w:pStyle w:val="Compact"/>
-            </w:pPr>
-            <w:r>
-              <w:t xml:space="preserve">3.678</w:t>
+              <w:t xml:space="preserve">1536.9</w:t>
+            </w:r>
+          </w:p>
+        </w:tc>
+        <w:tc>
+          <w:tcPr/>
+          <w:p>
+            <w:pPr>
+              <w:pStyle w:val="Compact"/>
+            </w:pPr>
+            <w:r>
+              <w:t xml:space="preserve">0.499</w:t>
+            </w:r>
+          </w:p>
+        </w:tc>
+        <w:tc>
+          <w:tcPr/>
+          <w:p>
+            <w:pPr>
+              <w:pStyle w:val="Compact"/>
+            </w:pPr>
+            <w:r>
+              <w:t xml:space="preserve">1.713</w:t>
+            </w:r>
+          </w:p>
+        </w:tc>
+        <w:tc>
+          <w:tcPr/>
+          <w:p>
+            <w:pPr>
+              <w:pStyle w:val="Compact"/>
+            </w:pPr>
+            <w:r>
+              <w:t xml:space="preserve">2.071</w:t>
             </w:r>
           </w:p>
         </w:tc>
@@ -35137,7 +35137,7 @@
               <w:pStyle w:val="Compact"/>
             </w:pPr>
             <w:r>
-              <w:t xml:space="preserve">1430.1</w:t>
+              <w:t xml:space="preserve">1353.0</w:t>
             </w:r>
           </w:p>
         </w:tc>
@@ -35159,18 +35159,18 @@
               <w:pStyle w:val="Compact"/>
             </w:pPr>
             <w:r>
-              <w:t xml:space="preserve">1.947</w:t>
-            </w:r>
-          </w:p>
-        </w:tc>
-        <w:tc>
-          <w:tcPr/>
-          <w:p>
-            <w:pPr>
-              <w:pStyle w:val="Compact"/>
-            </w:pPr>
-            <w:r>
-              <w:t xml:space="preserve">2.346</w:t>
+              <w:t xml:space="preserve">1.977</w:t>
+            </w:r>
+          </w:p>
+        </w:tc>
+        <w:tc>
+          <w:tcPr/>
+          <w:p>
+            <w:pPr>
+              <w:pStyle w:val="Compact"/>
+            </w:pPr>
+            <w:r>
+              <w:t xml:space="preserve">2.395</w:t>
             </w:r>
           </w:p>
         </w:tc>
@@ -35181,7 +35181,7 @@
         <w:pStyle w:val="BodyText"/>
       </w:pPr>
       <w:r>
-        <w:t xml:space="preserve">Real HTTP server (FastAPI + SQLite), 50 stations, 8 concurrent clients: 58.5 requests/s, median 133.12 ms, p95 164.74 ms, p99 189.15 ms, errors 0.</w:t>
+        <w:t xml:space="preserve">Real HTTP server (FastAPI + SQLite), 50 stations, 8 concurrent clients: 164.8 requests/s, median 44.89 ms, p95 59.17 ms, p99 66.33 ms, errors 0.</w:t>
       </w:r>
     </w:p>
     <w:bookmarkEnd w:id="82"/>

</xml_diff>

<commit_message>
Confidence intervals for detection; README says most detections are SUSPECT, not FAULT
</commit_message>
<xml_diff>
--- a/docs/TECHNICAL_REPORT.docx
+++ b/docs/TECHNICAL_REPORT.docx
@@ -28,7 +28,7 @@
         </w:p>
       </w:sdtContent>
     </w:sdt>
-    <w:bookmarkStart w:id="107" w:name="X57b8e1d458ff9a143105c6b655c97d724b6cafb"/>
+    <w:bookmarkStart w:id="111" w:name="X57b8e1d458ff9a143105c6b655c97d724b6cafb"/>
     <w:p>
       <w:pPr>
         <w:pStyle w:val="Heading1"/>
@@ -4549,7 +4549,7 @@
     </w:p>
     <w:bookmarkEnd w:id="35"/>
     <w:bookmarkEnd w:id="36"/>
-    <w:bookmarkStart w:id="84" w:name="results"/>
+    <w:bookmarkStart w:id="88" w:name="results"/>
     <w:p>
       <w:pPr>
         <w:pStyle w:val="Heading2"/>
@@ -4621,7 +4621,7 @@
         <w:t xml:space="preserve">: the injected-fault score, the false-alarm rate on clean data, what happens to real extreme weather, agreement with NOAA’s flags, and drift are different questions. Injected faults are injected; NOAA’s flags come from another automated system, not from truth.</w:t>
       </w:r>
     </w:p>
-    <w:bookmarkStart w:id="47" w:name="Xe6b9afbf5b7a67d096f8c2f0bd898828861eaf9"/>
+    <w:bookmarkStart w:id="48" w:name="Xe6b9afbf5b7a67d096f8c2f0bd898828861eaf9"/>
     <w:p>
       <w:pPr>
         <w:pStyle w:val="Heading3"/>
@@ -6127,7 +6127,364 @@
       </w:tr>
     </w:tbl>
     <w:bookmarkEnd w:id="38"/>
-    <w:bookmarkStart w:id="39" w:name="X533071f3abe575621048977651f95e81713eb06"/>
+    <w:bookmarkStart w:id="39" w:name="X5ab3088f0920785f6aa2914ecaef0c5ecae9cb4"/>
+    <w:p>
+      <w:pPr>
+        <w:pStyle w:val="Heading4"/>
+      </w:pPr>
+      <w:r>
+        <w:t xml:space="preserve">1d. How sure are the detection numbers? (AtmosGuard full, paired criterion, Wilson 95 % interval)</w:t>
+      </w:r>
+    </w:p>
+    <w:p>
+      <w:pPr>
+        <w:pStyle w:val="FirstParagraph"/>
+      </w:pPr>
+      <w:r>
+        <w:t xml:space="preserve">Faults are injected at random places; each row’s interval says how much the percentage could move with another draw of the same size. Faults of one type overlap little but are not fully independent, so read the interval as a guide, not a guarantee.</w:t>
+      </w:r>
+    </w:p>
+    <w:tbl>
+      <w:tblPr>
+        <w:tblStyle w:val="Table"/>
+        <w:tblW w:type="pct" w:w="5000"/>
+        <w:tblLayout w:type="fixed"/>
+        <w:tblLook w:firstRow="1" w:lastRow="0" w:firstColumn="0" w:lastColumn="0" w:noHBand="0" w:noVBand="0" w:val="0020"/>
+      </w:tblPr>
+      <w:tblGrid>
+        <w:gridCol w:w="1980"/>
+        <w:gridCol w:w="1980"/>
+        <w:gridCol w:w="1980"/>
+        <w:gridCol w:w="1980"/>
+      </w:tblGrid>
+      <w:tr>
+        <w:trPr>
+          <w:tblHeader w:val="on"/>
+        </w:trPr>
+        <w:tc>
+          <w:tcPr/>
+          <w:p>
+            <w:pPr>
+              <w:pStyle w:val="Compact"/>
+            </w:pPr>
+            <w:r>
+              <w:t xml:space="preserve">fault type</w:t>
+            </w:r>
+          </w:p>
+        </w:tc>
+        <w:tc>
+          <w:tcPr/>
+          <w:p>
+            <w:pPr>
+              <w:pStyle w:val="Compact"/>
+            </w:pPr>
+            <w:r>
+              <w:t xml:space="preserve">injected</w:t>
+            </w:r>
+          </w:p>
+        </w:tc>
+        <w:tc>
+          <w:tcPr/>
+          <w:p>
+            <w:pPr>
+              <w:pStyle w:val="Compact"/>
+            </w:pPr>
+            <w:r>
+              <w:t xml:space="preserve">raised the alarm (fault-raised)</w:t>
+            </w:r>
+          </w:p>
+        </w:tc>
+        <w:tc>
+          <w:tcPr/>
+          <w:p>
+            <w:pPr>
+              <w:pStyle w:val="Compact"/>
+            </w:pPr>
+            <w:r>
+              <w:t xml:space="preserve">named FAULT</w:t>
+            </w:r>
+          </w:p>
+        </w:tc>
+      </w:tr>
+      <w:tr>
+        <w:tc>
+          <w:tcPr/>
+          <w:p>
+            <w:pPr>
+              <w:pStyle w:val="Compact"/>
+            </w:pPr>
+            <w:r>
+              <w:t xml:space="preserve">frozen</w:t>
+            </w:r>
+          </w:p>
+        </w:tc>
+        <w:tc>
+          <w:tcPr/>
+          <w:p>
+            <w:pPr>
+              <w:pStyle w:val="Compact"/>
+            </w:pPr>
+            <w:r>
+              <w:t xml:space="preserve">243</w:t>
+            </w:r>
+          </w:p>
+        </w:tc>
+        <w:tc>
+          <w:tcPr/>
+          <w:p>
+            <w:pPr>
+              <w:pStyle w:val="Compact"/>
+            </w:pPr>
+            <w:r>
+              <w:t xml:space="preserve">100.0% (98.4-100.0)</w:t>
+            </w:r>
+          </w:p>
+        </w:tc>
+        <w:tc>
+          <w:tcPr/>
+          <w:p>
+            <w:pPr>
+              <w:pStyle w:val="Compact"/>
+            </w:pPr>
+            <w:r>
+              <w:t xml:space="preserve">95.1% (91.6-97.2)</w:t>
+            </w:r>
+          </w:p>
+        </w:tc>
+      </w:tr>
+      <w:tr>
+        <w:tc>
+          <w:tcPr/>
+          <w:p>
+            <w:pPr>
+              <w:pStyle w:val="Compact"/>
+            </w:pPr>
+            <w:r>
+              <w:t xml:space="preserve">spike</w:t>
+            </w:r>
+          </w:p>
+        </w:tc>
+        <w:tc>
+          <w:tcPr/>
+          <w:p>
+            <w:pPr>
+              <w:pStyle w:val="Compact"/>
+            </w:pPr>
+            <w:r>
+              <w:t xml:space="preserve">243</w:t>
+            </w:r>
+          </w:p>
+        </w:tc>
+        <w:tc>
+          <w:tcPr/>
+          <w:p>
+            <w:pPr>
+              <w:pStyle w:val="Compact"/>
+            </w:pPr>
+            <w:r>
+              <w:t xml:space="preserve">97.5% (94.7-98.9)</w:t>
+            </w:r>
+          </w:p>
+        </w:tc>
+        <w:tc>
+          <w:tcPr/>
+          <w:p>
+            <w:pPr>
+              <w:pStyle w:val="Compact"/>
+            </w:pPr>
+            <w:r>
+              <w:t xml:space="preserve">12.3% (8.8-17.1)</w:t>
+            </w:r>
+          </w:p>
+        </w:tc>
+      </w:tr>
+      <w:tr>
+        <w:tc>
+          <w:tcPr/>
+          <w:p>
+            <w:pPr>
+              <w:pStyle w:val="Compact"/>
+            </w:pPr>
+            <w:r>
+              <w:t xml:space="preserve">level shift</w:t>
+            </w:r>
+          </w:p>
+        </w:tc>
+        <w:tc>
+          <w:tcPr/>
+          <w:p>
+            <w:pPr>
+              <w:pStyle w:val="Compact"/>
+            </w:pPr>
+            <w:r>
+              <w:t xml:space="preserve">243</w:t>
+            </w:r>
+          </w:p>
+        </w:tc>
+        <w:tc>
+          <w:tcPr/>
+          <w:p>
+            <w:pPr>
+              <w:pStyle w:val="Compact"/>
+            </w:pPr>
+            <w:r>
+              <w:t xml:space="preserve">97.1% (94.2-98.6)</w:t>
+            </w:r>
+          </w:p>
+        </w:tc>
+        <w:tc>
+          <w:tcPr/>
+          <w:p>
+            <w:pPr>
+              <w:pStyle w:val="Compact"/>
+            </w:pPr>
+            <w:r>
+              <w:t xml:space="preserve">11.5% (8.1-16.1)</w:t>
+            </w:r>
+          </w:p>
+        </w:tc>
+      </w:tr>
+      <w:tr>
+        <w:tc>
+          <w:tcPr/>
+          <w:p>
+            <w:pPr>
+              <w:pStyle w:val="Compact"/>
+            </w:pPr>
+            <w:r>
+              <w:t xml:space="preserve">noise burst</w:t>
+            </w:r>
+          </w:p>
+        </w:tc>
+        <w:tc>
+          <w:tcPr/>
+          <w:p>
+            <w:pPr>
+              <w:pStyle w:val="Compact"/>
+            </w:pPr>
+            <w:r>
+              <w:t xml:space="preserve">243</w:t>
+            </w:r>
+          </w:p>
+        </w:tc>
+        <w:tc>
+          <w:tcPr/>
+          <w:p>
+            <w:pPr>
+              <w:pStyle w:val="Compact"/>
+            </w:pPr>
+            <w:r>
+              <w:t xml:space="preserve">77.8% (72.1-82.5)</w:t>
+            </w:r>
+          </w:p>
+        </w:tc>
+        <w:tc>
+          <w:tcPr/>
+          <w:p>
+            <w:pPr>
+              <w:pStyle w:val="Compact"/>
+            </w:pPr>
+            <w:r>
+              <w:t xml:space="preserve">15.6% (11.6-20.7)</w:t>
+            </w:r>
+          </w:p>
+        </w:tc>
+      </w:tr>
+      <w:tr>
+        <w:tc>
+          <w:tcPr/>
+          <w:p>
+            <w:pPr>
+              <w:pStyle w:val="Compact"/>
+            </w:pPr>
+            <w:r>
+              <w:t xml:space="preserve">dropout</w:t>
+            </w:r>
+          </w:p>
+        </w:tc>
+        <w:tc>
+          <w:tcPr/>
+          <w:p>
+            <w:pPr>
+              <w:pStyle w:val="Compact"/>
+            </w:pPr>
+            <w:r>
+              <w:t xml:space="preserve">243</w:t>
+            </w:r>
+          </w:p>
+        </w:tc>
+        <w:tc>
+          <w:tcPr/>
+          <w:p>
+            <w:pPr>
+              <w:pStyle w:val="Compact"/>
+            </w:pPr>
+            <w:r>
+              <w:t xml:space="preserve">99.2% (97.0-99.8)</w:t>
+            </w:r>
+          </w:p>
+        </w:tc>
+        <w:tc>
+          <w:tcPr/>
+          <w:p>
+            <w:pPr>
+              <w:pStyle w:val="Compact"/>
+            </w:pPr>
+            <w:r>
+              <w:t xml:space="preserve">99.2% (97.0-99.8)</w:t>
+            </w:r>
+          </w:p>
+        </w:tc>
+      </w:tr>
+      <w:tr>
+        <w:tc>
+          <w:tcPr/>
+          <w:p>
+            <w:pPr>
+              <w:pStyle w:val="Compact"/>
+            </w:pPr>
+            <w:r>
+              <w:t xml:space="preserve">clock 3 h out</w:t>
+            </w:r>
+          </w:p>
+        </w:tc>
+        <w:tc>
+          <w:tcPr/>
+          <w:p>
+            <w:pPr>
+              <w:pStyle w:val="Compact"/>
+            </w:pPr>
+            <w:r>
+              <w:t xml:space="preserve">220</w:t>
+            </w:r>
+          </w:p>
+        </w:tc>
+        <w:tc>
+          <w:tcPr/>
+          <w:p>
+            <w:pPr>
+              <w:pStyle w:val="Compact"/>
+            </w:pPr>
+            <w:r>
+              <w:t xml:space="preserve">96.8% (93.6-98.5)</w:t>
+            </w:r>
+          </w:p>
+        </w:tc>
+        <w:tc>
+          <w:tcPr/>
+          <w:p>
+            <w:pPr>
+              <w:pStyle w:val="Compact"/>
+            </w:pPr>
+            <w:r>
+              <w:t xml:space="preserve">0.5% (0.1-2.5)</w:t>
+            </w:r>
+          </w:p>
+        </w:tc>
+      </w:tr>
+    </w:tbl>
+    <w:bookmarkEnd w:id="39"/>
+    <w:bookmarkStart w:id="40" w:name="X533071f3abe575621048977651f95e81713eb06"/>
     <w:p>
       <w:pPr>
         <w:pStyle w:val="Heading4"/>
@@ -6480,8 +6837,8 @@
         </w:tc>
       </w:tr>
     </w:tbl>
-    <w:bookmarkEnd w:id="39"/>
-    <w:bookmarkStart w:id="40" w:name="false-alarms-on-clean-real-data"/>
+    <w:bookmarkEnd w:id="40"/>
+    <w:bookmarkStart w:id="41" w:name="false-alarms-on-clean-real-data"/>
     <w:p>
       <w:pPr>
         <w:pStyle w:val="Heading4"/>
@@ -7314,8 +7671,8 @@
         </w:tc>
       </w:tr>
     </w:tbl>
-    <w:bookmarkEnd w:id="40"/>
-    <w:bookmarkStart w:id="41" w:name="real-extreme-weather-nothing-injected"/>
+    <w:bookmarkEnd w:id="41"/>
+    <w:bookmarkStart w:id="42" w:name="real-extreme-weather-nothing-injected"/>
     <w:p>
       <w:pPr>
         <w:pStyle w:val="Heading4"/>
@@ -8670,8 +9027,8 @@
         </w:tc>
       </w:tr>
     </w:tbl>
-    <w:bookmarkEnd w:id="41"/>
-    <w:bookmarkStart w:id="42" w:name="agreement-with-noaas-own-quality-flags"/>
+    <w:bookmarkEnd w:id="42"/>
+    <w:bookmarkStart w:id="43" w:name="agreement-with-noaas-own-quality-flags"/>
     <w:p>
       <w:pPr>
         <w:pStyle w:val="Heading4"/>
@@ -8918,8 +9275,8 @@
         </w:tc>
       </w:tr>
     </w:tbl>
-    <w:bookmarkEnd w:id="42"/>
-    <w:bookmarkStart w:id="43" w:name="slow-drift-judged-by-the-health-monitor"/>
+    <w:bookmarkEnd w:id="43"/>
+    <w:bookmarkStart w:id="44" w:name="slow-drift-judged-by-the-health-monitor"/>
     <w:p>
       <w:pPr>
         <w:pStyle w:val="Heading4"/>
@@ -9229,8 +9586,8 @@
         </w:tc>
       </w:tr>
     </w:tbl>
-    <w:bookmarkEnd w:id="43"/>
-    <w:bookmarkStart w:id="44" w:name="by-station-full-pipeline"/>
+    <w:bookmarkEnd w:id="44"/>
+    <w:bookmarkStart w:id="45" w:name="by-station-full-pipeline"/>
     <w:p>
       <w:pPr>
         <w:pStyle w:val="Heading4"/>
@@ -9898,8 +10255,8 @@
         </w:tc>
       </w:tr>
     </w:tbl>
-    <w:bookmarkEnd w:id="44"/>
-    <w:bookmarkStart w:id="45" w:name="X881876f05ec99845104cd33fe5f7f32f0a4bcba"/>
+    <w:bookmarkEnd w:id="45"/>
+    <w:bookmarkStart w:id="46" w:name="X881876f05ec99845104cd33fe5f7f32f0a4bcba"/>
     <w:p>
       <w:pPr>
         <w:pStyle w:val="Heading4"/>
@@ -11200,8 +11557,8 @@
         </w:tc>
       </w:tr>
     </w:tbl>
-    <w:bookmarkEnd w:id="45"/>
-    <w:bookmarkStart w:id="46" w:name="Xfb6ab3bcaeb4ff7bbe052c431a8e2f0895587d4"/>
+    <w:bookmarkEnd w:id="46"/>
+    <w:bookmarkStart w:id="47" w:name="Xfb6ab3bcaeb4ff7bbe052c431a8e2f0895587d4"/>
     <w:p>
       <w:pPr>
         <w:pStyle w:val="Heading4"/>
@@ -11557,9 +11914,9 @@
         </w:tc>
       </w:tr>
     </w:tbl>
-    <w:bookmarkEnd w:id="46"/>
     <w:bookmarkEnd w:id="47"/>
-    <w:bookmarkStart w:id="58" w:name="X1bd47706f33f60dc5e208326167361276cbf0f9"/>
+    <w:bookmarkEnd w:id="48"/>
+    <w:bookmarkStart w:id="60" w:name="X1bd47706f33f60dc5e208326167361276cbf0f9"/>
     <w:p>
       <w:pPr>
         <w:pStyle w:val="Heading3"/>
@@ -11586,7 +11943,7 @@
         <w:t xml:space="preserve">Stations: BBI, MAA, CCU, DEL, JAI, TRV.</w:t>
       </w:r>
     </w:p>
-    <w:bookmarkStart w:id="48" w:name="headline-1"/>
+    <w:bookmarkStart w:id="49" w:name="headline-1"/>
     <w:p>
       <w:pPr>
         <w:pStyle w:val="Heading4"/>
@@ -11762,8 +12119,8 @@
         </w:tc>
       </w:tr>
     </w:tbl>
-    <w:bookmarkEnd w:id="48"/>
-    <w:bookmarkStart w:id="49" w:name="X4a44603c4574575e135ae07ae6b4b732ccfec61"/>
+    <w:bookmarkEnd w:id="49"/>
+    <w:bookmarkStart w:id="50" w:name="X4a44603c4574575e135ae07ae6b4b732ccfec61"/>
     <w:p>
       <w:pPr>
         <w:pStyle w:val="Heading4"/>
@@ -13064,8 +13421,365 @@
         </w:tc>
       </w:tr>
     </w:tbl>
-    <w:bookmarkEnd w:id="49"/>
-    <w:bookmarkStart w:id="50" w:name="X175b38842166f8fb23fd9b723f562b8e40b74c1"/>
+    <w:bookmarkEnd w:id="50"/>
+    <w:bookmarkStart w:id="51" w:name="Xf5c6d7a243e552f549087d99e1b1c7a6218f388"/>
+    <w:p>
+      <w:pPr>
+        <w:pStyle w:val="Heading4"/>
+      </w:pPr>
+      <w:r>
+        <w:t xml:space="preserve">1d. How sure are the detection numbers? (AtmosGuard full, paired criterion, Wilson 95 % interval)</w:t>
+      </w:r>
+    </w:p>
+    <w:p>
+      <w:pPr>
+        <w:pStyle w:val="FirstParagraph"/>
+      </w:pPr>
+      <w:r>
+        <w:t xml:space="preserve">Faults are injected at random places; each row’s interval says how much the percentage could move with another draw of the same size. Faults of one type overlap little but are not fully independent, so read the interval as a guide, not a guarantee.</w:t>
+      </w:r>
+    </w:p>
+    <w:tbl>
+      <w:tblPr>
+        <w:tblStyle w:val="Table"/>
+        <w:tblW w:type="pct" w:w="5000"/>
+        <w:tblLayout w:type="fixed"/>
+        <w:tblLook w:firstRow="1" w:lastRow="0" w:firstColumn="0" w:lastColumn="0" w:noHBand="0" w:noVBand="0" w:val="0020"/>
+      </w:tblPr>
+      <w:tblGrid>
+        <w:gridCol w:w="1980"/>
+        <w:gridCol w:w="1980"/>
+        <w:gridCol w:w="1980"/>
+        <w:gridCol w:w="1980"/>
+      </w:tblGrid>
+      <w:tr>
+        <w:trPr>
+          <w:tblHeader w:val="on"/>
+        </w:trPr>
+        <w:tc>
+          <w:tcPr/>
+          <w:p>
+            <w:pPr>
+              <w:pStyle w:val="Compact"/>
+            </w:pPr>
+            <w:r>
+              <w:t xml:space="preserve">fault type</w:t>
+            </w:r>
+          </w:p>
+        </w:tc>
+        <w:tc>
+          <w:tcPr/>
+          <w:p>
+            <w:pPr>
+              <w:pStyle w:val="Compact"/>
+            </w:pPr>
+            <w:r>
+              <w:t xml:space="preserve">injected</w:t>
+            </w:r>
+          </w:p>
+        </w:tc>
+        <w:tc>
+          <w:tcPr/>
+          <w:p>
+            <w:pPr>
+              <w:pStyle w:val="Compact"/>
+            </w:pPr>
+            <w:r>
+              <w:t xml:space="preserve">raised the alarm (fault-raised)</w:t>
+            </w:r>
+          </w:p>
+        </w:tc>
+        <w:tc>
+          <w:tcPr/>
+          <w:p>
+            <w:pPr>
+              <w:pStyle w:val="Compact"/>
+            </w:pPr>
+            <w:r>
+              <w:t xml:space="preserve">named FAULT</w:t>
+            </w:r>
+          </w:p>
+        </w:tc>
+      </w:tr>
+      <w:tr>
+        <w:tc>
+          <w:tcPr/>
+          <w:p>
+            <w:pPr>
+              <w:pStyle w:val="Compact"/>
+            </w:pPr>
+            <w:r>
+              <w:t xml:space="preserve">frozen</w:t>
+            </w:r>
+          </w:p>
+        </w:tc>
+        <w:tc>
+          <w:tcPr/>
+          <w:p>
+            <w:pPr>
+              <w:pStyle w:val="Compact"/>
+            </w:pPr>
+            <w:r>
+              <w:t xml:space="preserve">279</w:t>
+            </w:r>
+          </w:p>
+        </w:tc>
+        <w:tc>
+          <w:tcPr/>
+          <w:p>
+            <w:pPr>
+              <w:pStyle w:val="Compact"/>
+            </w:pPr>
+            <w:r>
+              <w:t xml:space="preserve">100.0% (98.6-100.0)</w:t>
+            </w:r>
+          </w:p>
+        </w:tc>
+        <w:tc>
+          <w:tcPr/>
+          <w:p>
+            <w:pPr>
+              <w:pStyle w:val="Compact"/>
+            </w:pPr>
+            <w:r>
+              <w:t xml:space="preserve">95.0% (91.8-97.0)</w:t>
+            </w:r>
+          </w:p>
+        </w:tc>
+      </w:tr>
+      <w:tr>
+        <w:tc>
+          <w:tcPr/>
+          <w:p>
+            <w:pPr>
+              <w:pStyle w:val="Compact"/>
+            </w:pPr>
+            <w:r>
+              <w:t xml:space="preserve">spike</w:t>
+            </w:r>
+          </w:p>
+        </w:tc>
+        <w:tc>
+          <w:tcPr/>
+          <w:p>
+            <w:pPr>
+              <w:pStyle w:val="Compact"/>
+            </w:pPr>
+            <w:r>
+              <w:t xml:space="preserve">279</w:t>
+            </w:r>
+          </w:p>
+        </w:tc>
+        <w:tc>
+          <w:tcPr/>
+          <w:p>
+            <w:pPr>
+              <w:pStyle w:val="Compact"/>
+            </w:pPr>
+            <w:r>
+              <w:t xml:space="preserve">96.4% (93.5-98.0)</w:t>
+            </w:r>
+          </w:p>
+        </w:tc>
+        <w:tc>
+          <w:tcPr/>
+          <w:p>
+            <w:pPr>
+              <w:pStyle w:val="Compact"/>
+            </w:pPr>
+            <w:r>
+              <w:t xml:space="preserve">14.7% (11.0-19.3)</w:t>
+            </w:r>
+          </w:p>
+        </w:tc>
+      </w:tr>
+      <w:tr>
+        <w:tc>
+          <w:tcPr/>
+          <w:p>
+            <w:pPr>
+              <w:pStyle w:val="Compact"/>
+            </w:pPr>
+            <w:r>
+              <w:t xml:space="preserve">level shift</w:t>
+            </w:r>
+          </w:p>
+        </w:tc>
+        <w:tc>
+          <w:tcPr/>
+          <w:p>
+            <w:pPr>
+              <w:pStyle w:val="Compact"/>
+            </w:pPr>
+            <w:r>
+              <w:t xml:space="preserve">279</w:t>
+            </w:r>
+          </w:p>
+        </w:tc>
+        <w:tc>
+          <w:tcPr/>
+          <w:p>
+            <w:pPr>
+              <w:pStyle w:val="Compact"/>
+            </w:pPr>
+            <w:r>
+              <w:t xml:space="preserve">98.2% (95.9-99.2)</w:t>
+            </w:r>
+          </w:p>
+        </w:tc>
+        <w:tc>
+          <w:tcPr/>
+          <w:p>
+            <w:pPr>
+              <w:pStyle w:val="Compact"/>
+            </w:pPr>
+            <w:r>
+              <w:t xml:space="preserve">14.7% (11.0-19.3)</w:t>
+            </w:r>
+          </w:p>
+        </w:tc>
+      </w:tr>
+      <w:tr>
+        <w:tc>
+          <w:tcPr/>
+          <w:p>
+            <w:pPr>
+              <w:pStyle w:val="Compact"/>
+            </w:pPr>
+            <w:r>
+              <w:t xml:space="preserve">noise burst</w:t>
+            </w:r>
+          </w:p>
+        </w:tc>
+        <w:tc>
+          <w:tcPr/>
+          <w:p>
+            <w:pPr>
+              <w:pStyle w:val="Compact"/>
+            </w:pPr>
+            <w:r>
+              <w:t xml:space="preserve">279</w:t>
+            </w:r>
+          </w:p>
+        </w:tc>
+        <w:tc>
+          <w:tcPr/>
+          <w:p>
+            <w:pPr>
+              <w:pStyle w:val="Compact"/>
+            </w:pPr>
+            <w:r>
+              <w:t xml:space="preserve">79.2% (74.1-83.6)</w:t>
+            </w:r>
+          </w:p>
+        </w:tc>
+        <w:tc>
+          <w:tcPr/>
+          <w:p>
+            <w:pPr>
+              <w:pStyle w:val="Compact"/>
+            </w:pPr>
+            <w:r>
+              <w:t xml:space="preserve">12.5% (9.2-16.9)</w:t>
+            </w:r>
+          </w:p>
+        </w:tc>
+      </w:tr>
+      <w:tr>
+        <w:tc>
+          <w:tcPr/>
+          <w:p>
+            <w:pPr>
+              <w:pStyle w:val="Compact"/>
+            </w:pPr>
+            <w:r>
+              <w:t xml:space="preserve">dropout</w:t>
+            </w:r>
+          </w:p>
+        </w:tc>
+        <w:tc>
+          <w:tcPr/>
+          <w:p>
+            <w:pPr>
+              <w:pStyle w:val="Compact"/>
+            </w:pPr>
+            <w:r>
+              <w:t xml:space="preserve">279</w:t>
+            </w:r>
+          </w:p>
+        </w:tc>
+        <w:tc>
+          <w:tcPr/>
+          <w:p>
+            <w:pPr>
+              <w:pStyle w:val="Compact"/>
+            </w:pPr>
+            <w:r>
+              <w:t xml:space="preserve">99.6% (98.0-99.9)</w:t>
+            </w:r>
+          </w:p>
+        </w:tc>
+        <w:tc>
+          <w:tcPr/>
+          <w:p>
+            <w:pPr>
+              <w:pStyle w:val="Compact"/>
+            </w:pPr>
+            <w:r>
+              <w:t xml:space="preserve">99.6% (98.0-99.9)</w:t>
+            </w:r>
+          </w:p>
+        </w:tc>
+      </w:tr>
+      <w:tr>
+        <w:tc>
+          <w:tcPr/>
+          <w:p>
+            <w:pPr>
+              <w:pStyle w:val="Compact"/>
+            </w:pPr>
+            <w:r>
+              <w:t xml:space="preserve">clock 3 h out</w:t>
+            </w:r>
+          </w:p>
+        </w:tc>
+        <w:tc>
+          <w:tcPr/>
+          <w:p>
+            <w:pPr>
+              <w:pStyle w:val="Compact"/>
+            </w:pPr>
+            <w:r>
+              <w:t xml:space="preserve">260</w:t>
+            </w:r>
+          </w:p>
+        </w:tc>
+        <w:tc>
+          <w:tcPr/>
+          <w:p>
+            <w:pPr>
+              <w:pStyle w:val="Compact"/>
+            </w:pPr>
+            <w:r>
+              <w:t xml:space="preserve">96.9% (94.0-98.4)</w:t>
+            </w:r>
+          </w:p>
+        </w:tc>
+        <w:tc>
+          <w:tcPr/>
+          <w:p>
+            <w:pPr>
+              <w:pStyle w:val="Compact"/>
+            </w:pPr>
+            <w:r>
+              <w:t xml:space="preserve">0.0% (0.0-1.5)</w:t>
+            </w:r>
+          </w:p>
+        </w:tc>
+      </w:tr>
+    </w:tbl>
+    <w:bookmarkEnd w:id="51"/>
+    <w:bookmarkStart w:id="52" w:name="X175b38842166f8fb23fd9b723f562b8e40b74c1"/>
     <w:p>
       <w:pPr>
         <w:pStyle w:val="Heading4"/>
@@ -13418,8 +14132,8 @@
         </w:tc>
       </w:tr>
     </w:tbl>
-    <w:bookmarkEnd w:id="50"/>
-    <w:bookmarkStart w:id="51" w:name="false-alarms-on-clean-real-data-1"/>
+    <w:bookmarkEnd w:id="52"/>
+    <w:bookmarkStart w:id="53" w:name="false-alarms-on-clean-real-data-1"/>
     <w:p>
       <w:pPr>
         <w:pStyle w:val="Heading4"/>
@@ -14252,8 +14966,8 @@
         </w:tc>
       </w:tr>
     </w:tbl>
-    <w:bookmarkEnd w:id="51"/>
-    <w:bookmarkStart w:id="52" w:name="real-extreme-weather-nothing-injected-1"/>
+    <w:bookmarkEnd w:id="53"/>
+    <w:bookmarkStart w:id="54" w:name="real-extreme-weather-nothing-injected-1"/>
     <w:p>
       <w:pPr>
         <w:pStyle w:val="Heading4"/>
@@ -15608,8 +16322,8 @@
         </w:tc>
       </w:tr>
     </w:tbl>
-    <w:bookmarkEnd w:id="52"/>
-    <w:bookmarkStart w:id="53" w:name="agreement-with-noaas-own-quality-flags-1"/>
+    <w:bookmarkEnd w:id="54"/>
+    <w:bookmarkStart w:id="55" w:name="agreement-with-noaas-own-quality-flags-1"/>
     <w:p>
       <w:pPr>
         <w:pStyle w:val="Heading4"/>
@@ -15856,8 +16570,8 @@
         </w:tc>
       </w:tr>
     </w:tbl>
-    <w:bookmarkEnd w:id="53"/>
-    <w:bookmarkStart w:id="54" w:name="Xbda1c1c13c23a2302f7fe13e7f763dae028c789"/>
+    <w:bookmarkEnd w:id="55"/>
+    <w:bookmarkStart w:id="56" w:name="Xbda1c1c13c23a2302f7fe13e7f763dae028c789"/>
     <w:p>
       <w:pPr>
         <w:pStyle w:val="Heading4"/>
@@ -16167,8 +16881,8 @@
         </w:tc>
       </w:tr>
     </w:tbl>
-    <w:bookmarkEnd w:id="54"/>
-    <w:bookmarkStart w:id="55" w:name="by-station-full-pipeline-1"/>
+    <w:bookmarkEnd w:id="56"/>
+    <w:bookmarkStart w:id="57" w:name="by-station-full-pipeline-1"/>
     <w:p>
       <w:pPr>
         <w:pStyle w:val="Heading4"/>
@@ -16836,8 +17550,8 @@
         </w:tc>
       </w:tr>
     </w:tbl>
-    <w:bookmarkEnd w:id="55"/>
-    <w:bookmarkStart w:id="56" w:name="X8ff48fcb40bc85761e94abfe25e3d1b65ecf4ae"/>
+    <w:bookmarkEnd w:id="57"/>
+    <w:bookmarkStart w:id="58" w:name="X8ff48fcb40bc85761e94abfe25e3d1b65ecf4ae"/>
     <w:p>
       <w:pPr>
         <w:pStyle w:val="Heading4"/>
@@ -18138,8 +18852,8 @@
         </w:tc>
       </w:tr>
     </w:tbl>
-    <w:bookmarkEnd w:id="56"/>
-    <w:bookmarkStart w:id="57" w:name="X3ac58ffd56e72788bf95fdc6b032ab350013d06"/>
+    <w:bookmarkEnd w:id="58"/>
+    <w:bookmarkStart w:id="59" w:name="X3ac58ffd56e72788bf95fdc6b032ab350013d06"/>
     <w:p>
       <w:pPr>
         <w:pStyle w:val="Heading4"/>
@@ -18495,9 +19209,9 @@
         </w:tc>
       </w:tr>
     </w:tbl>
-    <w:bookmarkEnd w:id="57"/>
-    <w:bookmarkEnd w:id="58"/>
-    <w:bookmarkStart w:id="69" w:name="Xa6cb5755987898943d9c52e72fbaae80d6f556c"/>
+    <w:bookmarkEnd w:id="59"/>
+    <w:bookmarkEnd w:id="60"/>
+    <w:bookmarkStart w:id="72" w:name="Xa6cb5755987898943d9c52e72fbaae80d6f556c"/>
     <w:p>
       <w:pPr>
         <w:pStyle w:val="Heading3"/>
@@ -18524,7 +19238,7 @@
         <w:t xml:space="preserve">Stations: AMD, NAG, BOM, GAU, VTZ, IXZ, BHJ, COK.</w:t>
       </w:r>
     </w:p>
-    <w:bookmarkStart w:id="59" w:name="headline-2"/>
+    <w:bookmarkStart w:id="61" w:name="headline-2"/>
     <w:p>
       <w:pPr>
         <w:pStyle w:val="Heading4"/>
@@ -18700,8 +19414,8 @@
         </w:tc>
       </w:tr>
     </w:tbl>
-    <w:bookmarkEnd w:id="59"/>
-    <w:bookmarkStart w:id="60" w:name="Xce66e0e25ca0ed48937680b7e1ed58616e4da36"/>
+    <w:bookmarkEnd w:id="61"/>
+    <w:bookmarkStart w:id="62" w:name="Xce66e0e25ca0ed48937680b7e1ed58616e4da36"/>
     <w:p>
       <w:pPr>
         <w:pStyle w:val="Heading4"/>
@@ -20002,8 +20716,365 @@
         </w:tc>
       </w:tr>
     </w:tbl>
-    <w:bookmarkEnd w:id="60"/>
-    <w:bookmarkStart w:id="61" w:name="Xcf9112c48ed5a47ffee17975b89c442556bc9e9"/>
+    <w:bookmarkEnd w:id="62"/>
+    <w:bookmarkStart w:id="63" w:name="X9c29aef23fd8fb11a100ea4601528c9bf4ab126"/>
+    <w:p>
+      <w:pPr>
+        <w:pStyle w:val="Heading4"/>
+      </w:pPr>
+      <w:r>
+        <w:t xml:space="preserve">1d. How sure are the detection numbers? (AtmosGuard full, paired criterion, Wilson 95 % interval)</w:t>
+      </w:r>
+    </w:p>
+    <w:p>
+      <w:pPr>
+        <w:pStyle w:val="FirstParagraph"/>
+      </w:pPr>
+      <w:r>
+        <w:t xml:space="preserve">Faults are injected at random places; each row’s interval says how much the percentage could move with another draw of the same size. Faults of one type overlap little but are not fully independent, so read the interval as a guide, not a guarantee.</w:t>
+      </w:r>
+    </w:p>
+    <w:tbl>
+      <w:tblPr>
+        <w:tblStyle w:val="Table"/>
+        <w:tblW w:type="pct" w:w="5000"/>
+        <w:tblLayout w:type="fixed"/>
+        <w:tblLook w:firstRow="1" w:lastRow="0" w:firstColumn="0" w:lastColumn="0" w:noHBand="0" w:noVBand="0" w:val="0020"/>
+      </w:tblPr>
+      <w:tblGrid>
+        <w:gridCol w:w="1980"/>
+        <w:gridCol w:w="1980"/>
+        <w:gridCol w:w="1980"/>
+        <w:gridCol w:w="1980"/>
+      </w:tblGrid>
+      <w:tr>
+        <w:trPr>
+          <w:tblHeader w:val="on"/>
+        </w:trPr>
+        <w:tc>
+          <w:tcPr/>
+          <w:p>
+            <w:pPr>
+              <w:pStyle w:val="Compact"/>
+            </w:pPr>
+            <w:r>
+              <w:t xml:space="preserve">fault type</w:t>
+            </w:r>
+          </w:p>
+        </w:tc>
+        <w:tc>
+          <w:tcPr/>
+          <w:p>
+            <w:pPr>
+              <w:pStyle w:val="Compact"/>
+            </w:pPr>
+            <w:r>
+              <w:t xml:space="preserve">injected</w:t>
+            </w:r>
+          </w:p>
+        </w:tc>
+        <w:tc>
+          <w:tcPr/>
+          <w:p>
+            <w:pPr>
+              <w:pStyle w:val="Compact"/>
+            </w:pPr>
+            <w:r>
+              <w:t xml:space="preserve">raised the alarm (fault-raised)</w:t>
+            </w:r>
+          </w:p>
+        </w:tc>
+        <w:tc>
+          <w:tcPr/>
+          <w:p>
+            <w:pPr>
+              <w:pStyle w:val="Compact"/>
+            </w:pPr>
+            <w:r>
+              <w:t xml:space="preserve">named FAULT</w:t>
+            </w:r>
+          </w:p>
+        </w:tc>
+      </w:tr>
+      <w:tr>
+        <w:tc>
+          <w:tcPr/>
+          <w:p>
+            <w:pPr>
+              <w:pStyle w:val="Compact"/>
+            </w:pPr>
+            <w:r>
+              <w:t xml:space="preserve">frozen</w:t>
+            </w:r>
+          </w:p>
+        </w:tc>
+        <w:tc>
+          <w:tcPr/>
+          <w:p>
+            <w:pPr>
+              <w:pStyle w:val="Compact"/>
+            </w:pPr>
+            <w:r>
+              <w:t xml:space="preserve">702</w:t>
+            </w:r>
+          </w:p>
+        </w:tc>
+        <w:tc>
+          <w:tcPr/>
+          <w:p>
+            <w:pPr>
+              <w:pStyle w:val="Compact"/>
+            </w:pPr>
+            <w:r>
+              <w:t xml:space="preserve">99.9% (99.2-100.0)</w:t>
+            </w:r>
+          </w:p>
+        </w:tc>
+        <w:tc>
+          <w:tcPr/>
+          <w:p>
+            <w:pPr>
+              <w:pStyle w:val="Compact"/>
+            </w:pPr>
+            <w:r>
+              <w:t xml:space="preserve">95.9% (94.1-97.1)</w:t>
+            </w:r>
+          </w:p>
+        </w:tc>
+      </w:tr>
+      <w:tr>
+        <w:tc>
+          <w:tcPr/>
+          <w:p>
+            <w:pPr>
+              <w:pStyle w:val="Compact"/>
+            </w:pPr>
+            <w:r>
+              <w:t xml:space="preserve">spike</w:t>
+            </w:r>
+          </w:p>
+        </w:tc>
+        <w:tc>
+          <w:tcPr/>
+          <w:p>
+            <w:pPr>
+              <w:pStyle w:val="Compact"/>
+            </w:pPr>
+            <w:r>
+              <w:t xml:space="preserve">702</w:t>
+            </w:r>
+          </w:p>
+        </w:tc>
+        <w:tc>
+          <w:tcPr/>
+          <w:p>
+            <w:pPr>
+              <w:pStyle w:val="Compact"/>
+            </w:pPr>
+            <w:r>
+              <w:t xml:space="preserve">89.7% (87.3-91.8)</w:t>
+            </w:r>
+          </w:p>
+        </w:tc>
+        <w:tc>
+          <w:tcPr/>
+          <w:p>
+            <w:pPr>
+              <w:pStyle w:val="Compact"/>
+            </w:pPr>
+            <w:r>
+              <w:t xml:space="preserve">17.0% (14.4-19.9)</w:t>
+            </w:r>
+          </w:p>
+        </w:tc>
+      </w:tr>
+      <w:tr>
+        <w:tc>
+          <w:tcPr/>
+          <w:p>
+            <w:pPr>
+              <w:pStyle w:val="Compact"/>
+            </w:pPr>
+            <w:r>
+              <w:t xml:space="preserve">level shift</w:t>
+            </w:r>
+          </w:p>
+        </w:tc>
+        <w:tc>
+          <w:tcPr/>
+          <w:p>
+            <w:pPr>
+              <w:pStyle w:val="Compact"/>
+            </w:pPr>
+            <w:r>
+              <w:t xml:space="preserve">702</w:t>
+            </w:r>
+          </w:p>
+        </w:tc>
+        <w:tc>
+          <w:tcPr/>
+          <w:p>
+            <w:pPr>
+              <w:pStyle w:val="Compact"/>
+            </w:pPr>
+            <w:r>
+              <w:t xml:space="preserve">89.0% (86.5-91.1)</w:t>
+            </w:r>
+          </w:p>
+        </w:tc>
+        <w:tc>
+          <w:tcPr/>
+          <w:p>
+            <w:pPr>
+              <w:pStyle w:val="Compact"/>
+            </w:pPr>
+            <w:r>
+              <w:t xml:space="preserve">13.4% (11.1-16.1)</w:t>
+            </w:r>
+          </w:p>
+        </w:tc>
+      </w:tr>
+      <w:tr>
+        <w:tc>
+          <w:tcPr/>
+          <w:p>
+            <w:pPr>
+              <w:pStyle w:val="Compact"/>
+            </w:pPr>
+            <w:r>
+              <w:t xml:space="preserve">noise burst</w:t>
+            </w:r>
+          </w:p>
+        </w:tc>
+        <w:tc>
+          <w:tcPr/>
+          <w:p>
+            <w:pPr>
+              <w:pStyle w:val="Compact"/>
+            </w:pPr>
+            <w:r>
+              <w:t xml:space="preserve">702</w:t>
+            </w:r>
+          </w:p>
+        </w:tc>
+        <w:tc>
+          <w:tcPr/>
+          <w:p>
+            <w:pPr>
+              <w:pStyle w:val="Compact"/>
+            </w:pPr>
+            <w:r>
+              <w:t xml:space="preserve">67.4% (63.8-70.7)</w:t>
+            </w:r>
+          </w:p>
+        </w:tc>
+        <w:tc>
+          <w:tcPr/>
+          <w:p>
+            <w:pPr>
+              <w:pStyle w:val="Compact"/>
+            </w:pPr>
+            <w:r>
+              <w:t xml:space="preserve">11.3% (9.1-13.8)</w:t>
+            </w:r>
+          </w:p>
+        </w:tc>
+      </w:tr>
+      <w:tr>
+        <w:tc>
+          <w:tcPr/>
+          <w:p>
+            <w:pPr>
+              <w:pStyle w:val="Compact"/>
+            </w:pPr>
+            <w:r>
+              <w:t xml:space="preserve">dropout</w:t>
+            </w:r>
+          </w:p>
+        </w:tc>
+        <w:tc>
+          <w:tcPr/>
+          <w:p>
+            <w:pPr>
+              <w:pStyle w:val="Compact"/>
+            </w:pPr>
+            <w:r>
+              <w:t xml:space="preserve">702</w:t>
+            </w:r>
+          </w:p>
+        </w:tc>
+        <w:tc>
+          <w:tcPr/>
+          <w:p>
+            <w:pPr>
+              <w:pStyle w:val="Compact"/>
+            </w:pPr>
+            <w:r>
+              <w:t xml:space="preserve">98.4% (97.2-99.1)</w:t>
+            </w:r>
+          </w:p>
+        </w:tc>
+        <w:tc>
+          <w:tcPr/>
+          <w:p>
+            <w:pPr>
+              <w:pStyle w:val="Compact"/>
+            </w:pPr>
+            <w:r>
+              <w:t xml:space="preserve">98.4% (97.2-99.1)</w:t>
+            </w:r>
+          </w:p>
+        </w:tc>
+      </w:tr>
+      <w:tr>
+        <w:tc>
+          <w:tcPr/>
+          <w:p>
+            <w:pPr>
+              <w:pStyle w:val="Compact"/>
+            </w:pPr>
+            <w:r>
+              <w:t xml:space="preserve">clock 3 h out</w:t>
+            </w:r>
+          </w:p>
+        </w:tc>
+        <w:tc>
+          <w:tcPr/>
+          <w:p>
+            <w:pPr>
+              <w:pStyle w:val="Compact"/>
+            </w:pPr>
+            <w:r>
+              <w:t xml:space="preserve">619</w:t>
+            </w:r>
+          </w:p>
+        </w:tc>
+        <w:tc>
+          <w:tcPr/>
+          <w:p>
+            <w:pPr>
+              <w:pStyle w:val="Compact"/>
+            </w:pPr>
+            <w:r>
+              <w:t xml:space="preserve">83.5% (80.4-86.2)</w:t>
+            </w:r>
+          </w:p>
+        </w:tc>
+        <w:tc>
+          <w:tcPr/>
+          <w:p>
+            <w:pPr>
+              <w:pStyle w:val="Compact"/>
+            </w:pPr>
+            <w:r>
+              <w:t xml:space="preserve">0.5% (0.2-1.4)</w:t>
+            </w:r>
+          </w:p>
+        </w:tc>
+      </w:tr>
+    </w:tbl>
+    <w:bookmarkEnd w:id="63"/>
+    <w:bookmarkStart w:id="64" w:name="Xcf9112c48ed5a47ffee17975b89c442556bc9e9"/>
     <w:p>
       <w:pPr>
         <w:pStyle w:val="Heading4"/>
@@ -20356,8 +21427,8 @@
         </w:tc>
       </w:tr>
     </w:tbl>
-    <w:bookmarkEnd w:id="61"/>
-    <w:bookmarkStart w:id="62" w:name="false-alarms-on-clean-real-data-2"/>
+    <w:bookmarkEnd w:id="64"/>
+    <w:bookmarkStart w:id="65" w:name="false-alarms-on-clean-real-data-2"/>
     <w:p>
       <w:pPr>
         <w:pStyle w:val="Heading4"/>
@@ -21190,8 +22261,8 @@
         </w:tc>
       </w:tr>
     </w:tbl>
-    <w:bookmarkEnd w:id="62"/>
-    <w:bookmarkStart w:id="63" w:name="real-extreme-weather-nothing-injected-2"/>
+    <w:bookmarkEnd w:id="65"/>
+    <w:bookmarkStart w:id="66" w:name="real-extreme-weather-nothing-injected-2"/>
     <w:p>
       <w:pPr>
         <w:pStyle w:val="Heading4"/>
@@ -22546,8 +23617,8 @@
         </w:tc>
       </w:tr>
     </w:tbl>
-    <w:bookmarkEnd w:id="63"/>
-    <w:bookmarkStart w:id="64" w:name="agreement-with-noaas-own-quality-flags-2"/>
+    <w:bookmarkEnd w:id="66"/>
+    <w:bookmarkStart w:id="67" w:name="agreement-with-noaas-own-quality-flags-2"/>
     <w:p>
       <w:pPr>
         <w:pStyle w:val="Heading4"/>
@@ -22794,8 +23865,8 @@
         </w:tc>
       </w:tr>
     </w:tbl>
-    <w:bookmarkEnd w:id="64"/>
-    <w:bookmarkStart w:id="65" w:name="Xc140d0fc5ba23963b1b62685c28e9c1dc559391"/>
+    <w:bookmarkEnd w:id="67"/>
+    <w:bookmarkStart w:id="68" w:name="Xc140d0fc5ba23963b1b62685c28e9c1dc559391"/>
     <w:p>
       <w:pPr>
         <w:pStyle w:val="Heading4"/>
@@ -23105,8 +24176,8 @@
         </w:tc>
       </w:tr>
     </w:tbl>
-    <w:bookmarkEnd w:id="65"/>
-    <w:bookmarkStart w:id="66" w:name="by-station-full-pipeline-2"/>
+    <w:bookmarkEnd w:id="68"/>
+    <w:bookmarkStart w:id="69" w:name="by-station-full-pipeline-2"/>
     <w:p>
       <w:pPr>
         <w:pStyle w:val="Heading4"/>
@@ -23954,8 +25025,8 @@
         </w:tc>
       </w:tr>
     </w:tbl>
-    <w:bookmarkEnd w:id="66"/>
-    <w:bookmarkStart w:id="67" w:name="X8a9c73a32b906b5121a43f5b4e2035d34b74745"/>
+    <w:bookmarkEnd w:id="69"/>
+    <w:bookmarkStart w:id="70" w:name="X8a9c73a32b906b5121a43f5b4e2035d34b74745"/>
     <w:p>
       <w:pPr>
         <w:pStyle w:val="Heading4"/>
@@ -25256,8 +26327,8 @@
         </w:tc>
       </w:tr>
     </w:tbl>
-    <w:bookmarkEnd w:id="67"/>
-    <w:bookmarkStart w:id="68" w:name="X2199c03e75102d2c2827df1255da01870ca81c9"/>
+    <w:bookmarkEnd w:id="70"/>
+    <w:bookmarkStart w:id="71" w:name="X2199c03e75102d2c2827df1255da01870ca81c9"/>
     <w:p>
       <w:pPr>
         <w:pStyle w:val="Heading4"/>
@@ -25613,9 +26684,9 @@
         </w:tc>
       </w:tr>
     </w:tbl>
-    <w:bookmarkEnd w:id="68"/>
-    <w:bookmarkEnd w:id="69"/>
-    <w:bookmarkStart w:id="81" w:name="X23786217689c3c04504c90a2bc97e775d6aa1eb"/>
+    <w:bookmarkEnd w:id="71"/>
+    <w:bookmarkEnd w:id="72"/>
+    <w:bookmarkStart w:id="85" w:name="X23786217689c3c04504c90a2bc97e775d6aa1eb"/>
     <w:p>
       <w:pPr>
         <w:pStyle w:val="Heading3"/>
@@ -25642,7 +26713,7 @@
         <w:t xml:space="preserve">Stations: LKO, PAT, IDR, IXR, CJB, IXE, TRZ, ATQ, PNQ, GOI, RPR, JDH.</w:t>
       </w:r>
     </w:p>
-    <w:bookmarkStart w:id="70" w:name="headline-3"/>
+    <w:bookmarkStart w:id="73" w:name="headline-3"/>
     <w:p>
       <w:pPr>
         <w:pStyle w:val="Heading4"/>
@@ -25818,8 +26889,8 @@
         </w:tc>
       </w:tr>
     </w:tbl>
-    <w:bookmarkEnd w:id="70"/>
-    <w:bookmarkStart w:id="71" w:name="Xf8210696564d383b7c87317f98625900aa68e32"/>
+    <w:bookmarkEnd w:id="73"/>
+    <w:bookmarkStart w:id="74" w:name="Xf8210696564d383b7c87317f98625900aa68e32"/>
     <w:p>
       <w:pPr>
         <w:pStyle w:val="Heading4"/>
@@ -27357,8 +28428,365 @@
         </w:tc>
       </w:tr>
     </w:tbl>
-    <w:bookmarkEnd w:id="71"/>
-    <w:bookmarkStart w:id="72" w:name="X0db5a328b35af171e875faa74265d1757132203"/>
+    <w:bookmarkEnd w:id="74"/>
+    <w:bookmarkStart w:id="75" w:name="Xf3f280c1a2051e520ee55bbe4935d82e0d9216a"/>
+    <w:p>
+      <w:pPr>
+        <w:pStyle w:val="Heading4"/>
+      </w:pPr>
+      <w:r>
+        <w:t xml:space="preserve">1d. How sure are the detection numbers? (AtmosGuard full, paired criterion, Wilson 95 % interval)</w:t>
+      </w:r>
+    </w:p>
+    <w:p>
+      <w:pPr>
+        <w:pStyle w:val="FirstParagraph"/>
+      </w:pPr>
+      <w:r>
+        <w:t xml:space="preserve">Faults are injected at random places; each row’s interval says how much the percentage could move with another draw of the same size. Faults of one type overlap little but are not fully independent, so read the interval as a guide, not a guarantee.</w:t>
+      </w:r>
+    </w:p>
+    <w:tbl>
+      <w:tblPr>
+        <w:tblStyle w:val="Table"/>
+        <w:tblW w:type="pct" w:w="5000"/>
+        <w:tblLayout w:type="fixed"/>
+        <w:tblLook w:firstRow="1" w:lastRow="0" w:firstColumn="0" w:lastColumn="0" w:noHBand="0" w:noVBand="0" w:val="0020"/>
+      </w:tblPr>
+      <w:tblGrid>
+        <w:gridCol w:w="1980"/>
+        <w:gridCol w:w="1980"/>
+        <w:gridCol w:w="1980"/>
+        <w:gridCol w:w="1980"/>
+      </w:tblGrid>
+      <w:tr>
+        <w:trPr>
+          <w:tblHeader w:val="on"/>
+        </w:trPr>
+        <w:tc>
+          <w:tcPr/>
+          <w:p>
+            <w:pPr>
+              <w:pStyle w:val="Compact"/>
+            </w:pPr>
+            <w:r>
+              <w:t xml:space="preserve">fault type</w:t>
+            </w:r>
+          </w:p>
+        </w:tc>
+        <w:tc>
+          <w:tcPr/>
+          <w:p>
+            <w:pPr>
+              <w:pStyle w:val="Compact"/>
+            </w:pPr>
+            <w:r>
+              <w:t xml:space="preserve">injected</w:t>
+            </w:r>
+          </w:p>
+        </w:tc>
+        <w:tc>
+          <w:tcPr/>
+          <w:p>
+            <w:pPr>
+              <w:pStyle w:val="Compact"/>
+            </w:pPr>
+            <w:r>
+              <w:t xml:space="preserve">raised the alarm (fault-raised)</w:t>
+            </w:r>
+          </w:p>
+        </w:tc>
+        <w:tc>
+          <w:tcPr/>
+          <w:p>
+            <w:pPr>
+              <w:pStyle w:val="Compact"/>
+            </w:pPr>
+            <w:r>
+              <w:t xml:space="preserve">named FAULT</w:t>
+            </w:r>
+          </w:p>
+        </w:tc>
+      </w:tr>
+      <w:tr>
+        <w:tc>
+          <w:tcPr/>
+          <w:p>
+            <w:pPr>
+              <w:pStyle w:val="Compact"/>
+            </w:pPr>
+            <w:r>
+              <w:t xml:space="preserve">frozen</w:t>
+            </w:r>
+          </w:p>
+        </w:tc>
+        <w:tc>
+          <w:tcPr/>
+          <w:p>
+            <w:pPr>
+              <w:pStyle w:val="Compact"/>
+            </w:pPr>
+            <w:r>
+              <w:t xml:space="preserve">918</w:t>
+            </w:r>
+          </w:p>
+        </w:tc>
+        <w:tc>
+          <w:tcPr/>
+          <w:p>
+            <w:pPr>
+              <w:pStyle w:val="Compact"/>
+            </w:pPr>
+            <w:r>
+              <w:t xml:space="preserve">99.1% (98.3-99.6)</w:t>
+            </w:r>
+          </w:p>
+        </w:tc>
+        <w:tc>
+          <w:tcPr/>
+          <w:p>
+            <w:pPr>
+              <w:pStyle w:val="Compact"/>
+            </w:pPr>
+            <w:r>
+              <w:t xml:space="preserve">89.4% (87.3-91.3)</w:t>
+            </w:r>
+          </w:p>
+        </w:tc>
+      </w:tr>
+      <w:tr>
+        <w:tc>
+          <w:tcPr/>
+          <w:p>
+            <w:pPr>
+              <w:pStyle w:val="Compact"/>
+            </w:pPr>
+            <w:r>
+              <w:t xml:space="preserve">spike</w:t>
+            </w:r>
+          </w:p>
+        </w:tc>
+        <w:tc>
+          <w:tcPr/>
+          <w:p>
+            <w:pPr>
+              <w:pStyle w:val="Compact"/>
+            </w:pPr>
+            <w:r>
+              <w:t xml:space="preserve">918</w:t>
+            </w:r>
+          </w:p>
+        </w:tc>
+        <w:tc>
+          <w:tcPr/>
+          <w:p>
+            <w:pPr>
+              <w:pStyle w:val="Compact"/>
+            </w:pPr>
+            <w:r>
+              <w:t xml:space="preserve">91.1% (89.0-92.7)</w:t>
+            </w:r>
+          </w:p>
+        </w:tc>
+        <w:tc>
+          <w:tcPr/>
+          <w:p>
+            <w:pPr>
+              <w:pStyle w:val="Compact"/>
+            </w:pPr>
+            <w:r>
+              <w:t xml:space="preserve">18.1% (15.7-20.7)</w:t>
+            </w:r>
+          </w:p>
+        </w:tc>
+      </w:tr>
+      <w:tr>
+        <w:tc>
+          <w:tcPr/>
+          <w:p>
+            <w:pPr>
+              <w:pStyle w:val="Compact"/>
+            </w:pPr>
+            <w:r>
+              <w:t xml:space="preserve">level shift</w:t>
+            </w:r>
+          </w:p>
+        </w:tc>
+        <w:tc>
+          <w:tcPr/>
+          <w:p>
+            <w:pPr>
+              <w:pStyle w:val="Compact"/>
+            </w:pPr>
+            <w:r>
+              <w:t xml:space="preserve">918</w:t>
+            </w:r>
+          </w:p>
+        </w:tc>
+        <w:tc>
+          <w:tcPr/>
+          <w:p>
+            <w:pPr>
+              <w:pStyle w:val="Compact"/>
+            </w:pPr>
+            <w:r>
+              <w:t xml:space="preserve">80.3% (77.6-82.7)</w:t>
+            </w:r>
+          </w:p>
+        </w:tc>
+        <w:tc>
+          <w:tcPr/>
+          <w:p>
+            <w:pPr>
+              <w:pStyle w:val="Compact"/>
+            </w:pPr>
+            <w:r>
+              <w:t xml:space="preserve">14.3% (12.2-16.7)</w:t>
+            </w:r>
+          </w:p>
+        </w:tc>
+      </w:tr>
+      <w:tr>
+        <w:tc>
+          <w:tcPr/>
+          <w:p>
+            <w:pPr>
+              <w:pStyle w:val="Compact"/>
+            </w:pPr>
+            <w:r>
+              <w:t xml:space="preserve">noise burst</w:t>
+            </w:r>
+          </w:p>
+        </w:tc>
+        <w:tc>
+          <w:tcPr/>
+          <w:p>
+            <w:pPr>
+              <w:pStyle w:val="Compact"/>
+            </w:pPr>
+            <w:r>
+              <w:t xml:space="preserve">918</w:t>
+            </w:r>
+          </w:p>
+        </w:tc>
+        <w:tc>
+          <w:tcPr/>
+          <w:p>
+            <w:pPr>
+              <w:pStyle w:val="Compact"/>
+            </w:pPr>
+            <w:r>
+              <w:t xml:space="preserve">57.3% (54.1-60.5)</w:t>
+            </w:r>
+          </w:p>
+        </w:tc>
+        <w:tc>
+          <w:tcPr/>
+          <w:p>
+            <w:pPr>
+              <w:pStyle w:val="Compact"/>
+            </w:pPr>
+            <w:r>
+              <w:t xml:space="preserve">9.6% (7.8-11.7)</w:t>
+            </w:r>
+          </w:p>
+        </w:tc>
+      </w:tr>
+      <w:tr>
+        <w:tc>
+          <w:tcPr/>
+          <w:p>
+            <w:pPr>
+              <w:pStyle w:val="Compact"/>
+            </w:pPr>
+            <w:r>
+              <w:t xml:space="preserve">dropout</w:t>
+            </w:r>
+          </w:p>
+        </w:tc>
+        <w:tc>
+          <w:tcPr/>
+          <w:p>
+            <w:pPr>
+              <w:pStyle w:val="Compact"/>
+            </w:pPr>
+            <w:r>
+              <w:t xml:space="preserve">918</w:t>
+            </w:r>
+          </w:p>
+        </w:tc>
+        <w:tc>
+          <w:tcPr/>
+          <w:p>
+            <w:pPr>
+              <w:pStyle w:val="Compact"/>
+            </w:pPr>
+            <w:r>
+              <w:t xml:space="preserve">98.4% (97.3-99.0)</w:t>
+            </w:r>
+          </w:p>
+        </w:tc>
+        <w:tc>
+          <w:tcPr/>
+          <w:p>
+            <w:pPr>
+              <w:pStyle w:val="Compact"/>
+            </w:pPr>
+            <w:r>
+              <w:t xml:space="preserve">98.4% (97.3-99.0)</w:t>
+            </w:r>
+          </w:p>
+        </w:tc>
+      </w:tr>
+      <w:tr>
+        <w:tc>
+          <w:tcPr/>
+          <w:p>
+            <w:pPr>
+              <w:pStyle w:val="Compact"/>
+            </w:pPr>
+            <w:r>
+              <w:t xml:space="preserve">clock 3 h out</w:t>
+            </w:r>
+          </w:p>
+        </w:tc>
+        <w:tc>
+          <w:tcPr/>
+          <w:p>
+            <w:pPr>
+              <w:pStyle w:val="Compact"/>
+            </w:pPr>
+            <w:r>
+              <w:t xml:space="preserve">794</w:t>
+            </w:r>
+          </w:p>
+        </w:tc>
+        <w:tc>
+          <w:tcPr/>
+          <w:p>
+            <w:pPr>
+              <w:pStyle w:val="Compact"/>
+            </w:pPr>
+            <w:r>
+              <w:t xml:space="preserve">85.1% (82.5-87.4)</w:t>
+            </w:r>
+          </w:p>
+        </w:tc>
+        <w:tc>
+          <w:tcPr/>
+          <w:p>
+            <w:pPr>
+              <w:pStyle w:val="Compact"/>
+            </w:pPr>
+            <w:r>
+              <w:t xml:space="preserve">1.5% (0.9-2.6)</w:t>
+            </w:r>
+          </w:p>
+        </w:tc>
+      </w:tr>
+    </w:tbl>
+    <w:bookmarkEnd w:id="75"/>
+    <w:bookmarkStart w:id="76" w:name="X0db5a328b35af171e875faa74265d1757132203"/>
     <w:p>
       <w:pPr>
         <w:pStyle w:val="Heading4"/>
@@ -27711,8 +29139,8 @@
         </w:tc>
       </w:tr>
     </w:tbl>
-    <w:bookmarkEnd w:id="72"/>
-    <w:bookmarkStart w:id="73" w:name="X5b62a31e8638b95864bf6330e3069935f181e9b"/>
+    <w:bookmarkEnd w:id="76"/>
+    <w:bookmarkStart w:id="77" w:name="X5b62a31e8638b95864bf6330e3069935f181e9b"/>
     <w:p>
       <w:pPr>
         <w:pStyle w:val="Heading4"/>
@@ -28170,8 +29598,8 @@
         </w:tc>
       </w:tr>
     </w:tbl>
-    <w:bookmarkEnd w:id="73"/>
-    <w:bookmarkStart w:id="74" w:name="false-alarms-on-clean-real-data-3"/>
+    <w:bookmarkEnd w:id="77"/>
+    <w:bookmarkStart w:id="78" w:name="false-alarms-on-clean-real-data-3"/>
     <w:p>
       <w:pPr>
         <w:pStyle w:val="Heading4"/>
@@ -29175,8 +30603,8 @@
         </w:tc>
       </w:tr>
     </w:tbl>
-    <w:bookmarkEnd w:id="74"/>
-    <w:bookmarkStart w:id="75" w:name="real-extreme-weather-nothing-injected-3"/>
+    <w:bookmarkEnd w:id="78"/>
+    <w:bookmarkStart w:id="79" w:name="real-extreme-weather-nothing-injected-3"/>
     <w:p>
       <w:pPr>
         <w:pStyle w:val="Heading4"/>
@@ -30735,8 +32163,8 @@
         </w:tc>
       </w:tr>
     </w:tbl>
-    <w:bookmarkEnd w:id="75"/>
-    <w:bookmarkStart w:id="76" w:name="agreement-with-noaas-own-quality-flags-3"/>
+    <w:bookmarkEnd w:id="79"/>
+    <w:bookmarkStart w:id="80" w:name="agreement-with-noaas-own-quality-flags-3"/>
     <w:p>
       <w:pPr>
         <w:pStyle w:val="Heading4"/>
@@ -30983,8 +32411,8 @@
         </w:tc>
       </w:tr>
     </w:tbl>
-    <w:bookmarkEnd w:id="76"/>
-    <w:bookmarkStart w:id="77" w:name="X7b012ae44e0f78d828116ee038442886c4436f5"/>
+    <w:bookmarkEnd w:id="80"/>
+    <w:bookmarkStart w:id="81" w:name="X7b012ae44e0f78d828116ee038442886c4436f5"/>
     <w:p>
       <w:pPr>
         <w:pStyle w:val="Heading4"/>
@@ -31294,8 +32722,8 @@
         </w:tc>
       </w:tr>
     </w:tbl>
-    <w:bookmarkEnd w:id="77"/>
-    <w:bookmarkStart w:id="78" w:name="by-station-full-pipeline-3"/>
+    <w:bookmarkEnd w:id="81"/>
+    <w:bookmarkStart w:id="82" w:name="by-station-full-pipeline-3"/>
     <w:p>
       <w:pPr>
         <w:pStyle w:val="Heading4"/>
@@ -32503,8 +33931,8 @@
         </w:tc>
       </w:tr>
     </w:tbl>
-    <w:bookmarkEnd w:id="78"/>
-    <w:bookmarkStart w:id="79" w:name="X5097ea49b048c0b711f8c9de1b26b1f26918990"/>
+    <w:bookmarkEnd w:id="82"/>
+    <w:bookmarkStart w:id="83" w:name="X5097ea49b048c0b711f8c9de1b26b1f26918990"/>
     <w:p>
       <w:pPr>
         <w:pStyle w:val="Heading4"/>
@@ -34042,8 +35470,8 @@
         </w:tc>
       </w:tr>
     </w:tbl>
-    <w:bookmarkEnd w:id="79"/>
-    <w:bookmarkStart w:id="80" w:name="Xbdd52fe2d046f63e5a9d103a14e86c41ce32ada"/>
+    <w:bookmarkEnd w:id="83"/>
+    <w:bookmarkStart w:id="84" w:name="Xbdd52fe2d046f63e5a9d103a14e86c41ce32ada"/>
     <w:p>
       <w:pPr>
         <w:pStyle w:val="Heading4"/>
@@ -34537,9 +35965,9 @@
         </w:tc>
       </w:tr>
     </w:tbl>
-    <w:bookmarkEnd w:id="80"/>
-    <w:bookmarkEnd w:id="81"/>
-    <w:bookmarkStart w:id="82" w:name="scale-and-speed"/>
+    <w:bookmarkEnd w:id="84"/>
+    <w:bookmarkEnd w:id="85"/>
+    <w:bookmarkStart w:id="86" w:name="scale-and-speed"/>
     <w:p>
       <w:pPr>
         <w:pStyle w:val="Heading3"/>
@@ -35184,8 +36612,8 @@
         <w:t xml:space="preserve">Real HTTP server (FastAPI + SQLite), 50 stations, 8 concurrent clients: 164.8 requests/s, median 44.89 ms, p95 59.17 ms, p99 66.33 ms, errors 0.</w:t>
       </w:r>
     </w:p>
-    <w:bookmarkEnd w:id="82"/>
-    <w:bookmarkStart w:id="83" w:name="a-new-station-on-day-one-cold-start"/>
+    <w:bookmarkEnd w:id="86"/>
+    <w:bookmarkStart w:id="87" w:name="a-new-station-on-day-one-cold-start"/>
     <w:p>
       <w:pPr>
         <w:pStyle w:val="Heading3"/>
@@ -35728,9 +37156,9 @@
         <w:t xml:space="preserve">projects the running time first).</w:t>
       </w:r>
     </w:p>
-    <w:bookmarkEnd w:id="83"/>
-    <w:bookmarkEnd w:id="84"/>
-    <w:bookmarkStart w:id="89" w:name="X2044a3e36d2d5b2a8916663a95641182c65a810"/>
+    <w:bookmarkEnd w:id="87"/>
+    <w:bookmarkEnd w:id="88"/>
+    <w:bookmarkStart w:id="93" w:name="X2044a3e36d2d5b2a8916663a95641182c65a810"/>
     <w:p>
       <w:pPr>
         <w:pStyle w:val="Heading2"/>
@@ -35850,7 +37278,7 @@
         <w:t xml:space="preserve">verdicts already reported.)</w:t>
       </w:r>
     </w:p>
-    <w:bookmarkStart w:id="85" w:name="the-three-windows"/>
+    <w:bookmarkStart w:id="89" w:name="the-three-windows"/>
     <w:p>
       <w:pPr>
         <w:pStyle w:val="Heading3"/>
@@ -36141,8 +37569,8 @@
         </w:tc>
       </w:tr>
     </w:tbl>
-    <w:bookmarkEnd w:id="85"/>
-    <w:bookmarkStart w:id="86" w:name="Xe40d6a0b54f3756887c834b5aaba6f2374833dc"/>
+    <w:bookmarkEnd w:id="89"/>
+    <w:bookmarkStart w:id="90" w:name="Xe40d6a0b54f3756887c834b5aaba6f2374833dc"/>
     <w:p>
       <w:pPr>
         <w:pStyle w:val="Heading3"/>
@@ -36267,8 +37695,8 @@
         <w:t xml:space="preserve">evaluated honestly. Re-running them on this holdout would turn it into a tuning set, so they are listed as next work.</w:t>
       </w:r>
     </w:p>
-    <w:bookmarkEnd w:id="86"/>
-    <w:bookmarkStart w:id="87" w:name="what-it-says-about-the-claim"/>
+    <w:bookmarkEnd w:id="90"/>
+    <w:bookmarkStart w:id="91" w:name="what-it-says-about-the-claim"/>
     <w:p>
       <w:pPr>
         <w:pStyle w:val="Heading3"/>
@@ -36324,8 +37752,8 @@
         <w:t xml:space="preserve">. The textbook rules baseline gets 95 of those 98 windows wrong.</w:t>
       </w:r>
     </w:p>
-    <w:bookmarkEnd w:id="87"/>
-    <w:bookmarkStart w:id="88" w:name="X668bf211504a1007173a5e749946da4f1cbd0fa"/>
+    <w:bookmarkEnd w:id="91"/>
+    <w:bookmarkStart w:id="92" w:name="X668bf211504a1007173a5e749946da4f1cbd0fa"/>
     <w:p>
       <w:pPr>
         <w:pStyle w:val="Heading3"/>
@@ -36541,9 +37969,9 @@
         <w:t xml:space="preserve">channels or the health score drops. We take that trade because sustained saturation is real weather more often than a stuck sensor is, and we say so.</w:t>
       </w:r>
     </w:p>
-    <w:bookmarkEnd w:id="88"/>
-    <w:bookmarkEnd w:id="89"/>
-    <w:bookmarkStart w:id="95" w:name="X0c6babe05ada4703930d11639828e5b6cecbbdf"/>
+    <w:bookmarkEnd w:id="92"/>
+    <w:bookmarkEnd w:id="93"/>
+    <w:bookmarkStart w:id="99" w:name="X0c6babe05ada4703930d11639828e5b6cecbbdf"/>
     <w:p>
       <w:pPr>
         <w:pStyle w:val="Heading2"/>
@@ -36552,7 +37980,7 @@
         <w:t xml:space="preserve">6. Limitations: what we do not claim and cannot see</w:t>
       </w:r>
     </w:p>
-    <w:bookmarkStart w:id="90" w:name="about-the-data"/>
+    <w:bookmarkStart w:id="94" w:name="about-the-data"/>
     <w:p>
       <w:pPr>
         <w:pStyle w:val="Heading3"/>
@@ -36723,8 +38151,8 @@
         <w:t xml:space="preserve">proof that we are right or that they are.</w:t>
       </w:r>
     </w:p>
-    <w:bookmarkEnd w:id="90"/>
-    <w:bookmarkStart w:id="91" w:name="about-the-results"/>
+    <w:bookmarkEnd w:id="94"/>
+    <w:bookmarkStart w:id="95" w:name="about-the-results"/>
     <w:p>
       <w:pPr>
         <w:pStyle w:val="Heading3"/>
@@ -36922,8 +38350,8 @@
         <w:t xml:space="preserve">records when, and the protocol was committed before.</w:t>
       </w:r>
     </w:p>
-    <w:bookmarkEnd w:id="91"/>
-    <w:bookmarkStart w:id="92" w:name="about-novelty"/>
+    <w:bookmarkEnd w:id="95"/>
+    <w:bookmarkStart w:id="96" w:name="about-novelty"/>
     <w:p>
       <w:pPr>
         <w:pStyle w:val="Heading3"/>
@@ -37069,8 +38497,8 @@
         <w:t xml:space="preserve">The wet-bulb check is a soft flag only.</w:t>
       </w:r>
     </w:p>
-    <w:bookmarkEnd w:id="92"/>
-    <w:bookmarkStart w:id="93" w:name="about-the-hardware-and-deployment"/>
+    <w:bookmarkEnd w:id="96"/>
+    <w:bookmarkStart w:id="97" w:name="about-the-hardware-and-deployment"/>
     <w:p>
       <w:pPr>
         <w:pStyle w:val="Heading3"/>
@@ -37228,8 +38656,8 @@
         <w:t xml:space="preserve">review and a long field trial.</w:t>
       </w:r>
     </w:p>
-    <w:bookmarkEnd w:id="93"/>
-    <w:bookmarkStart w:id="94" w:name="what-the-system-cannot-see"/>
+    <w:bookmarkEnd w:id="97"/>
+    <w:bookmarkStart w:id="98" w:name="what-the-system-cannot-see"/>
     <w:p>
       <w:pPr>
         <w:pStyle w:val="Heading3"/>
@@ -37557,9 +38985,9 @@
         <w:t xml:space="preserve">neighbour stations, a forecast model, a calibration record. By design we use none.</w:t>
       </w:r>
     </w:p>
-    <w:bookmarkEnd w:id="94"/>
-    <w:bookmarkEnd w:id="95"/>
-    <w:bookmarkStart w:id="101" w:name="related-work-and-what-is-ours"/>
+    <w:bookmarkEnd w:id="98"/>
+    <w:bookmarkEnd w:id="99"/>
+    <w:bookmarkStart w:id="105" w:name="related-work-and-what-is-ours"/>
     <w:p>
       <w:pPr>
         <w:pStyle w:val="Heading2"/>
@@ -37568,7 +38996,7 @@
         <w:t xml:space="preserve">7. Related work and what is ours</w:t>
       </w:r>
     </w:p>
-    <w:bookmarkStart w:id="96" w:name="what-is-standard"/>
+    <w:bookmarkStart w:id="100" w:name="what-is-standard"/>
     <w:p>
       <w:pPr>
         <w:pStyle w:val="Heading3"/>
@@ -37917,8 +39345,8 @@
         </w:tc>
       </w:tr>
     </w:tbl>
-    <w:bookmarkEnd w:id="96"/>
-    <w:bookmarkStart w:id="97" w:name="what-we-adapted"/>
+    <w:bookmarkEnd w:id="100"/>
+    <w:bookmarkStart w:id="101" w:name="what-we-adapted"/>
     <w:p>
       <w:pPr>
         <w:pStyle w:val="Heading3"/>
@@ -38287,8 +39715,8 @@
         </w:tc>
       </w:tr>
     </w:tbl>
-    <w:bookmarkEnd w:id="97"/>
-    <w:bookmarkStart w:id="98" w:name="what-is-ours"/>
+    <w:bookmarkEnd w:id="101"/>
+    <w:bookmarkStart w:id="102" w:name="what-is-ours"/>
     <w:p>
       <w:pPr>
         <w:pStyle w:val="Heading3"/>
@@ -38711,8 +40139,8 @@
         <w:t xml:space="preserve">That is a measured boundary, not a claim of a working detector.</w:t>
       </w:r>
     </w:p>
-    <w:bookmarkEnd w:id="98"/>
-    <w:bookmarkStart w:id="99" w:name="the-field-on-this-problem-statement"/>
+    <w:bookmarkEnd w:id="102"/>
+    <w:bookmarkStart w:id="103" w:name="the-field-on-this-problem-statement"/>
     <w:p>
       <w:pPr>
         <w:pStyle w:val="Heading3"/>
@@ -39677,8 +41105,8 @@
         <w:t xml:space="preserve">data, an agreement check against operational QC flags, or a stated list of what it cannot do.</w:t>
       </w:r>
     </w:p>
-    <w:bookmarkEnd w:id="99"/>
-    <w:bookmarkStart w:id="100" w:name="X76134177c3d160d01bb5613acfea090322b7d6d"/>
+    <w:bookmarkEnd w:id="103"/>
+    <w:bookmarkStart w:id="104" w:name="X76134177c3d160d01bb5613acfea090322b7d6d"/>
     <w:p>
       <w:pPr>
         <w:pStyle w:val="Heading3"/>
@@ -39938,9 +41366,9 @@
         </w:tc>
       </w:tr>
     </w:tbl>
-    <w:bookmarkEnd w:id="100"/>
-    <w:bookmarkEnd w:id="101"/>
-    <w:bookmarkStart w:id="105" w:name="reproducing-this-report"/>
+    <w:bookmarkEnd w:id="104"/>
+    <w:bookmarkEnd w:id="105"/>
+    <w:bookmarkStart w:id="109" w:name="reproducing-this-report"/>
     <w:p>
       <w:pPr>
         <w:pStyle w:val="Heading2"/>
@@ -39969,7 +41397,7 @@
         <w:t xml:space="preserve">.</w:t>
       </w:r>
     </w:p>
-    <w:bookmarkStart w:id="102" w:name="does-it-work"/>
+    <w:bookmarkStart w:id="106" w:name="does-it-work"/>
     <w:p>
       <w:pPr>
         <w:pStyle w:val="Heading3"/>
@@ -40022,11 +41450,11 @@
         <w:rPr>
           <w:rStyle w:val="CommentTok"/>
         </w:rPr>
-        <w:t xml:space="preserve"># 340+ tests, including the C++ edge-parity tests (needs g++)</w:t>
+        <w:t xml:space="preserve"># 400+ tests, including the C++ edge-parity tests (needs g++)</w:t>
       </w:r>
     </w:p>
-    <w:bookmarkEnd w:id="102"/>
-    <w:bookmarkStart w:id="103" w:name="the-evidence"/>
+    <w:bookmarkEnd w:id="106"/>
+    <w:bookmarkStart w:id="107" w:name="the-evidence"/>
     <w:p>
       <w:pPr>
         <w:pStyle w:val="Heading3"/>
@@ -40951,8 +42379,8 @@
         <w:t xml:space="preserve">are for tuning loops only.</w:t>
       </w:r>
     </w:p>
-    <w:bookmarkEnd w:id="103"/>
-    <w:bookmarkStart w:id="104" w:name="determinism"/>
+    <w:bookmarkEnd w:id="107"/>
+    <w:bookmarkStart w:id="108" w:name="determinism"/>
     <w:p>
       <w:pPr>
         <w:pStyle w:val="Heading3"/>
@@ -40990,9 +42418,9 @@
         <w:t xml:space="preserve">the Isolation Forest scores.</w:t>
       </w:r>
     </w:p>
-    <w:bookmarkEnd w:id="104"/>
-    <w:bookmarkEnd w:id="105"/>
-    <w:bookmarkStart w:id="106" w:name="references"/>
+    <w:bookmarkEnd w:id="108"/>
+    <w:bookmarkEnd w:id="109"/>
+    <w:bookmarkStart w:id="110" w:name="references"/>
     <w:p>
       <w:pPr>
         <w:pStyle w:val="Heading2"/>
@@ -41466,8 +42894,8 @@
         <w:t xml:space="preserve">.</w:t>
       </w:r>
     </w:p>
-    <w:bookmarkEnd w:id="106"/>
-    <w:bookmarkEnd w:id="107"/>
+    <w:bookmarkEnd w:id="110"/>
+    <w:bookmarkEnd w:id="111"/>
     <w:sectPr>
       <w:footnotePr>
         <w:numRestart w:val="eachSect"/>

</xml_diff>

<commit_message>
How big must a fault be? Detection against fault size (spike, level shift, noise burst) for AtmosGuard and two simpler systems, DEV; wired into summary, figure, report, docs
Co-Authored-By: Claude Sonnet 5.5 <noreply@anthropic.com>
Claude-Session: https://claude.ai/code/session_01QKWDsgne5K3ip7mAjGigPb
</commit_message>
<xml_diff>
--- a/docs/TECHNICAL_REPORT.docx
+++ b/docs/TECHNICAL_REPORT.docx
@@ -28,7 +28,7 @@
         </w:p>
       </w:sdtContent>
     </w:sdt>
-    <w:bookmarkStart w:id="111" w:name="X57b8e1d458ff9a143105c6b655c97d724b6cafb"/>
+    <w:bookmarkStart w:id="112" w:name="X57b8e1d458ff9a143105c6b655c97d724b6cafb"/>
     <w:p>
       <w:pPr>
         <w:pStyle w:val="Heading1"/>
@@ -4549,7 +4549,7 @@
     </w:p>
     <w:bookmarkEnd w:id="35"/>
     <w:bookmarkEnd w:id="36"/>
-    <w:bookmarkStart w:id="88" w:name="results"/>
+    <w:bookmarkStart w:id="89" w:name="results"/>
     <w:p>
       <w:pPr>
         <w:pStyle w:val="Heading2"/>
@@ -36613,13 +36613,961 @@
       </w:r>
     </w:p>
     <w:bookmarkEnd w:id="86"/>
-    <w:bookmarkStart w:id="87" w:name="a-new-station-on-day-one-cold-start"/>
+    <w:bookmarkStart w:id="87" w:name="how-big-must-a-fault-be-dev-injected"/>
     <w:p>
       <w:pPr>
         <w:pStyle w:val="Heading3"/>
       </w:pPr>
       <w:r>
-        <w:t xml:space="preserve">4.6 A new station on day one (cold start)</w:t>
+        <w:t xml:space="preserve">4.6 How big must a fault be? (DEV, injected)</w:t>
+      </w:r>
+    </w:p>
+    <w:p>
+      <w:pPr>
+        <w:pStyle w:val="FirstParagraph"/>
+      </w:pPr>
+      <w:r>
+        <w:t xml:space="preserve">How big must a fault be? Spikes, level shifts and noise bursts of 0.25 to 4 times the configured size, injected into clean real data of the six DEV stations (the tuning set, so an envelope study and not a held-out result). A detection is an alarm the fault itself raised. The 1x row is a separate random draw (two faults of each type per series, one round), so it is close to but not identical with the main table.</w:t>
+      </w:r>
+    </w:p>
+    <w:tbl>
+      <w:tblPr>
+        <w:tblStyle w:val="Table"/>
+        <w:tblW w:type="pct" w:w="5000"/>
+        <w:tblLayout w:type="fixed"/>
+        <w:tblLook w:firstRow="1" w:lastRow="0" w:firstColumn="0" w:lastColumn="0" w:noHBand="0" w:noVBand="0" w:val="0020"/>
+      </w:tblPr>
+      <w:tblGrid>
+        <w:gridCol w:w="1584"/>
+        <w:gridCol w:w="1584"/>
+        <w:gridCol w:w="1584"/>
+        <w:gridCol w:w="1584"/>
+        <w:gridCol w:w="1584"/>
+      </w:tblGrid>
+      <w:tr>
+        <w:trPr>
+          <w:tblHeader w:val="on"/>
+        </w:trPr>
+        <w:tc>
+          <w:tcPr/>
+          <w:p>
+            <w:pPr>
+              <w:pStyle w:val="Compact"/>
+            </w:pPr>
+            <w:r>
+              <w:t xml:space="preserve">system</w:t>
+            </w:r>
+          </w:p>
+        </w:tc>
+        <w:tc>
+          <w:tcPr/>
+          <w:p>
+            <w:pPr>
+              <w:pStyle w:val="Compact"/>
+            </w:pPr>
+            <w:r>
+              <w:t xml:space="preserve">size (x the configured fault)</w:t>
+            </w:r>
+          </w:p>
+        </w:tc>
+        <w:tc>
+          <w:tcPr/>
+          <w:p>
+            <w:pPr>
+              <w:pStyle w:val="Compact"/>
+            </w:pPr>
+            <w:r>
+              <w:t xml:space="preserve">spike</w:t>
+            </w:r>
+          </w:p>
+        </w:tc>
+        <w:tc>
+          <w:tcPr/>
+          <w:p>
+            <w:pPr>
+              <w:pStyle w:val="Compact"/>
+            </w:pPr>
+            <w:r>
+              <w:t xml:space="preserve">level shift</w:t>
+            </w:r>
+          </w:p>
+        </w:tc>
+        <w:tc>
+          <w:tcPr/>
+          <w:p>
+            <w:pPr>
+              <w:pStyle w:val="Compact"/>
+            </w:pPr>
+            <w:r>
+              <w:t xml:space="preserve">noise burst</w:t>
+            </w:r>
+          </w:p>
+        </w:tc>
+      </w:tr>
+      <w:tr>
+        <w:tc>
+          <w:tcPr/>
+          <w:p>
+            <w:pPr>
+              <w:pStyle w:val="Compact"/>
+            </w:pPr>
+            <w:r>
+              <w:t xml:space="preserve">AtmosGuard</w:t>
+            </w:r>
+          </w:p>
+        </w:tc>
+        <w:tc>
+          <w:tcPr/>
+          <w:p>
+            <w:pPr>
+              <w:pStyle w:val="Compact"/>
+            </w:pPr>
+            <w:r>
+              <w:t xml:space="preserve">0.25x</w:t>
+            </w:r>
+          </w:p>
+        </w:tc>
+        <w:tc>
+          <w:tcPr/>
+          <w:p>
+            <w:pPr>
+              <w:pStyle w:val="Compact"/>
+            </w:pPr>
+            <w:r>
+              <w:t xml:space="preserve">13%</w:t>
+            </w:r>
+          </w:p>
+        </w:tc>
+        <w:tc>
+          <w:tcPr/>
+          <w:p>
+            <w:pPr>
+              <w:pStyle w:val="Compact"/>
+            </w:pPr>
+            <w:r>
+              <w:t xml:space="preserve">2%</w:t>
+            </w:r>
+          </w:p>
+        </w:tc>
+        <w:tc>
+          <w:tcPr/>
+          <w:p>
+            <w:pPr>
+              <w:pStyle w:val="Compact"/>
+            </w:pPr>
+            <w:r>
+              <w:t xml:space="preserve">11%</w:t>
+            </w:r>
+          </w:p>
+        </w:tc>
+      </w:tr>
+      <w:tr>
+        <w:tc>
+          <w:tcPr/>
+          <w:p>
+            <w:pPr>
+              <w:pStyle w:val="Compact"/>
+            </w:pPr>
+            <w:r>
+              <w:t xml:space="preserve">AtmosGuard</w:t>
+            </w:r>
+          </w:p>
+        </w:tc>
+        <w:tc>
+          <w:tcPr/>
+          <w:p>
+            <w:pPr>
+              <w:pStyle w:val="Compact"/>
+            </w:pPr>
+            <w:r>
+              <w:t xml:space="preserve">0.5x</w:t>
+            </w:r>
+          </w:p>
+        </w:tc>
+        <w:tc>
+          <w:tcPr/>
+          <w:p>
+            <w:pPr>
+              <w:pStyle w:val="Compact"/>
+            </w:pPr>
+            <w:r>
+              <w:t xml:space="preserve">70%</w:t>
+            </w:r>
+          </w:p>
+        </w:tc>
+        <w:tc>
+          <w:tcPr/>
+          <w:p>
+            <w:pPr>
+              <w:pStyle w:val="Compact"/>
+            </w:pPr>
+            <w:r>
+              <w:t xml:space="preserve">26%</w:t>
+            </w:r>
+          </w:p>
+        </w:tc>
+        <w:tc>
+          <w:tcPr/>
+          <w:p>
+            <w:pPr>
+              <w:pStyle w:val="Compact"/>
+            </w:pPr>
+            <w:r>
+              <w:t xml:space="preserve">28%</w:t>
+            </w:r>
+          </w:p>
+        </w:tc>
+      </w:tr>
+      <w:tr>
+        <w:tc>
+          <w:tcPr/>
+          <w:p>
+            <w:pPr>
+              <w:pStyle w:val="Compact"/>
+            </w:pPr>
+            <w:r>
+              <w:t xml:space="preserve">AtmosGuard</w:t>
+            </w:r>
+          </w:p>
+        </w:tc>
+        <w:tc>
+          <w:tcPr/>
+          <w:p>
+            <w:pPr>
+              <w:pStyle w:val="Compact"/>
+            </w:pPr>
+            <w:r>
+              <w:t xml:space="preserve">1x</w:t>
+            </w:r>
+          </w:p>
+        </w:tc>
+        <w:tc>
+          <w:tcPr/>
+          <w:p>
+            <w:pPr>
+              <w:pStyle w:val="Compact"/>
+            </w:pPr>
+            <w:r>
+              <w:t xml:space="preserve">94%</w:t>
+            </w:r>
+          </w:p>
+        </w:tc>
+        <w:tc>
+          <w:tcPr/>
+          <w:p>
+            <w:pPr>
+              <w:pStyle w:val="Compact"/>
+            </w:pPr>
+            <w:r>
+              <w:t xml:space="preserve">94%</w:t>
+            </w:r>
+          </w:p>
+        </w:tc>
+        <w:tc>
+          <w:tcPr/>
+          <w:p>
+            <w:pPr>
+              <w:pStyle w:val="Compact"/>
+            </w:pPr>
+            <w:r>
+              <w:t xml:space="preserve">87%</w:t>
+            </w:r>
+          </w:p>
+        </w:tc>
+      </w:tr>
+      <w:tr>
+        <w:tc>
+          <w:tcPr/>
+          <w:p>
+            <w:pPr>
+              <w:pStyle w:val="Compact"/>
+            </w:pPr>
+            <w:r>
+              <w:t xml:space="preserve">AtmosGuard</w:t>
+            </w:r>
+          </w:p>
+        </w:tc>
+        <w:tc>
+          <w:tcPr/>
+          <w:p>
+            <w:pPr>
+              <w:pStyle w:val="Compact"/>
+            </w:pPr>
+            <w:r>
+              <w:t xml:space="preserve">2x</w:t>
+            </w:r>
+          </w:p>
+        </w:tc>
+        <w:tc>
+          <w:tcPr/>
+          <w:p>
+            <w:pPr>
+              <w:pStyle w:val="Compact"/>
+            </w:pPr>
+            <w:r>
+              <w:t xml:space="preserve">98%</w:t>
+            </w:r>
+          </w:p>
+        </w:tc>
+        <w:tc>
+          <w:tcPr/>
+          <w:p>
+            <w:pPr>
+              <w:pStyle w:val="Compact"/>
+            </w:pPr>
+            <w:r>
+              <w:t xml:space="preserve">100%</w:t>
+            </w:r>
+          </w:p>
+        </w:tc>
+        <w:tc>
+          <w:tcPr/>
+          <w:p>
+            <w:pPr>
+              <w:pStyle w:val="Compact"/>
+            </w:pPr>
+            <w:r>
+              <w:t xml:space="preserve">100%</w:t>
+            </w:r>
+          </w:p>
+        </w:tc>
+      </w:tr>
+      <w:tr>
+        <w:tc>
+          <w:tcPr/>
+          <w:p>
+            <w:pPr>
+              <w:pStyle w:val="Compact"/>
+            </w:pPr>
+            <w:r>
+              <w:t xml:space="preserve">AtmosGuard</w:t>
+            </w:r>
+          </w:p>
+        </w:tc>
+        <w:tc>
+          <w:tcPr/>
+          <w:p>
+            <w:pPr>
+              <w:pStyle w:val="Compact"/>
+            </w:pPr>
+            <w:r>
+              <w:t xml:space="preserve">4x</w:t>
+            </w:r>
+          </w:p>
+        </w:tc>
+        <w:tc>
+          <w:tcPr/>
+          <w:p>
+            <w:pPr>
+              <w:pStyle w:val="Compact"/>
+            </w:pPr>
+            <w:r>
+              <w:t xml:space="preserve">98%</w:t>
+            </w:r>
+          </w:p>
+        </w:tc>
+        <w:tc>
+          <w:tcPr/>
+          <w:p>
+            <w:pPr>
+              <w:pStyle w:val="Compact"/>
+            </w:pPr>
+            <w:r>
+              <w:t xml:space="preserve">100%</w:t>
+            </w:r>
+          </w:p>
+        </w:tc>
+        <w:tc>
+          <w:tcPr/>
+          <w:p>
+            <w:pPr>
+              <w:pStyle w:val="Compact"/>
+            </w:pPr>
+            <w:r>
+              <w:t xml:space="preserve">100%</w:t>
+            </w:r>
+          </w:p>
+        </w:tc>
+      </w:tr>
+      <w:tr>
+        <w:tc>
+          <w:tcPr/>
+          <w:p>
+            <w:pPr>
+              <w:pStyle w:val="Compact"/>
+            </w:pPr>
+            <w:r>
+              <w:t xml:space="preserve">textbook range + step + persistence</w:t>
+            </w:r>
+          </w:p>
+        </w:tc>
+        <w:tc>
+          <w:tcPr/>
+          <w:p>
+            <w:pPr>
+              <w:pStyle w:val="Compact"/>
+            </w:pPr>
+            <w:r>
+              <w:t xml:space="preserve">0.25x</w:t>
+            </w:r>
+          </w:p>
+        </w:tc>
+        <w:tc>
+          <w:tcPr/>
+          <w:p>
+            <w:pPr>
+              <w:pStyle w:val="Compact"/>
+            </w:pPr>
+            <w:r>
+              <w:t xml:space="preserve">6%</w:t>
+            </w:r>
+          </w:p>
+        </w:tc>
+        <w:tc>
+          <w:tcPr/>
+          <w:p>
+            <w:pPr>
+              <w:pStyle w:val="Compact"/>
+            </w:pPr>
+            <w:r>
+              <w:t xml:space="preserve">0%</w:t>
+            </w:r>
+          </w:p>
+        </w:tc>
+        <w:tc>
+          <w:tcPr/>
+          <w:p>
+            <w:pPr>
+              <w:pStyle w:val="Compact"/>
+            </w:pPr>
+            <w:r>
+              <w:t xml:space="preserve">13%</w:t>
+            </w:r>
+          </w:p>
+        </w:tc>
+      </w:tr>
+      <w:tr>
+        <w:tc>
+          <w:tcPr/>
+          <w:p>
+            <w:pPr>
+              <w:pStyle w:val="Compact"/>
+            </w:pPr>
+            <w:r>
+              <w:t xml:space="preserve">textbook range + step + persistence</w:t>
+            </w:r>
+          </w:p>
+        </w:tc>
+        <w:tc>
+          <w:tcPr/>
+          <w:p>
+            <w:pPr>
+              <w:pStyle w:val="Compact"/>
+            </w:pPr>
+            <w:r>
+              <w:t xml:space="preserve">0.5x</w:t>
+            </w:r>
+          </w:p>
+        </w:tc>
+        <w:tc>
+          <w:tcPr/>
+          <w:p>
+            <w:pPr>
+              <w:pStyle w:val="Compact"/>
+            </w:pPr>
+            <w:r>
+              <w:t xml:space="preserve">54%</w:t>
+            </w:r>
+          </w:p>
+        </w:tc>
+        <w:tc>
+          <w:tcPr/>
+          <w:p>
+            <w:pPr>
+              <w:pStyle w:val="Compact"/>
+            </w:pPr>
+            <w:r>
+              <w:t xml:space="preserve">24%</w:t>
+            </w:r>
+          </w:p>
+        </w:tc>
+        <w:tc>
+          <w:tcPr/>
+          <w:p>
+            <w:pPr>
+              <w:pStyle w:val="Compact"/>
+            </w:pPr>
+            <w:r>
+              <w:t xml:space="preserve">24%</w:t>
+            </w:r>
+          </w:p>
+        </w:tc>
+      </w:tr>
+      <w:tr>
+        <w:tc>
+          <w:tcPr/>
+          <w:p>
+            <w:pPr>
+              <w:pStyle w:val="Compact"/>
+            </w:pPr>
+            <w:r>
+              <w:t xml:space="preserve">textbook range + step + persistence</w:t>
+            </w:r>
+          </w:p>
+        </w:tc>
+        <w:tc>
+          <w:tcPr/>
+          <w:p>
+            <w:pPr>
+              <w:pStyle w:val="Compact"/>
+            </w:pPr>
+            <w:r>
+              <w:t xml:space="preserve">1x</w:t>
+            </w:r>
+          </w:p>
+        </w:tc>
+        <w:tc>
+          <w:tcPr/>
+          <w:p>
+            <w:pPr>
+              <w:pStyle w:val="Compact"/>
+            </w:pPr>
+            <w:r>
+              <w:t xml:space="preserve">70%</w:t>
+            </w:r>
+          </w:p>
+        </w:tc>
+        <w:tc>
+          <w:tcPr/>
+          <w:p>
+            <w:pPr>
+              <w:pStyle w:val="Compact"/>
+            </w:pPr>
+            <w:r>
+              <w:t xml:space="preserve">78%</w:t>
+            </w:r>
+          </w:p>
+        </w:tc>
+        <w:tc>
+          <w:tcPr/>
+          <w:p>
+            <w:pPr>
+              <w:pStyle w:val="Compact"/>
+            </w:pPr>
+            <w:r>
+              <w:t xml:space="preserve">69%</w:t>
+            </w:r>
+          </w:p>
+        </w:tc>
+      </w:tr>
+      <w:tr>
+        <w:tc>
+          <w:tcPr/>
+          <w:p>
+            <w:pPr>
+              <w:pStyle w:val="Compact"/>
+            </w:pPr>
+            <w:r>
+              <w:t xml:space="preserve">textbook range + step + persistence</w:t>
+            </w:r>
+          </w:p>
+        </w:tc>
+        <w:tc>
+          <w:tcPr/>
+          <w:p>
+            <w:pPr>
+              <w:pStyle w:val="Compact"/>
+            </w:pPr>
+            <w:r>
+              <w:t xml:space="preserve">2x</w:t>
+            </w:r>
+          </w:p>
+        </w:tc>
+        <w:tc>
+          <w:tcPr/>
+          <w:p>
+            <w:pPr>
+              <w:pStyle w:val="Compact"/>
+            </w:pPr>
+            <w:r>
+              <w:t xml:space="preserve">98%</w:t>
+            </w:r>
+          </w:p>
+        </w:tc>
+        <w:tc>
+          <w:tcPr/>
+          <w:p>
+            <w:pPr>
+              <w:pStyle w:val="Compact"/>
+            </w:pPr>
+            <w:r>
+              <w:t xml:space="preserve">94%</w:t>
+            </w:r>
+          </w:p>
+        </w:tc>
+        <w:tc>
+          <w:tcPr/>
+          <w:p>
+            <w:pPr>
+              <w:pStyle w:val="Compact"/>
+            </w:pPr>
+            <w:r>
+              <w:t xml:space="preserve">100%</w:t>
+            </w:r>
+          </w:p>
+        </w:tc>
+      </w:tr>
+      <w:tr>
+        <w:tc>
+          <w:tcPr/>
+          <w:p>
+            <w:pPr>
+              <w:pStyle w:val="Compact"/>
+            </w:pPr>
+            <w:r>
+              <w:t xml:space="preserve">textbook range + step + persistence</w:t>
+            </w:r>
+          </w:p>
+        </w:tc>
+        <w:tc>
+          <w:tcPr/>
+          <w:p>
+            <w:pPr>
+              <w:pStyle w:val="Compact"/>
+            </w:pPr>
+            <w:r>
+              <w:t xml:space="preserve">4x</w:t>
+            </w:r>
+          </w:p>
+        </w:tc>
+        <w:tc>
+          <w:tcPr/>
+          <w:p>
+            <w:pPr>
+              <w:pStyle w:val="Compact"/>
+            </w:pPr>
+            <w:r>
+              <w:t xml:space="preserve">98%</w:t>
+            </w:r>
+          </w:p>
+        </w:tc>
+        <w:tc>
+          <w:tcPr/>
+          <w:p>
+            <w:pPr>
+              <w:pStyle w:val="Compact"/>
+            </w:pPr>
+            <w:r>
+              <w:t xml:space="preserve">100%</w:t>
+            </w:r>
+          </w:p>
+        </w:tc>
+        <w:tc>
+          <w:tcPr/>
+          <w:p>
+            <w:pPr>
+              <w:pStyle w:val="Compact"/>
+            </w:pPr>
+            <w:r>
+              <w:t xml:space="preserve">100%</w:t>
+            </w:r>
+          </w:p>
+        </w:tc>
+      </w:tr>
+      <w:tr>
+        <w:tc>
+          <w:tcPr/>
+          <w:p>
+            <w:pPr>
+              <w:pStyle w:val="Compact"/>
+            </w:pPr>
+            <w:r>
+              <w:t xml:space="preserve">Mahalanobis distance only</w:t>
+            </w:r>
+          </w:p>
+        </w:tc>
+        <w:tc>
+          <w:tcPr/>
+          <w:p>
+            <w:pPr>
+              <w:pStyle w:val="Compact"/>
+            </w:pPr>
+            <w:r>
+              <w:t xml:space="preserve">0.25x</w:t>
+            </w:r>
+          </w:p>
+        </w:tc>
+        <w:tc>
+          <w:tcPr/>
+          <w:p>
+            <w:pPr>
+              <w:pStyle w:val="Compact"/>
+            </w:pPr>
+            <w:r>
+              <w:t xml:space="preserve">9%</w:t>
+            </w:r>
+          </w:p>
+        </w:tc>
+        <w:tc>
+          <w:tcPr/>
+          <w:p>
+            <w:pPr>
+              <w:pStyle w:val="Compact"/>
+            </w:pPr>
+            <w:r>
+              <w:t xml:space="preserve">0%</w:t>
+            </w:r>
+          </w:p>
+        </w:tc>
+        <w:tc>
+          <w:tcPr/>
+          <w:p>
+            <w:pPr>
+              <w:pStyle w:val="Compact"/>
+            </w:pPr>
+            <w:r>
+              <w:t xml:space="preserve">2%</w:t>
+            </w:r>
+          </w:p>
+        </w:tc>
+      </w:tr>
+      <w:tr>
+        <w:tc>
+          <w:tcPr/>
+          <w:p>
+            <w:pPr>
+              <w:pStyle w:val="Compact"/>
+            </w:pPr>
+            <w:r>
+              <w:t xml:space="preserve">Mahalanobis distance only</w:t>
+            </w:r>
+          </w:p>
+        </w:tc>
+        <w:tc>
+          <w:tcPr/>
+          <w:p>
+            <w:pPr>
+              <w:pStyle w:val="Compact"/>
+            </w:pPr>
+            <w:r>
+              <w:t xml:space="preserve">0.5x</w:t>
+            </w:r>
+          </w:p>
+        </w:tc>
+        <w:tc>
+          <w:tcPr/>
+          <w:p>
+            <w:pPr>
+              <w:pStyle w:val="Compact"/>
+            </w:pPr>
+            <w:r>
+              <w:t xml:space="preserve">91%</w:t>
+            </w:r>
+          </w:p>
+        </w:tc>
+        <w:tc>
+          <w:tcPr/>
+          <w:p>
+            <w:pPr>
+              <w:pStyle w:val="Compact"/>
+            </w:pPr>
+            <w:r>
+              <w:t xml:space="preserve">26%</w:t>
+            </w:r>
+          </w:p>
+        </w:tc>
+        <w:tc>
+          <w:tcPr/>
+          <w:p>
+            <w:pPr>
+              <w:pStyle w:val="Compact"/>
+            </w:pPr>
+            <w:r>
+              <w:t xml:space="preserve">24%</w:t>
+            </w:r>
+          </w:p>
+        </w:tc>
+      </w:tr>
+      <w:tr>
+        <w:tc>
+          <w:tcPr/>
+          <w:p>
+            <w:pPr>
+              <w:pStyle w:val="Compact"/>
+            </w:pPr>
+            <w:r>
+              <w:t xml:space="preserve">Mahalanobis distance only</w:t>
+            </w:r>
+          </w:p>
+        </w:tc>
+        <w:tc>
+          <w:tcPr/>
+          <w:p>
+            <w:pPr>
+              <w:pStyle w:val="Compact"/>
+            </w:pPr>
+            <w:r>
+              <w:t xml:space="preserve">1x</w:t>
+            </w:r>
+          </w:p>
+        </w:tc>
+        <w:tc>
+          <w:tcPr/>
+          <w:p>
+            <w:pPr>
+              <w:pStyle w:val="Compact"/>
+            </w:pPr>
+            <w:r>
+              <w:t xml:space="preserve">100%</w:t>
+            </w:r>
+          </w:p>
+        </w:tc>
+        <w:tc>
+          <w:tcPr/>
+          <w:p>
+            <w:pPr>
+              <w:pStyle w:val="Compact"/>
+            </w:pPr>
+            <w:r>
+              <w:t xml:space="preserve">100%</w:t>
+            </w:r>
+          </w:p>
+        </w:tc>
+        <w:tc>
+          <w:tcPr/>
+          <w:p>
+            <w:pPr>
+              <w:pStyle w:val="Compact"/>
+            </w:pPr>
+            <w:r>
+              <w:t xml:space="preserve">83%</w:t>
+            </w:r>
+          </w:p>
+        </w:tc>
+      </w:tr>
+      <w:tr>
+        <w:tc>
+          <w:tcPr/>
+          <w:p>
+            <w:pPr>
+              <w:pStyle w:val="Compact"/>
+            </w:pPr>
+            <w:r>
+              <w:t xml:space="preserve">Mahalanobis distance only</w:t>
+            </w:r>
+          </w:p>
+        </w:tc>
+        <w:tc>
+          <w:tcPr/>
+          <w:p>
+            <w:pPr>
+              <w:pStyle w:val="Compact"/>
+            </w:pPr>
+            <w:r>
+              <w:t xml:space="preserve">2x</w:t>
+            </w:r>
+          </w:p>
+        </w:tc>
+        <w:tc>
+          <w:tcPr/>
+          <w:p>
+            <w:pPr>
+              <w:pStyle w:val="Compact"/>
+            </w:pPr>
+            <w:r>
+              <w:t xml:space="preserve">100%</w:t>
+            </w:r>
+          </w:p>
+        </w:tc>
+        <w:tc>
+          <w:tcPr/>
+          <w:p>
+            <w:pPr>
+              <w:pStyle w:val="Compact"/>
+            </w:pPr>
+            <w:r>
+              <w:t xml:space="preserve">100%</w:t>
+            </w:r>
+          </w:p>
+        </w:tc>
+        <w:tc>
+          <w:tcPr/>
+          <w:p>
+            <w:pPr>
+              <w:pStyle w:val="Compact"/>
+            </w:pPr>
+            <w:r>
+              <w:t xml:space="preserve">100%</w:t>
+            </w:r>
+          </w:p>
+        </w:tc>
+      </w:tr>
+      <w:tr>
+        <w:tc>
+          <w:tcPr/>
+          <w:p>
+            <w:pPr>
+              <w:pStyle w:val="Compact"/>
+            </w:pPr>
+            <w:r>
+              <w:t xml:space="preserve">Mahalanobis distance only</w:t>
+            </w:r>
+          </w:p>
+        </w:tc>
+        <w:tc>
+          <w:tcPr/>
+          <w:p>
+            <w:pPr>
+              <w:pStyle w:val="Compact"/>
+            </w:pPr>
+            <w:r>
+              <w:t xml:space="preserve">4x</w:t>
+            </w:r>
+          </w:p>
+        </w:tc>
+        <w:tc>
+          <w:tcPr/>
+          <w:p>
+            <w:pPr>
+              <w:pStyle w:val="Compact"/>
+            </w:pPr>
+            <w:r>
+              <w:t xml:space="preserve">100%</w:t>
+            </w:r>
+          </w:p>
+        </w:tc>
+        <w:tc>
+          <w:tcPr/>
+          <w:p>
+            <w:pPr>
+              <w:pStyle w:val="Compact"/>
+            </w:pPr>
+            <w:r>
+              <w:t xml:space="preserve">100%</w:t>
+            </w:r>
+          </w:p>
+        </w:tc>
+        <w:tc>
+          <w:tcPr/>
+          <w:p>
+            <w:pPr>
+              <w:pStyle w:val="Compact"/>
+            </w:pPr>
+            <w:r>
+              <w:t xml:space="preserve">100%</w:t>
+            </w:r>
+          </w:p>
+        </w:tc>
+      </w:tr>
+    </w:tbl>
+    <w:bookmarkEnd w:id="87"/>
+    <w:bookmarkStart w:id="88" w:name="a-new-station-on-day-one-cold-start"/>
+    <w:p>
+      <w:pPr>
+        <w:pStyle w:val="Heading3"/>
+      </w:pPr>
+      <w:r>
+        <w:t xml:space="preserve">4.7 A new station on day one (cold start)</w:t>
       </w:r>
     </w:p>
     <w:p>
@@ -37156,9 +38104,9 @@
         <w:t xml:space="preserve">projects the running time first).</w:t>
       </w:r>
     </w:p>
-    <w:bookmarkEnd w:id="87"/>
     <w:bookmarkEnd w:id="88"/>
-    <w:bookmarkStart w:id="93" w:name="X2044a3e36d2d5b2a8916663a95641182c65a810"/>
+    <w:bookmarkEnd w:id="89"/>
+    <w:bookmarkStart w:id="94" w:name="X2044a3e36d2d5b2a8916663a95641182c65a810"/>
     <w:p>
       <w:pPr>
         <w:pStyle w:val="Heading2"/>
@@ -37278,7 +38226,7 @@
         <w:t xml:space="preserve">verdicts already reported.)</w:t>
       </w:r>
     </w:p>
-    <w:bookmarkStart w:id="89" w:name="the-three-windows"/>
+    <w:bookmarkStart w:id="90" w:name="the-three-windows"/>
     <w:p>
       <w:pPr>
         <w:pStyle w:val="Heading3"/>
@@ -37569,8 +38517,8 @@
         </w:tc>
       </w:tr>
     </w:tbl>
-    <w:bookmarkEnd w:id="89"/>
-    <w:bookmarkStart w:id="90" w:name="Xe40d6a0b54f3756887c834b5aaba6f2374833dc"/>
+    <w:bookmarkEnd w:id="90"/>
+    <w:bookmarkStart w:id="91" w:name="Xe40d6a0b54f3756887c834b5aaba6f2374833dc"/>
     <w:p>
       <w:pPr>
         <w:pStyle w:val="Heading3"/>
@@ -37695,8 +38643,8 @@
         <w:t xml:space="preserve">evaluated honestly. Re-running them on this holdout would turn it into a tuning set, so they are listed as next work.</w:t>
       </w:r>
     </w:p>
-    <w:bookmarkEnd w:id="90"/>
-    <w:bookmarkStart w:id="91" w:name="what-it-says-about-the-claim"/>
+    <w:bookmarkEnd w:id="91"/>
+    <w:bookmarkStart w:id="92" w:name="what-it-says-about-the-claim"/>
     <w:p>
       <w:pPr>
         <w:pStyle w:val="Heading3"/>
@@ -37752,8 +38700,8 @@
         <w:t xml:space="preserve">. The textbook rules baseline gets 95 of those 98 windows wrong.</w:t>
       </w:r>
     </w:p>
-    <w:bookmarkEnd w:id="91"/>
-    <w:bookmarkStart w:id="92" w:name="X668bf211504a1007173a5e749946da4f1cbd0fa"/>
+    <w:bookmarkEnd w:id="92"/>
+    <w:bookmarkStart w:id="93" w:name="X668bf211504a1007173a5e749946da4f1cbd0fa"/>
     <w:p>
       <w:pPr>
         <w:pStyle w:val="Heading3"/>
@@ -37969,9 +38917,9 @@
         <w:t xml:space="preserve">channels or the health score drops. We take that trade because sustained saturation is real weather more often than a stuck sensor is, and we say so.</w:t>
       </w:r>
     </w:p>
-    <w:bookmarkEnd w:id="92"/>
     <w:bookmarkEnd w:id="93"/>
-    <w:bookmarkStart w:id="99" w:name="X0c6babe05ada4703930d11639828e5b6cecbbdf"/>
+    <w:bookmarkEnd w:id="94"/>
+    <w:bookmarkStart w:id="100" w:name="X0c6babe05ada4703930d11639828e5b6cecbbdf"/>
     <w:p>
       <w:pPr>
         <w:pStyle w:val="Heading2"/>
@@ -37980,7 +38928,7 @@
         <w:t xml:space="preserve">6. Limitations: what we do not claim and cannot see</w:t>
       </w:r>
     </w:p>
-    <w:bookmarkStart w:id="94" w:name="about-the-data"/>
+    <w:bookmarkStart w:id="95" w:name="about-the-data"/>
     <w:p>
       <w:pPr>
         <w:pStyle w:val="Heading3"/>
@@ -38151,8 +39099,8 @@
         <w:t xml:space="preserve">proof that we are right or that they are.</w:t>
       </w:r>
     </w:p>
-    <w:bookmarkEnd w:id="94"/>
-    <w:bookmarkStart w:id="95" w:name="about-the-results"/>
+    <w:bookmarkEnd w:id="95"/>
+    <w:bookmarkStart w:id="96" w:name="about-the-results"/>
     <w:p>
       <w:pPr>
         <w:pStyle w:val="Heading3"/>
@@ -38350,8 +39298,8 @@
         <w:t xml:space="preserve">records when, and the protocol was committed before.</w:t>
       </w:r>
     </w:p>
-    <w:bookmarkEnd w:id="95"/>
-    <w:bookmarkStart w:id="96" w:name="about-novelty"/>
+    <w:bookmarkEnd w:id="96"/>
+    <w:bookmarkStart w:id="97" w:name="about-novelty"/>
     <w:p>
       <w:pPr>
         <w:pStyle w:val="Heading3"/>
@@ -38497,8 +39445,8 @@
         <w:t xml:space="preserve">The wet-bulb check is a soft flag only.</w:t>
       </w:r>
     </w:p>
-    <w:bookmarkEnd w:id="96"/>
-    <w:bookmarkStart w:id="97" w:name="about-the-hardware-and-deployment"/>
+    <w:bookmarkEnd w:id="97"/>
+    <w:bookmarkStart w:id="98" w:name="about-the-hardware-and-deployment"/>
     <w:p>
       <w:pPr>
         <w:pStyle w:val="Heading3"/>
@@ -38656,8 +39604,8 @@
         <w:t xml:space="preserve">review and a long field trial.</w:t>
       </w:r>
     </w:p>
-    <w:bookmarkEnd w:id="97"/>
-    <w:bookmarkStart w:id="98" w:name="what-the-system-cannot-see"/>
+    <w:bookmarkEnd w:id="98"/>
+    <w:bookmarkStart w:id="99" w:name="what-the-system-cannot-see"/>
     <w:p>
       <w:pPr>
         <w:pStyle w:val="Heading3"/>
@@ -38985,9 +39933,9 @@
         <w:t xml:space="preserve">neighbour stations, a forecast model, a calibration record. By design we use none.</w:t>
       </w:r>
     </w:p>
-    <w:bookmarkEnd w:id="98"/>
     <w:bookmarkEnd w:id="99"/>
-    <w:bookmarkStart w:id="105" w:name="related-work-and-what-is-ours"/>
+    <w:bookmarkEnd w:id="100"/>
+    <w:bookmarkStart w:id="106" w:name="related-work-and-what-is-ours"/>
     <w:p>
       <w:pPr>
         <w:pStyle w:val="Heading2"/>
@@ -38996,7 +39944,7 @@
         <w:t xml:space="preserve">7. Related work and what is ours</w:t>
       </w:r>
     </w:p>
-    <w:bookmarkStart w:id="100" w:name="what-is-standard"/>
+    <w:bookmarkStart w:id="101" w:name="what-is-standard"/>
     <w:p>
       <w:pPr>
         <w:pStyle w:val="Heading3"/>
@@ -39345,8 +40293,8 @@
         </w:tc>
       </w:tr>
     </w:tbl>
-    <w:bookmarkEnd w:id="100"/>
-    <w:bookmarkStart w:id="101" w:name="what-we-adapted"/>
+    <w:bookmarkEnd w:id="101"/>
+    <w:bookmarkStart w:id="102" w:name="what-we-adapted"/>
     <w:p>
       <w:pPr>
         <w:pStyle w:val="Heading3"/>
@@ -39715,8 +40663,8 @@
         </w:tc>
       </w:tr>
     </w:tbl>
-    <w:bookmarkEnd w:id="101"/>
-    <w:bookmarkStart w:id="102" w:name="what-is-ours"/>
+    <w:bookmarkEnd w:id="102"/>
+    <w:bookmarkStart w:id="103" w:name="what-is-ours"/>
     <w:p>
       <w:pPr>
         <w:pStyle w:val="Heading3"/>
@@ -40139,8 +41087,8 @@
         <w:t xml:space="preserve">That is a measured boundary, not a claim of a working detector.</w:t>
       </w:r>
     </w:p>
-    <w:bookmarkEnd w:id="102"/>
-    <w:bookmarkStart w:id="103" w:name="the-field-on-this-problem-statement"/>
+    <w:bookmarkEnd w:id="103"/>
+    <w:bookmarkStart w:id="104" w:name="the-field-on-this-problem-statement"/>
     <w:p>
       <w:pPr>
         <w:pStyle w:val="Heading3"/>
@@ -41105,8 +42053,8 @@
         <w:t xml:space="preserve">data, an agreement check against operational QC flags, or a stated list of what it cannot do.</w:t>
       </w:r>
     </w:p>
-    <w:bookmarkEnd w:id="103"/>
-    <w:bookmarkStart w:id="104" w:name="X76134177c3d160d01bb5613acfea090322b7d6d"/>
+    <w:bookmarkEnd w:id="104"/>
+    <w:bookmarkStart w:id="105" w:name="X76134177c3d160d01bb5613acfea090322b7d6d"/>
     <w:p>
       <w:pPr>
         <w:pStyle w:val="Heading3"/>
@@ -41366,9 +42314,9 @@
         </w:tc>
       </w:tr>
     </w:tbl>
-    <w:bookmarkEnd w:id="104"/>
     <w:bookmarkEnd w:id="105"/>
-    <w:bookmarkStart w:id="109" w:name="reproducing-this-report"/>
+    <w:bookmarkEnd w:id="106"/>
+    <w:bookmarkStart w:id="110" w:name="reproducing-this-report"/>
     <w:p>
       <w:pPr>
         <w:pStyle w:val="Heading2"/>
@@ -41397,7 +42345,7 @@
         <w:t xml:space="preserve">.</w:t>
       </w:r>
     </w:p>
-    <w:bookmarkStart w:id="106" w:name="does-it-work"/>
+    <w:bookmarkStart w:id="107" w:name="does-it-work"/>
     <w:p>
       <w:pPr>
         <w:pStyle w:val="Heading3"/>
@@ -41453,8 +42401,8 @@
         <w:t xml:space="preserve"># 400+ tests, including the C++ edge-parity tests (needs g++)</w:t>
       </w:r>
     </w:p>
-    <w:bookmarkEnd w:id="106"/>
-    <w:bookmarkStart w:id="107" w:name="the-evidence"/>
+    <w:bookmarkEnd w:id="107"/>
+    <w:bookmarkStart w:id="108" w:name="the-evidence"/>
     <w:p>
       <w:pPr>
         <w:pStyle w:val="Heading3"/>
@@ -42226,6 +43174,124 @@
               <w:pStyle w:val="Compact"/>
             </w:pPr>
             <w:r>
+              <w:t xml:space="preserve">Diagrams, one-page PDF, dashboard screenshots and video</w:t>
+            </w:r>
+          </w:p>
+        </w:tc>
+        <w:tc>
+          <w:tcPr/>
+          <w:p>
+            <w:pPr>
+              <w:pStyle w:val="Compact"/>
+            </w:pPr>
+            <w:r>
+              <w:rPr>
+                <w:rStyle w:val="VerbatimChar"/>
+              </w:rPr>
+              <w:t xml:space="preserve">python make_diagrams.py</w:t>
+            </w:r>
+            <w:r>
+              <w:t xml:space="preserve">,</w:t>
+            </w:r>
+            <w:r>
+              <w:t xml:space="preserve"> </w:t>
+            </w:r>
+            <w:r>
+              <w:rPr>
+                <w:rStyle w:val="VerbatimChar"/>
+              </w:rPr>
+              <w:t xml:space="preserve">python make_onepager.py</w:t>
+            </w:r>
+            <w:r>
+              <w:t xml:space="preserve">,</w:t>
+            </w:r>
+            <w:r>
+              <w:t xml:space="preserve"> </w:t>
+            </w:r>
+            <w:r>
+              <w:rPr>
+                <w:rStyle w:val="VerbatimChar"/>
+              </w:rPr>
+              <w:t xml:space="preserve">python capture_dashboard.py</w:t>
+            </w:r>
+            <w:r>
+              <w:t xml:space="preserve"> </w:t>
+            </w:r>
+            <w:r>
+              <w:t xml:space="preserve">(Playwright and a Chromium)</w:t>
+            </w:r>
+          </w:p>
+        </w:tc>
+        <w:tc>
+          <w:tcPr/>
+          <w:p>
+            <w:pPr>
+              <w:pStyle w:val="Compact"/>
+            </w:pPr>
+            <w:r>
+              <w:t xml:space="preserve">3 min</w:t>
+            </w:r>
+          </w:p>
+        </w:tc>
+        <w:tc>
+          <w:tcPr/>
+          <w:p>
+            <w:pPr>
+              <w:pStyle w:val="Compact"/>
+            </w:pPr>
+            <w:r>
+              <w:rPr>
+                <w:rStyle w:val="VerbatimChar"/>
+              </w:rPr>
+              <w:t xml:space="preserve">docs/figures/diagram_*</w:t>
+            </w:r>
+            <w:r>
+              <w:t xml:space="preserve">,</w:t>
+            </w:r>
+            <w:r>
+              <w:t xml:space="preserve"> </w:t>
+            </w:r>
+            <w:r>
+              <w:rPr>
+                <w:rStyle w:val="VerbatimChar"/>
+              </w:rPr>
+              <w:t xml:space="preserve">docs/AtmosGuard_one_page.*</w:t>
+            </w:r>
+            <w:r>
+              <w:t xml:space="preserve">,</w:t>
+            </w:r>
+            <w:r>
+              <w:t xml:space="preserve"> </w:t>
+            </w:r>
+            <w:r>
+              <w:rPr>
+                <w:rStyle w:val="VerbatimChar"/>
+              </w:rPr>
+              <w:t xml:space="preserve">docs/screenshots/</w:t>
+            </w:r>
+            <w:r>
+              <w:t xml:space="preserve">,</w:t>
+            </w:r>
+            <w:r>
+              <w:t xml:space="preserve"> </w:t>
+            </w:r>
+            <w:r>
+              <w:rPr>
+                <w:rStyle w:val="VerbatimChar"/>
+              </w:rPr>
+              <w:t xml:space="preserve">docs/demo/*.webm</w:t>
+            </w:r>
+          </w:p>
+        </w:tc>
+      </w:tr>
+      <w:tr>
+        <w:tc>
+          <w:tcPr/>
+          <w:p>
+            <w:pPr>
+              <w:pStyle w:val="Compact"/>
+            </w:pPr>
+            <w:r>
               <w:t xml:space="preserve">Humidity response-time research</w:t>
             </w:r>
           </w:p>
@@ -42379,8 +43445,8 @@
         <w:t xml:space="preserve">are for tuning loops only.</w:t>
       </w:r>
     </w:p>
-    <w:bookmarkEnd w:id="107"/>
-    <w:bookmarkStart w:id="108" w:name="determinism"/>
+    <w:bookmarkEnd w:id="108"/>
+    <w:bookmarkStart w:id="109" w:name="determinism"/>
     <w:p>
       <w:pPr>
         <w:pStyle w:val="Heading3"/>
@@ -42418,9 +43484,9 @@
         <w:t xml:space="preserve">the Isolation Forest scores.</w:t>
       </w:r>
     </w:p>
-    <w:bookmarkEnd w:id="108"/>
     <w:bookmarkEnd w:id="109"/>
-    <w:bookmarkStart w:id="110" w:name="references"/>
+    <w:bookmarkEnd w:id="110"/>
+    <w:bookmarkStart w:id="111" w:name="references"/>
     <w:p>
       <w:pPr>
         <w:pStyle w:val="Heading2"/>
@@ -42894,8 +43960,8 @@
         <w:t xml:space="preserve">.</w:t>
       </w:r>
     </w:p>
-    <w:bookmarkEnd w:id="110"/>
     <w:bookmarkEnd w:id="111"/>
+    <w:bookmarkEnd w:id="112"/>
     <w:sectPr>
       <w:footnotePr>
         <w:numRestart w:val="eachSect"/>

</xml_diff>

<commit_message>
Technical report embeds the figures and diagrams (Markdown and Word)
</commit_message>
<xml_diff>
--- a/docs/TECHNICAL_REPORT.docx
+++ b/docs/TECHNICAL_REPORT.docx
@@ -28,7 +28,7 @@
         </w:p>
       </w:sdtContent>
     </w:sdt>
-    <w:bookmarkStart w:id="112" w:name="X57b8e1d458ff9a143105c6b655c97d724b6cafb"/>
+    <w:bookmarkStart w:id="143" w:name="X57b8e1d458ff9a143105c6b655c97d724b6cafb"/>
     <w:p>
       <w:pPr>
         <w:pStyle w:val="Heading1"/>
@@ -286,7 +286,7 @@
       </w:r>
     </w:p>
     <w:bookmarkEnd w:id="10"/>
-    <w:bookmarkStart w:id="15" w:name="introduction"/>
+    <w:bookmarkStart w:id="21" w:name="introduction"/>
     <w:p>
       <w:pPr>
         <w:pStyle w:val="Heading2"/>
@@ -565,7 +565,7 @@
       </w:r>
     </w:p>
     <w:bookmarkEnd w:id="13"/>
-    <w:bookmarkStart w:id="14" w:name="reading-guide"/>
+    <w:bookmarkStart w:id="20" w:name="reading-guide"/>
     <w:p>
       <w:pPr>
         <w:pStyle w:val="Heading3"/>
@@ -594,9 +594,143 @@
         <w:t xml:space="preserve">Section 6 is the limitations. Section 7 is related work and what is ours. Section 8 shows how to reproduce everything.</w:t>
       </w:r>
     </w:p>
-    <w:bookmarkEnd w:id="14"/>
-    <w:bookmarkEnd w:id="15"/>
-    <w:bookmarkStart w:id="24" w:name="data-and-evaluation-protocol"/>
+    <w:p>
+      <w:pPr>
+        <w:pStyle w:val="CaptionedFigure"/>
+      </w:pPr>
+      <w:r>
+        <w:drawing>
+          <wp:inline>
+            <wp:extent cx="5334000" cy="2698376"/>
+            <wp:effectExtent b="0" l="0" r="0" t="0"/>
+            <wp:docPr descr="Figure 1. What one reading goes through." title="" id="15" name="Picture"/>
+            <a:graphic>
+              <a:graphicData uri="http://schemas.openxmlformats.org/drawingml/2006/picture">
+                <pic:pic>
+                  <pic:nvPicPr>
+                    <pic:cNvPr descr="figures/diagram_pipeline.png" id="16" name="Picture"/>
+                    <pic:cNvPicPr>
+                      <a:picLocks noChangeArrowheads="1" noChangeAspect="1"/>
+                    </pic:cNvPicPr>
+                  </pic:nvPicPr>
+                  <pic:blipFill>
+                    <a:blip r:embed="rId14"/>
+                    <a:stretch>
+                      <a:fillRect/>
+                    </a:stretch>
+                  </pic:blipFill>
+                  <pic:spPr bwMode="auto">
+                    <a:xfrm>
+                      <a:off x="0" y="0"/>
+                      <a:ext cx="5334000" cy="2698376"/>
+                    </a:xfrm>
+                    <a:prstGeom prst="rect">
+                      <a:avLst/>
+                    </a:prstGeom>
+                    <a:noFill/>
+                    <a:ln w="9525">
+                      <a:noFill/>
+                      <a:headEnd/>
+                      <a:tailEnd/>
+                    </a:ln>
+                  </pic:spPr>
+                </pic:pic>
+              </a:graphicData>
+            </a:graphic>
+          </wp:inline>
+        </w:drawing>
+      </w:r>
+    </w:p>
+    <w:p>
+      <w:pPr>
+        <w:pStyle w:val="ImageCaption"/>
+      </w:pPr>
+      <w:r>
+        <w:t xml:space="preserve">Figure 1. What one reading goes through.</w:t>
+      </w:r>
+    </w:p>
+    <w:p>
+      <w:pPr>
+        <w:pStyle w:val="BodyText"/>
+      </w:pPr>
+      <w:r>
+        <w:rPr>
+          <w:i/>
+          <w:iCs/>
+        </w:rPr>
+        <w:t xml:space="preserve">Figure 1. What one reading goes through.</w:t>
+      </w:r>
+    </w:p>
+    <w:p>
+      <w:pPr>
+        <w:pStyle w:val="CaptionedFigure"/>
+      </w:pPr>
+      <w:r>
+        <w:drawing>
+          <wp:inline>
+            <wp:extent cx="5334000" cy="2066924"/>
+            <wp:effectExtent b="0" l="0" r="0" t="0"/>
+            <wp:docPr descr="Figure 2. The four verdicts and what each looks like on the three channels (sketches)." title="" id="18" name="Picture"/>
+            <a:graphic>
+              <a:graphicData uri="http://schemas.openxmlformats.org/drawingml/2006/picture">
+                <pic:pic>
+                  <pic:nvPicPr>
+                    <pic:cNvPr descr="figures/diagram_sensor_or_sky.png" id="19" name="Picture"/>
+                    <pic:cNvPicPr>
+                      <a:picLocks noChangeArrowheads="1" noChangeAspect="1"/>
+                    </pic:cNvPicPr>
+                  </pic:nvPicPr>
+                  <pic:blipFill>
+                    <a:blip r:embed="rId17"/>
+                    <a:stretch>
+                      <a:fillRect/>
+                    </a:stretch>
+                  </pic:blipFill>
+                  <pic:spPr bwMode="auto">
+                    <a:xfrm>
+                      <a:off x="0" y="0"/>
+                      <a:ext cx="5334000" cy="2066924"/>
+                    </a:xfrm>
+                    <a:prstGeom prst="rect">
+                      <a:avLst/>
+                    </a:prstGeom>
+                    <a:noFill/>
+                    <a:ln w="9525">
+                      <a:noFill/>
+                      <a:headEnd/>
+                      <a:tailEnd/>
+                    </a:ln>
+                  </pic:spPr>
+                </pic:pic>
+              </a:graphicData>
+            </a:graphic>
+          </wp:inline>
+        </w:drawing>
+      </w:r>
+    </w:p>
+    <w:p>
+      <w:pPr>
+        <w:pStyle w:val="ImageCaption"/>
+      </w:pPr>
+      <w:r>
+        <w:t xml:space="preserve">Figure 2. The four verdicts and what each looks like on the three channels (sketches).</w:t>
+      </w:r>
+    </w:p>
+    <w:p>
+      <w:pPr>
+        <w:pStyle w:val="BodyText"/>
+      </w:pPr>
+      <w:r>
+        <w:rPr>
+          <w:i/>
+          <w:iCs/>
+        </w:rPr>
+        <w:t xml:space="preserve">Figure 2. The four verdicts and what each looks like on the three channels (sketches).</w:t>
+      </w:r>
+    </w:p>
+    <w:bookmarkEnd w:id="20"/>
+    <w:bookmarkEnd w:id="21"/>
+    <w:bookmarkStart w:id="30" w:name="data-and-evaluation-protocol"/>
     <w:p>
       <w:pPr>
         <w:pStyle w:val="Heading2"/>
@@ -605,7 +739,7 @@
         <w:t xml:space="preserve">2. Data and evaluation protocol</w:t>
       </w:r>
     </w:p>
-    <w:bookmarkStart w:id="16" w:name="data"/>
+    <w:bookmarkStart w:id="22" w:name="data"/>
     <w:p>
       <w:pPr>
         <w:pStyle w:val="Heading3"/>
@@ -670,8 +804,8 @@
         <w:t xml:space="preserve">code for each value is kept only as a weak label for an agreement table; it never influences a verdict.</w:t>
       </w:r>
     </w:p>
-    <w:bookmarkEnd w:id="16"/>
-    <w:bookmarkStart w:id="17" w:name="split"/>
+    <w:bookmarkEnd w:id="22"/>
+    <w:bookmarkStart w:id="23" w:name="split"/>
     <w:p>
       <w:pPr>
         <w:pStyle w:val="Heading3"/>
@@ -769,8 +903,8 @@
         <w:t xml:space="preserve">files unless that file is tracked and unmodified, and it writes a lock file when it runs.</w:t>
       </w:r>
     </w:p>
-    <w:bookmarkEnd w:id="17"/>
-    <w:bookmarkStart w:id="18" w:name="extreme-weather-windows"/>
+    <w:bookmarkEnd w:id="23"/>
+    <w:bookmarkStart w:id="24" w:name="extreme-weather-windows"/>
     <w:p>
       <w:pPr>
         <w:pStyle w:val="Heading3"/>
@@ -832,8 +966,8 @@
         <w:t xml:space="preserve">verdict inside such a window is counted as a failure: real weather was called a broken sensor.</w:t>
       </w:r>
     </w:p>
-    <w:bookmarkEnd w:id="18"/>
-    <w:bookmarkStart w:id="19" w:name="the-five-numbers"/>
+    <w:bookmarkEnd w:id="24"/>
+    <w:bookmarkStart w:id="25" w:name="the-five-numbers"/>
     <w:p>
       <w:pPr>
         <w:pStyle w:val="Heading3"/>
@@ -976,8 +1110,8 @@
         <w:t xml:space="preserve">the same training data.</w:t>
       </w:r>
     </w:p>
-    <w:bookmarkEnd w:id="19"/>
-    <w:bookmarkStart w:id="20" w:name="X1685ad65f5df273b79acc7c5d199826869f37dd"/>
+    <w:bookmarkEnd w:id="25"/>
+    <w:bookmarkStart w:id="26" w:name="X1685ad65f5df273b79acc7c5d199826869f37dd"/>
     <w:p>
       <w:pPr>
         <w:pStyle w:val="Heading3"/>
@@ -1428,8 +1562,8 @@
         <w:t xml:space="preserve">clock shift 96.8 %, noise burst 80.7 %.</w:t>
       </w:r>
     </w:p>
-    <w:bookmarkEnd w:id="20"/>
-    <w:bookmarkStart w:id="21" w:name="X43edb2b8b9d6c30d8f1914b4a589e51fd5572b7"/>
+    <w:bookmarkEnd w:id="26"/>
+    <w:bookmarkStart w:id="27" w:name="X43edb2b8b9d6c30d8f1914b4a589e51fd5572b7"/>
     <w:p>
       <w:pPr>
         <w:pStyle w:val="Heading3"/>
@@ -1850,8 +1984,8 @@
         <w:t xml:space="preserve">.</w:t>
       </w:r>
     </w:p>
-    <w:bookmarkEnd w:id="21"/>
-    <w:bookmarkStart w:id="22" w:name="X7a28bf00d05ac45a29eb3c222f7baf97b42beda"/>
+    <w:bookmarkEnd w:id="27"/>
+    <w:bookmarkStart w:id="28" w:name="X7a28bf00d05ac45a29eb3c222f7baf97b42beda"/>
     <w:p>
       <w:pPr>
         <w:pStyle w:val="Heading3"/>
@@ -2504,8 +2638,8 @@
         <w:t xml:space="preserve">contaminated and are not evidence. These are airport records again, and injected faults again.</w:t>
       </w:r>
     </w:p>
-    <w:bookmarkEnd w:id="22"/>
-    <w:bookmarkStart w:id="23" w:name="X8be6bb83dc05ed8c2e126e39c35653e87b418b7"/>
+    <w:bookmarkEnd w:id="28"/>
+    <w:bookmarkStart w:id="29" w:name="X8be6bb83dc05ed8c2e126e39c35653e87b418b7"/>
     <w:p>
       <w:pPr>
         <w:pStyle w:val="Heading3"/>
@@ -3233,9 +3367,9 @@
         <w:t xml:space="preserve">alarms and a FAULT in 134 of 139 real extreme-weather windows.</w:t>
       </w:r>
     </w:p>
-    <w:bookmarkEnd w:id="23"/>
-    <w:bookmarkEnd w:id="24"/>
-    <w:bookmarkStart w:id="36" w:name="method"/>
+    <w:bookmarkEnd w:id="29"/>
+    <w:bookmarkEnd w:id="30"/>
+    <w:bookmarkStart w:id="42" w:name="method"/>
     <w:p>
       <w:pPr>
         <w:pStyle w:val="Heading2"/>
@@ -3279,7 +3413,7 @@
         <w:t xml:space="preserve">The layers are ordered by cost; a fusion step turns their outputs into one of four verdicts.</w:t>
       </w:r>
     </w:p>
-    <w:bookmarkStart w:id="25" w:name="Xb4710c9e25ed2ae9fa8540a48d93e751ff2db9d"/>
+    <w:bookmarkStart w:id="31" w:name="Xb4710c9e25ed2ae9fa8540a48d93e751ff2db9d"/>
     <w:p>
       <w:pPr>
         <w:pStyle w:val="Heading3"/>
@@ -3382,8 +3516,8 @@
         <w:t xml:space="preserve">rule: 35 degC wet-bulb has been observed.</w:t>
       </w:r>
     </w:p>
-    <w:bookmarkEnd w:id="25"/>
-    <w:bookmarkStart w:id="26" w:name="X0554ba732412aedd60df9d555e313a686d40d47"/>
+    <w:bookmarkEnd w:id="31"/>
+    <w:bookmarkStart w:id="32" w:name="X0554ba732412aedd60df9d555e313a686d40d47"/>
     <w:p>
       <w:pPr>
         <w:pStyle w:val="Heading3"/>
@@ -3617,8 +3751,8 @@
         <w:t xml:space="preserve">A soft flag: real weather anomalies last hours and look like drift.</w:t>
       </w:r>
     </w:p>
-    <w:bookmarkEnd w:id="26"/>
-    <w:bookmarkStart w:id="27" w:name="station-learned-limits-atmoslimits.py"/>
+    <w:bookmarkEnd w:id="32"/>
+    <w:bookmarkStart w:id="33" w:name="station-learned-limits-atmoslimits.py"/>
     <w:p>
       <w:pPr>
         <w:pStyle w:val="Heading3"/>
@@ -3735,8 +3869,8 @@
         <w:t xml:space="preserve">distribution of run lengths); the two-tier grading, the resolution detection and the real-time use are ours.</w:t>
       </w:r>
     </w:p>
-    <w:bookmarkEnd w:id="27"/>
-    <w:bookmarkStart w:id="28" w:name="l2-normality-atmosnormality.py"/>
+    <w:bookmarkEnd w:id="33"/>
+    <w:bookmarkStart w:id="34" w:name="l2-normality-atmosnormality.py"/>
     <w:p>
       <w:pPr>
         <w:pStyle w:val="Heading3"/>
@@ -3796,8 +3930,8 @@
         <w:t xml:space="preserve">function and turns the seasonal cycle into a fake trend.</w:t>
       </w:r>
     </w:p>
-    <w:bookmarkEnd w:id="28"/>
-    <w:bookmarkStart w:id="29" w:name="l3-multivariate"/>
+    <w:bookmarkEnd w:id="34"/>
+    <w:bookmarkStart w:id="35" w:name="l3-multivariate"/>
     <w:p>
       <w:pPr>
         <w:pStyle w:val="Heading3"/>
@@ -3878,8 +4012,8 @@
         <w:t xml:space="preserve">into per-feature contributions, so the flag names the channel and feature that drove it.</w:t>
       </w:r>
     </w:p>
-    <w:bookmarkEnd w:id="29"/>
-    <w:bookmarkStart w:id="30" w:name="timing"/>
+    <w:bookmarkEnd w:id="35"/>
+    <w:bookmarkStart w:id="36" w:name="timing"/>
     <w:p>
       <w:pPr>
         <w:pStyle w:val="Heading3"/>
@@ -3944,8 +4078,8 @@
         <w:t xml:space="preserve">cadence; weak on hourly data, and the README says so.</w:t>
       </w:r>
     </w:p>
-    <w:bookmarkEnd w:id="30"/>
-    <w:bookmarkStart w:id="31" w:name="fusion-first-rule-that-matches-wins"/>
+    <w:bookmarkEnd w:id="36"/>
+    <w:bookmarkStart w:id="37" w:name="fusion-first-rule-that-matches-wins"/>
     <w:p>
       <w:pPr>
         <w:pStyle w:val="Heading3"/>
@@ -4221,8 +4355,8 @@
         <w:t xml:space="preserve">a probability and no metric uses it.</w:t>
       </w:r>
     </w:p>
-    <w:bookmarkEnd w:id="31"/>
-    <w:bookmarkStart w:id="32" w:name="X62961edef5b72f15fdb25a643590ce11b984c33"/>
+    <w:bookmarkEnd w:id="37"/>
+    <w:bookmarkStart w:id="38" w:name="X62961edef5b72f15fdb25a643590ce11b984c33"/>
     <w:p>
       <w:pPr>
         <w:pStyle w:val="Heading3"/>
@@ -4411,8 +4545,8 @@
         <w:t xml:space="preserve">when the score is at or below 60, a channel is faulty in at least half of the last hour, or a service date is within 30 days.</w:t>
       </w:r>
     </w:p>
-    <w:bookmarkEnd w:id="32"/>
-    <w:bookmarkStart w:id="33" w:name="Xa8ee3564932aab0441fa6f89486eb031645052c"/>
+    <w:bookmarkEnd w:id="38"/>
+    <w:bookmarkStart w:id="39" w:name="Xa8ee3564932aab0441fa6f89486eb031645052c"/>
     <w:p>
       <w:pPr>
         <w:pStyle w:val="Heading3"/>
@@ -4460,8 +4594,8 @@
         <w:t xml:space="preserve">the raw value; the raw value is never replaced.</w:t>
       </w:r>
     </w:p>
-    <w:bookmarkEnd w:id="33"/>
-    <w:bookmarkStart w:id="34" w:name="edge-firmwarenodeatmos_l0.h"/>
+    <w:bookmarkEnd w:id="39"/>
+    <w:bookmarkStart w:id="40" w:name="edge-firmwarenodeatmos_l0.h"/>
     <w:p>
       <w:pPr>
         <w:pStyle w:val="Heading3"/>
@@ -4514,8 +4648,8 @@
         <w:t xml:space="preserve">). It has not been run on hardware.</w:t>
       </w:r>
     </w:p>
-    <w:bookmarkEnd w:id="34"/>
-    <w:bookmarkStart w:id="35" w:name="cold-start-atmoscoldstart.py"/>
+    <w:bookmarkEnd w:id="40"/>
+    <w:bookmarkStart w:id="41" w:name="cold-start-atmoscoldstart.py"/>
     <w:p>
       <w:pPr>
         <w:pStyle w:val="Heading3"/>
@@ -4547,9 +4681,9 @@
         <w:t xml:space="preserve">data grows (weight = samples in the cell / 30; limits over 365 days). No live neighbour data is read.</w:t>
       </w:r>
     </w:p>
-    <w:bookmarkEnd w:id="35"/>
-    <w:bookmarkEnd w:id="36"/>
-    <w:bookmarkStart w:id="89" w:name="results"/>
+    <w:bookmarkEnd w:id="41"/>
+    <w:bookmarkEnd w:id="42"/>
+    <w:bookmarkStart w:id="120" w:name="results"/>
     <w:p>
       <w:pPr>
         <w:pStyle w:val="Heading2"/>
@@ -4621,7 +4755,7 @@
         <w:t xml:space="preserve">: the injected-fault score, the false-alarm rate on clean data, what happens to real extreme weather, agreement with NOAA’s flags, and drift are different questions. Injected faults are injected; NOAA’s flags come from another automated system, not from truth.</w:t>
       </w:r>
     </w:p>
-    <w:bookmarkStart w:id="48" w:name="Xe6b9afbf5b7a67d096f8c2f0bd898828861eaf9"/>
+    <w:bookmarkStart w:id="54" w:name="Xe6b9afbf5b7a67d096f8c2f0bd898828861eaf9"/>
     <w:p>
       <w:pPr>
         <w:pStyle w:val="Heading3"/>
@@ -4648,7 +4782,7 @@
         <w:t xml:space="preserve">Stations: BBI, MAA, CCU, DEL, JAI, TRV.</w:t>
       </w:r>
     </w:p>
-    <w:bookmarkStart w:id="37" w:name="headline"/>
+    <w:bookmarkStart w:id="43" w:name="headline"/>
     <w:p>
       <w:pPr>
         <w:pStyle w:val="Heading4"/>
@@ -4824,8 +4958,8 @@
         </w:tc>
       </w:tr>
     </w:tbl>
-    <w:bookmarkEnd w:id="37"/>
-    <w:bookmarkStart w:id="38" w:name="X5d58cd9e4442fcf6bfd0364e8d4f2c2d4dc7bc9"/>
+    <w:bookmarkEnd w:id="43"/>
+    <w:bookmarkStart w:id="44" w:name="X5d58cd9e4442fcf6bfd0364e8d4f2c2d4dc7bc9"/>
     <w:p>
       <w:pPr>
         <w:pStyle w:val="Heading4"/>
@@ -6126,8 +6260,8 @@
         </w:tc>
       </w:tr>
     </w:tbl>
-    <w:bookmarkEnd w:id="38"/>
-    <w:bookmarkStart w:id="39" w:name="X5ab3088f0920785f6aa2914ecaef0c5ecae9cb4"/>
+    <w:bookmarkEnd w:id="44"/>
+    <w:bookmarkStart w:id="45" w:name="X5ab3088f0920785f6aa2914ecaef0c5ecae9cb4"/>
     <w:p>
       <w:pPr>
         <w:pStyle w:val="Heading4"/>
@@ -6483,8 +6617,8 @@
         </w:tc>
       </w:tr>
     </w:tbl>
-    <w:bookmarkEnd w:id="39"/>
-    <w:bookmarkStart w:id="40" w:name="X533071f3abe575621048977651f95e81713eb06"/>
+    <w:bookmarkEnd w:id="45"/>
+    <w:bookmarkStart w:id="46" w:name="X533071f3abe575621048977651f95e81713eb06"/>
     <w:p>
       <w:pPr>
         <w:pStyle w:val="Heading4"/>
@@ -6837,8 +6971,8 @@
         </w:tc>
       </w:tr>
     </w:tbl>
-    <w:bookmarkEnd w:id="40"/>
-    <w:bookmarkStart w:id="41" w:name="false-alarms-on-clean-real-data"/>
+    <w:bookmarkEnd w:id="46"/>
+    <w:bookmarkStart w:id="47" w:name="false-alarms-on-clean-real-data"/>
     <w:p>
       <w:pPr>
         <w:pStyle w:val="Heading4"/>
@@ -7671,8 +7805,8 @@
         </w:tc>
       </w:tr>
     </w:tbl>
-    <w:bookmarkEnd w:id="41"/>
-    <w:bookmarkStart w:id="42" w:name="real-extreme-weather-nothing-injected"/>
+    <w:bookmarkEnd w:id="47"/>
+    <w:bookmarkStart w:id="48" w:name="real-extreme-weather-nothing-injected"/>
     <w:p>
       <w:pPr>
         <w:pStyle w:val="Heading4"/>
@@ -9027,8 +9161,8 @@
         </w:tc>
       </w:tr>
     </w:tbl>
-    <w:bookmarkEnd w:id="42"/>
-    <w:bookmarkStart w:id="43" w:name="agreement-with-noaas-own-quality-flags"/>
+    <w:bookmarkEnd w:id="48"/>
+    <w:bookmarkStart w:id="49" w:name="agreement-with-noaas-own-quality-flags"/>
     <w:p>
       <w:pPr>
         <w:pStyle w:val="Heading4"/>
@@ -9275,8 +9409,8 @@
         </w:tc>
       </w:tr>
     </w:tbl>
-    <w:bookmarkEnd w:id="43"/>
-    <w:bookmarkStart w:id="44" w:name="slow-drift-judged-by-the-health-monitor"/>
+    <w:bookmarkEnd w:id="49"/>
+    <w:bookmarkStart w:id="50" w:name="slow-drift-judged-by-the-health-monitor"/>
     <w:p>
       <w:pPr>
         <w:pStyle w:val="Heading4"/>
@@ -9586,8 +9720,8 @@
         </w:tc>
       </w:tr>
     </w:tbl>
-    <w:bookmarkEnd w:id="44"/>
-    <w:bookmarkStart w:id="45" w:name="by-station-full-pipeline"/>
+    <w:bookmarkEnd w:id="50"/>
+    <w:bookmarkStart w:id="51" w:name="by-station-full-pipeline"/>
     <w:p>
       <w:pPr>
         <w:pStyle w:val="Heading4"/>
@@ -10255,8 +10389,8 @@
         </w:tc>
       </w:tr>
     </w:tbl>
-    <w:bookmarkEnd w:id="45"/>
-    <w:bookmarkStart w:id="46" w:name="X881876f05ec99845104cd33fe5f7f32f0a4bcba"/>
+    <w:bookmarkEnd w:id="51"/>
+    <w:bookmarkStart w:id="52" w:name="X881876f05ec99845104cd33fe5f7f32f0a4bcba"/>
     <w:p>
       <w:pPr>
         <w:pStyle w:val="Heading4"/>
@@ -11557,8 +11691,8 @@
         </w:tc>
       </w:tr>
     </w:tbl>
-    <w:bookmarkEnd w:id="46"/>
-    <w:bookmarkStart w:id="47" w:name="Xfb6ab3bcaeb4ff7bbe052c431a8e2f0895587d4"/>
+    <w:bookmarkEnd w:id="52"/>
+    <w:bookmarkStart w:id="53" w:name="Xfb6ab3bcaeb4ff7bbe052c431a8e2f0895587d4"/>
     <w:p>
       <w:pPr>
         <w:pStyle w:val="Heading4"/>
@@ -11914,9 +12048,9 @@
         </w:tc>
       </w:tr>
     </w:tbl>
-    <w:bookmarkEnd w:id="47"/>
-    <w:bookmarkEnd w:id="48"/>
-    <w:bookmarkStart w:id="60" w:name="X1bd47706f33f60dc5e208326167361276cbf0f9"/>
+    <w:bookmarkEnd w:id="53"/>
+    <w:bookmarkEnd w:id="54"/>
+    <w:bookmarkStart w:id="66" w:name="X1bd47706f33f60dc5e208326167361276cbf0f9"/>
     <w:p>
       <w:pPr>
         <w:pStyle w:val="Heading3"/>
@@ -11943,7 +12077,7 @@
         <w:t xml:space="preserve">Stations: BBI, MAA, CCU, DEL, JAI, TRV.</w:t>
       </w:r>
     </w:p>
-    <w:bookmarkStart w:id="49" w:name="headline-1"/>
+    <w:bookmarkStart w:id="55" w:name="headline-1"/>
     <w:p>
       <w:pPr>
         <w:pStyle w:val="Heading4"/>
@@ -12119,8 +12253,8 @@
         </w:tc>
       </w:tr>
     </w:tbl>
-    <w:bookmarkEnd w:id="49"/>
-    <w:bookmarkStart w:id="50" w:name="X4a44603c4574575e135ae07ae6b4b732ccfec61"/>
+    <w:bookmarkEnd w:id="55"/>
+    <w:bookmarkStart w:id="56" w:name="X4a44603c4574575e135ae07ae6b4b732ccfec61"/>
     <w:p>
       <w:pPr>
         <w:pStyle w:val="Heading4"/>
@@ -13421,8 +13555,8 @@
         </w:tc>
       </w:tr>
     </w:tbl>
-    <w:bookmarkEnd w:id="50"/>
-    <w:bookmarkStart w:id="51" w:name="Xf5c6d7a243e552f549087d99e1b1c7a6218f388"/>
+    <w:bookmarkEnd w:id="56"/>
+    <w:bookmarkStart w:id="57" w:name="Xf5c6d7a243e552f549087d99e1b1c7a6218f388"/>
     <w:p>
       <w:pPr>
         <w:pStyle w:val="Heading4"/>
@@ -13778,8 +13912,8 @@
         </w:tc>
       </w:tr>
     </w:tbl>
-    <w:bookmarkEnd w:id="51"/>
-    <w:bookmarkStart w:id="52" w:name="X175b38842166f8fb23fd9b723f562b8e40b74c1"/>
+    <w:bookmarkEnd w:id="57"/>
+    <w:bookmarkStart w:id="58" w:name="X175b38842166f8fb23fd9b723f562b8e40b74c1"/>
     <w:p>
       <w:pPr>
         <w:pStyle w:val="Heading4"/>
@@ -14132,8 +14266,8 @@
         </w:tc>
       </w:tr>
     </w:tbl>
-    <w:bookmarkEnd w:id="52"/>
-    <w:bookmarkStart w:id="53" w:name="false-alarms-on-clean-real-data-1"/>
+    <w:bookmarkEnd w:id="58"/>
+    <w:bookmarkStart w:id="59" w:name="false-alarms-on-clean-real-data-1"/>
     <w:p>
       <w:pPr>
         <w:pStyle w:val="Heading4"/>
@@ -14966,8 +15100,8 @@
         </w:tc>
       </w:tr>
     </w:tbl>
-    <w:bookmarkEnd w:id="53"/>
-    <w:bookmarkStart w:id="54" w:name="real-extreme-weather-nothing-injected-1"/>
+    <w:bookmarkEnd w:id="59"/>
+    <w:bookmarkStart w:id="60" w:name="real-extreme-weather-nothing-injected-1"/>
     <w:p>
       <w:pPr>
         <w:pStyle w:val="Heading4"/>
@@ -16322,8 +16456,8 @@
         </w:tc>
       </w:tr>
     </w:tbl>
-    <w:bookmarkEnd w:id="54"/>
-    <w:bookmarkStart w:id="55" w:name="agreement-with-noaas-own-quality-flags-1"/>
+    <w:bookmarkEnd w:id="60"/>
+    <w:bookmarkStart w:id="61" w:name="agreement-with-noaas-own-quality-flags-1"/>
     <w:p>
       <w:pPr>
         <w:pStyle w:val="Heading4"/>
@@ -16570,8 +16704,8 @@
         </w:tc>
       </w:tr>
     </w:tbl>
-    <w:bookmarkEnd w:id="55"/>
-    <w:bookmarkStart w:id="56" w:name="Xbda1c1c13c23a2302f7fe13e7f763dae028c789"/>
+    <w:bookmarkEnd w:id="61"/>
+    <w:bookmarkStart w:id="62" w:name="Xbda1c1c13c23a2302f7fe13e7f763dae028c789"/>
     <w:p>
       <w:pPr>
         <w:pStyle w:val="Heading4"/>
@@ -16881,8 +17015,8 @@
         </w:tc>
       </w:tr>
     </w:tbl>
-    <w:bookmarkEnd w:id="56"/>
-    <w:bookmarkStart w:id="57" w:name="by-station-full-pipeline-1"/>
+    <w:bookmarkEnd w:id="62"/>
+    <w:bookmarkStart w:id="63" w:name="by-station-full-pipeline-1"/>
     <w:p>
       <w:pPr>
         <w:pStyle w:val="Heading4"/>
@@ -17550,8 +17684,8 @@
         </w:tc>
       </w:tr>
     </w:tbl>
-    <w:bookmarkEnd w:id="57"/>
-    <w:bookmarkStart w:id="58" w:name="X8ff48fcb40bc85761e94abfe25e3d1b65ecf4ae"/>
+    <w:bookmarkEnd w:id="63"/>
+    <w:bookmarkStart w:id="64" w:name="X8ff48fcb40bc85761e94abfe25e3d1b65ecf4ae"/>
     <w:p>
       <w:pPr>
         <w:pStyle w:val="Heading4"/>
@@ -18852,8 +18986,8 @@
         </w:tc>
       </w:tr>
     </w:tbl>
-    <w:bookmarkEnd w:id="58"/>
-    <w:bookmarkStart w:id="59" w:name="X3ac58ffd56e72788bf95fdc6b032ab350013d06"/>
+    <w:bookmarkEnd w:id="64"/>
+    <w:bookmarkStart w:id="65" w:name="X3ac58ffd56e72788bf95fdc6b032ab350013d06"/>
     <w:p>
       <w:pPr>
         <w:pStyle w:val="Heading4"/>
@@ -19209,9 +19343,9 @@
         </w:tc>
       </w:tr>
     </w:tbl>
-    <w:bookmarkEnd w:id="59"/>
-    <w:bookmarkEnd w:id="60"/>
-    <w:bookmarkStart w:id="72" w:name="Xa6cb5755987898943d9c52e72fbaae80d6f556c"/>
+    <w:bookmarkEnd w:id="65"/>
+    <w:bookmarkEnd w:id="66"/>
+    <w:bookmarkStart w:id="78" w:name="Xa6cb5755987898943d9c52e72fbaae80d6f556c"/>
     <w:p>
       <w:pPr>
         <w:pStyle w:val="Heading3"/>
@@ -19238,7 +19372,7 @@
         <w:t xml:space="preserve">Stations: AMD, NAG, BOM, GAU, VTZ, IXZ, BHJ, COK.</w:t>
       </w:r>
     </w:p>
-    <w:bookmarkStart w:id="61" w:name="headline-2"/>
+    <w:bookmarkStart w:id="67" w:name="headline-2"/>
     <w:p>
       <w:pPr>
         <w:pStyle w:val="Heading4"/>
@@ -19414,8 +19548,8 @@
         </w:tc>
       </w:tr>
     </w:tbl>
-    <w:bookmarkEnd w:id="61"/>
-    <w:bookmarkStart w:id="62" w:name="Xce66e0e25ca0ed48937680b7e1ed58616e4da36"/>
+    <w:bookmarkEnd w:id="67"/>
+    <w:bookmarkStart w:id="68" w:name="Xce66e0e25ca0ed48937680b7e1ed58616e4da36"/>
     <w:p>
       <w:pPr>
         <w:pStyle w:val="Heading4"/>
@@ -20716,8 +20850,8 @@
         </w:tc>
       </w:tr>
     </w:tbl>
-    <w:bookmarkEnd w:id="62"/>
-    <w:bookmarkStart w:id="63" w:name="X9c29aef23fd8fb11a100ea4601528c9bf4ab126"/>
+    <w:bookmarkEnd w:id="68"/>
+    <w:bookmarkStart w:id="69" w:name="X9c29aef23fd8fb11a100ea4601528c9bf4ab126"/>
     <w:p>
       <w:pPr>
         <w:pStyle w:val="Heading4"/>
@@ -21073,8 +21207,8 @@
         </w:tc>
       </w:tr>
     </w:tbl>
-    <w:bookmarkEnd w:id="63"/>
-    <w:bookmarkStart w:id="64" w:name="Xcf9112c48ed5a47ffee17975b89c442556bc9e9"/>
+    <w:bookmarkEnd w:id="69"/>
+    <w:bookmarkStart w:id="70" w:name="Xcf9112c48ed5a47ffee17975b89c442556bc9e9"/>
     <w:p>
       <w:pPr>
         <w:pStyle w:val="Heading4"/>
@@ -21427,8 +21561,8 @@
         </w:tc>
       </w:tr>
     </w:tbl>
-    <w:bookmarkEnd w:id="64"/>
-    <w:bookmarkStart w:id="65" w:name="false-alarms-on-clean-real-data-2"/>
+    <w:bookmarkEnd w:id="70"/>
+    <w:bookmarkStart w:id="71" w:name="false-alarms-on-clean-real-data-2"/>
     <w:p>
       <w:pPr>
         <w:pStyle w:val="Heading4"/>
@@ -22261,8 +22395,8 @@
         </w:tc>
       </w:tr>
     </w:tbl>
-    <w:bookmarkEnd w:id="65"/>
-    <w:bookmarkStart w:id="66" w:name="real-extreme-weather-nothing-injected-2"/>
+    <w:bookmarkEnd w:id="71"/>
+    <w:bookmarkStart w:id="72" w:name="real-extreme-weather-nothing-injected-2"/>
     <w:p>
       <w:pPr>
         <w:pStyle w:val="Heading4"/>
@@ -23617,8 +23751,8 @@
         </w:tc>
       </w:tr>
     </w:tbl>
-    <w:bookmarkEnd w:id="66"/>
-    <w:bookmarkStart w:id="67" w:name="agreement-with-noaas-own-quality-flags-2"/>
+    <w:bookmarkEnd w:id="72"/>
+    <w:bookmarkStart w:id="73" w:name="agreement-with-noaas-own-quality-flags-2"/>
     <w:p>
       <w:pPr>
         <w:pStyle w:val="Heading4"/>
@@ -23865,8 +23999,8 @@
         </w:tc>
       </w:tr>
     </w:tbl>
-    <w:bookmarkEnd w:id="67"/>
-    <w:bookmarkStart w:id="68" w:name="Xc140d0fc5ba23963b1b62685c28e9c1dc559391"/>
+    <w:bookmarkEnd w:id="73"/>
+    <w:bookmarkStart w:id="74" w:name="Xc140d0fc5ba23963b1b62685c28e9c1dc559391"/>
     <w:p>
       <w:pPr>
         <w:pStyle w:val="Heading4"/>
@@ -24176,8 +24310,8 @@
         </w:tc>
       </w:tr>
     </w:tbl>
-    <w:bookmarkEnd w:id="68"/>
-    <w:bookmarkStart w:id="69" w:name="by-station-full-pipeline-2"/>
+    <w:bookmarkEnd w:id="74"/>
+    <w:bookmarkStart w:id="75" w:name="by-station-full-pipeline-2"/>
     <w:p>
       <w:pPr>
         <w:pStyle w:val="Heading4"/>
@@ -25025,8 +25159,8 @@
         </w:tc>
       </w:tr>
     </w:tbl>
-    <w:bookmarkEnd w:id="69"/>
-    <w:bookmarkStart w:id="70" w:name="X8a9c73a32b906b5121a43f5b4e2035d34b74745"/>
+    <w:bookmarkEnd w:id="75"/>
+    <w:bookmarkStart w:id="76" w:name="X8a9c73a32b906b5121a43f5b4e2035d34b74745"/>
     <w:p>
       <w:pPr>
         <w:pStyle w:val="Heading4"/>
@@ -26327,8 +26461,8 @@
         </w:tc>
       </w:tr>
     </w:tbl>
-    <w:bookmarkEnd w:id="70"/>
-    <w:bookmarkStart w:id="71" w:name="X2199c03e75102d2c2827df1255da01870ca81c9"/>
+    <w:bookmarkEnd w:id="76"/>
+    <w:bookmarkStart w:id="77" w:name="X2199c03e75102d2c2827df1255da01870ca81c9"/>
     <w:p>
       <w:pPr>
         <w:pStyle w:val="Heading4"/>
@@ -26684,9 +26818,9 @@
         </w:tc>
       </w:tr>
     </w:tbl>
-    <w:bookmarkEnd w:id="71"/>
-    <w:bookmarkEnd w:id="72"/>
-    <w:bookmarkStart w:id="85" w:name="X23786217689c3c04504c90a2bc97e775d6aa1eb"/>
+    <w:bookmarkEnd w:id="77"/>
+    <w:bookmarkEnd w:id="78"/>
+    <w:bookmarkStart w:id="91" w:name="X23786217689c3c04504c90a2bc97e775d6aa1eb"/>
     <w:p>
       <w:pPr>
         <w:pStyle w:val="Heading3"/>
@@ -26713,7 +26847,7 @@
         <w:t xml:space="preserve">Stations: LKO, PAT, IDR, IXR, CJB, IXE, TRZ, ATQ, PNQ, GOI, RPR, JDH.</w:t>
       </w:r>
     </w:p>
-    <w:bookmarkStart w:id="73" w:name="headline-3"/>
+    <w:bookmarkStart w:id="79" w:name="headline-3"/>
     <w:p>
       <w:pPr>
         <w:pStyle w:val="Heading4"/>
@@ -26889,8 +27023,8 @@
         </w:tc>
       </w:tr>
     </w:tbl>
-    <w:bookmarkEnd w:id="73"/>
-    <w:bookmarkStart w:id="74" w:name="Xf8210696564d383b7c87317f98625900aa68e32"/>
+    <w:bookmarkEnd w:id="79"/>
+    <w:bookmarkStart w:id="80" w:name="Xf8210696564d383b7c87317f98625900aa68e32"/>
     <w:p>
       <w:pPr>
         <w:pStyle w:val="Heading4"/>
@@ -28428,8 +28562,8 @@
         </w:tc>
       </w:tr>
     </w:tbl>
-    <w:bookmarkEnd w:id="74"/>
-    <w:bookmarkStart w:id="75" w:name="Xf3f280c1a2051e520ee55bbe4935d82e0d9216a"/>
+    <w:bookmarkEnd w:id="80"/>
+    <w:bookmarkStart w:id="81" w:name="Xf3f280c1a2051e520ee55bbe4935d82e0d9216a"/>
     <w:p>
       <w:pPr>
         <w:pStyle w:val="Heading4"/>
@@ -28785,8 +28919,8 @@
         </w:tc>
       </w:tr>
     </w:tbl>
-    <w:bookmarkEnd w:id="75"/>
-    <w:bookmarkStart w:id="76" w:name="X0db5a328b35af171e875faa74265d1757132203"/>
+    <w:bookmarkEnd w:id="81"/>
+    <w:bookmarkStart w:id="82" w:name="X0db5a328b35af171e875faa74265d1757132203"/>
     <w:p>
       <w:pPr>
         <w:pStyle w:val="Heading4"/>
@@ -29139,8 +29273,8 @@
         </w:tc>
       </w:tr>
     </w:tbl>
-    <w:bookmarkEnd w:id="76"/>
-    <w:bookmarkStart w:id="77" w:name="X5b62a31e8638b95864bf6330e3069935f181e9b"/>
+    <w:bookmarkEnd w:id="82"/>
+    <w:bookmarkStart w:id="83" w:name="X5b62a31e8638b95864bf6330e3069935f181e9b"/>
     <w:p>
       <w:pPr>
         <w:pStyle w:val="Heading4"/>
@@ -29598,8 +29732,8 @@
         </w:tc>
       </w:tr>
     </w:tbl>
-    <w:bookmarkEnd w:id="77"/>
-    <w:bookmarkStart w:id="78" w:name="false-alarms-on-clean-real-data-3"/>
+    <w:bookmarkEnd w:id="83"/>
+    <w:bookmarkStart w:id="84" w:name="false-alarms-on-clean-real-data-3"/>
     <w:p>
       <w:pPr>
         <w:pStyle w:val="Heading4"/>
@@ -30603,8 +30737,8 @@
         </w:tc>
       </w:tr>
     </w:tbl>
-    <w:bookmarkEnd w:id="78"/>
-    <w:bookmarkStart w:id="79" w:name="real-extreme-weather-nothing-injected-3"/>
+    <w:bookmarkEnd w:id="84"/>
+    <w:bookmarkStart w:id="85" w:name="real-extreme-weather-nothing-injected-3"/>
     <w:p>
       <w:pPr>
         <w:pStyle w:val="Heading4"/>
@@ -32163,8 +32297,8 @@
         </w:tc>
       </w:tr>
     </w:tbl>
-    <w:bookmarkEnd w:id="79"/>
-    <w:bookmarkStart w:id="80" w:name="agreement-with-noaas-own-quality-flags-3"/>
+    <w:bookmarkEnd w:id="85"/>
+    <w:bookmarkStart w:id="86" w:name="agreement-with-noaas-own-quality-flags-3"/>
     <w:p>
       <w:pPr>
         <w:pStyle w:val="Heading4"/>
@@ -32411,8 +32545,8 @@
         </w:tc>
       </w:tr>
     </w:tbl>
-    <w:bookmarkEnd w:id="80"/>
-    <w:bookmarkStart w:id="81" w:name="X7b012ae44e0f78d828116ee038442886c4436f5"/>
+    <w:bookmarkEnd w:id="86"/>
+    <w:bookmarkStart w:id="87" w:name="X7b012ae44e0f78d828116ee038442886c4436f5"/>
     <w:p>
       <w:pPr>
         <w:pStyle w:val="Heading4"/>
@@ -32722,8 +32856,8 @@
         </w:tc>
       </w:tr>
     </w:tbl>
-    <w:bookmarkEnd w:id="81"/>
-    <w:bookmarkStart w:id="82" w:name="by-station-full-pipeline-3"/>
+    <w:bookmarkEnd w:id="87"/>
+    <w:bookmarkStart w:id="88" w:name="by-station-full-pipeline-3"/>
     <w:p>
       <w:pPr>
         <w:pStyle w:val="Heading4"/>
@@ -33931,8 +34065,8 @@
         </w:tc>
       </w:tr>
     </w:tbl>
-    <w:bookmarkEnd w:id="82"/>
-    <w:bookmarkStart w:id="83" w:name="X5097ea49b048c0b711f8c9de1b26b1f26918990"/>
+    <w:bookmarkEnd w:id="88"/>
+    <w:bookmarkStart w:id="89" w:name="X5097ea49b048c0b711f8c9de1b26b1f26918990"/>
     <w:p>
       <w:pPr>
         <w:pStyle w:val="Heading4"/>
@@ -35470,8 +35604,8 @@
         </w:tc>
       </w:tr>
     </w:tbl>
-    <w:bookmarkEnd w:id="83"/>
-    <w:bookmarkStart w:id="84" w:name="Xbdd52fe2d046f63e5a9d103a14e86c41ce32ada"/>
+    <w:bookmarkEnd w:id="89"/>
+    <w:bookmarkStart w:id="90" w:name="Xbdd52fe2d046f63e5a9d103a14e86c41ce32ada"/>
     <w:p>
       <w:pPr>
         <w:pStyle w:val="Heading4"/>
@@ -35965,9 +36099,9 @@
         </w:tc>
       </w:tr>
     </w:tbl>
-    <w:bookmarkEnd w:id="84"/>
-    <w:bookmarkEnd w:id="85"/>
-    <w:bookmarkStart w:id="86" w:name="scale-and-speed"/>
+    <w:bookmarkEnd w:id="90"/>
+    <w:bookmarkEnd w:id="91"/>
+    <w:bookmarkStart w:id="92" w:name="scale-and-speed"/>
     <w:p>
       <w:pPr>
         <w:pStyle w:val="Heading3"/>
@@ -36612,8 +36746,8 @@
         <w:t xml:space="preserve">Real HTTP server (FastAPI + SQLite), 50 stations, 8 concurrent clients: 164.8 requests/s, median 44.89 ms, p95 59.17 ms, p99 66.33 ms, errors 0.</w:t>
       </w:r>
     </w:p>
-    <w:bookmarkEnd w:id="86"/>
-    <w:bookmarkStart w:id="87" w:name="how-big-must-a-fault-be-dev-injected"/>
+    <w:bookmarkEnd w:id="92"/>
+    <w:bookmarkStart w:id="93" w:name="how-big-must-a-fault-be-dev-injected"/>
     <w:p>
       <w:pPr>
         <w:pStyle w:val="Heading3"/>
@@ -37560,8 +37694,8 @@
         </w:tc>
       </w:tr>
     </w:tbl>
-    <w:bookmarkEnd w:id="87"/>
-    <w:bookmarkStart w:id="88" w:name="a-new-station-on-day-one-cold-start"/>
+    <w:bookmarkEnd w:id="93"/>
+    <w:bookmarkStart w:id="94" w:name="a-new-station-on-day-one-cold-start"/>
     <w:p>
       <w:pPr>
         <w:pStyle w:val="Heading3"/>
@@ -38104,9 +38238,555 @@
         <w:t xml:space="preserve">projects the running time first).</w:t>
       </w:r>
     </w:p>
-    <w:bookmarkEnd w:id="88"/>
-    <w:bookmarkEnd w:id="89"/>
-    <w:bookmarkStart w:id="94" w:name="X2044a3e36d2d5b2a8916663a95641182c65a810"/>
+    <w:bookmarkEnd w:id="94"/>
+    <w:bookmarkStart w:id="119" w:name="figures"/>
+    <w:p>
+      <w:pPr>
+        <w:pStyle w:val="Heading3"/>
+      </w:pPr>
+      <w:r>
+        <w:t xml:space="preserve">4.8 Figures</w:t>
+      </w:r>
+    </w:p>
+    <w:p>
+      <w:pPr>
+        <w:pStyle w:val="CaptionedFigure"/>
+      </w:pPr>
+      <w:r>
+        <w:drawing>
+          <wp:inline>
+            <wp:extent cx="5334000" cy="5257800"/>
+            <wp:effectExtent b="0" l="0" r="0" t="0"/>
+            <wp:docPr descr="Figure 3. The same real data and the same three numbers for AtmosGuard and simpler systems, in every split (lower is better in the first two columns, higher in the third)." title="" id="96" name="Picture"/>
+            <a:graphic>
+              <a:graphicData uri="http://schemas.openxmlformats.org/drawingml/2006/picture">
+                <pic:pic>
+                  <pic:nvPicPr>
+                    <pic:cNvPr descr="figures/fig_baselines.png" id="97" name="Picture"/>
+                    <pic:cNvPicPr>
+                      <a:picLocks noChangeArrowheads="1" noChangeAspect="1"/>
+                    </pic:cNvPicPr>
+                  </pic:nvPicPr>
+                  <pic:blipFill>
+                    <a:blip r:embed="rId95"/>
+                    <a:stretch>
+                      <a:fillRect/>
+                    </a:stretch>
+                  </pic:blipFill>
+                  <pic:spPr bwMode="auto">
+                    <a:xfrm>
+                      <a:off x="0" y="0"/>
+                      <a:ext cx="5334000" cy="5257800"/>
+                    </a:xfrm>
+                    <a:prstGeom prst="rect">
+                      <a:avLst/>
+                    </a:prstGeom>
+                    <a:noFill/>
+                    <a:ln w="9525">
+                      <a:noFill/>
+                      <a:headEnd/>
+                      <a:tailEnd/>
+                    </a:ln>
+                  </pic:spPr>
+                </pic:pic>
+              </a:graphicData>
+            </a:graphic>
+          </wp:inline>
+        </w:drawing>
+      </w:r>
+    </w:p>
+    <w:p>
+      <w:pPr>
+        <w:pStyle w:val="ImageCaption"/>
+      </w:pPr>
+      <w:r>
+        <w:t xml:space="preserve">Figure 3. The same real data and the same three numbers for AtmosGuard and simpler systems, in every split (lower is better in the first two columns, higher in the third).</w:t>
+      </w:r>
+    </w:p>
+    <w:p>
+      <w:pPr>
+        <w:pStyle w:val="BodyText"/>
+      </w:pPr>
+      <w:r>
+        <w:rPr>
+          <w:i/>
+          <w:iCs/>
+        </w:rPr>
+        <w:t xml:space="preserve">Figure 3. The same real data and the same three numbers for AtmosGuard and simpler systems, in every split (lower is better in the first two columns, higher in the third).</w:t>
+      </w:r>
+    </w:p>
+    <w:p>
+      <w:pPr>
+        <w:pStyle w:val="CaptionedFigure"/>
+      </w:pPr>
+      <w:r>
+        <w:drawing>
+          <wp:inline>
+            <wp:extent cx="5334000" cy="2044700"/>
+            <wp:effectExtent b="0" l="0" r="0" t="0"/>
+            <wp:docPr descr="Figure 4. Ablation on DEV: what each layer is worth (bars) and what it costs in false alarms on clean real data (top)." title="" id="99" name="Picture"/>
+            <a:graphic>
+              <a:graphicData uri="http://schemas.openxmlformats.org/drawingml/2006/picture">
+                <pic:pic>
+                  <pic:nvPicPr>
+                    <pic:cNvPr descr="figures/fig_ablation.png" id="100" name="Picture"/>
+                    <pic:cNvPicPr>
+                      <a:picLocks noChangeArrowheads="1" noChangeAspect="1"/>
+                    </pic:cNvPicPr>
+                  </pic:nvPicPr>
+                  <pic:blipFill>
+                    <a:blip r:embed="rId98"/>
+                    <a:stretch>
+                      <a:fillRect/>
+                    </a:stretch>
+                  </pic:blipFill>
+                  <pic:spPr bwMode="auto">
+                    <a:xfrm>
+                      <a:off x="0" y="0"/>
+                      <a:ext cx="5334000" cy="2044700"/>
+                    </a:xfrm>
+                    <a:prstGeom prst="rect">
+                      <a:avLst/>
+                    </a:prstGeom>
+                    <a:noFill/>
+                    <a:ln w="9525">
+                      <a:noFill/>
+                      <a:headEnd/>
+                      <a:tailEnd/>
+                    </a:ln>
+                  </pic:spPr>
+                </pic:pic>
+              </a:graphicData>
+            </a:graphic>
+          </wp:inline>
+        </w:drawing>
+      </w:r>
+    </w:p>
+    <w:p>
+      <w:pPr>
+        <w:pStyle w:val="ImageCaption"/>
+      </w:pPr>
+      <w:r>
+        <w:t xml:space="preserve">Figure 4. Ablation on DEV: what each layer is worth (bars) and what it costs in false alarms on clean real data (top).</w:t>
+      </w:r>
+    </w:p>
+    <w:p>
+      <w:pPr>
+        <w:pStyle w:val="BodyText"/>
+      </w:pPr>
+      <w:r>
+        <w:rPr>
+          <w:i/>
+          <w:iCs/>
+        </w:rPr>
+        <w:t xml:space="preserve">Figure 4. Ablation on DEV: what each layer is worth (bars) and what it costs in false alarms on clean real data (top).</w:t>
+      </w:r>
+    </w:p>
+    <w:p>
+      <w:pPr>
+        <w:pStyle w:val="CaptionedFigure"/>
+      </w:pPr>
+      <w:r>
+        <w:drawing>
+          <wp:inline>
+            <wp:extent cx="5334000" cy="3528646"/>
+            <wp:effectExtent b="0" l="0" r="0" t="0"/>
+            <wp:docPr descr="Figure 5. Three real cyclones with nothing injected: the pressure crash is escalated as weather, never called a fault." title="" id="102" name="Picture"/>
+            <a:graphic>
+              <a:graphicData uri="http://schemas.openxmlformats.org/drawingml/2006/picture">
+                <pic:pic>
+                  <pic:nvPicPr>
+                    <pic:cNvPr descr="figures/fig_real_cyclones.png" id="103" name="Picture"/>
+                    <pic:cNvPicPr>
+                      <a:picLocks noChangeArrowheads="1" noChangeAspect="1"/>
+                    </pic:cNvPicPr>
+                  </pic:nvPicPr>
+                  <pic:blipFill>
+                    <a:blip r:embed="rId101"/>
+                    <a:stretch>
+                      <a:fillRect/>
+                    </a:stretch>
+                  </pic:blipFill>
+                  <pic:spPr bwMode="auto">
+                    <a:xfrm>
+                      <a:off x="0" y="0"/>
+                      <a:ext cx="5334000" cy="3528646"/>
+                    </a:xfrm>
+                    <a:prstGeom prst="rect">
+                      <a:avLst/>
+                    </a:prstGeom>
+                    <a:noFill/>
+                    <a:ln w="9525">
+                      <a:noFill/>
+                      <a:headEnd/>
+                      <a:tailEnd/>
+                    </a:ln>
+                  </pic:spPr>
+                </pic:pic>
+              </a:graphicData>
+            </a:graphic>
+          </wp:inline>
+        </w:drawing>
+      </w:r>
+    </w:p>
+    <w:p>
+      <w:pPr>
+        <w:pStyle w:val="ImageCaption"/>
+      </w:pPr>
+      <w:r>
+        <w:t xml:space="preserve">Figure 5. Three real cyclones with nothing injected: the pressure crash is escalated as weather, never called a fault.</w:t>
+      </w:r>
+    </w:p>
+    <w:p>
+      <w:pPr>
+        <w:pStyle w:val="BodyText"/>
+      </w:pPr>
+      <w:r>
+        <w:rPr>
+          <w:i/>
+          <w:iCs/>
+        </w:rPr>
+        <w:t xml:space="preserve">Figure 5. Three real cyclones with nothing injected: the pressure crash is escalated as weather, never called a fault.</w:t>
+      </w:r>
+    </w:p>
+    <w:p>
+      <w:pPr>
+        <w:pStyle w:val="CaptionedFigure"/>
+      </w:pPr>
+      <w:r>
+        <w:drawing>
+          <wp:inline>
+            <wp:extent cx="5334000" cy="1887415"/>
+            <wp:effectExtent b="0" l="0" r="0" t="0"/>
+            <wp:docPr descr="Figure 6. The fresh stations: what the two remedies from the holdout post-mortem do (registered decision rule, Section 2.7)." title="" id="105" name="Picture"/>
+            <a:graphic>
+              <a:graphicData uri="http://schemas.openxmlformats.org/drawingml/2006/picture">
+                <pic:pic>
+                  <pic:nvPicPr>
+                    <pic:cNvPr descr="figures/fig_remedies.png" id="106" name="Picture"/>
+                    <pic:cNvPicPr>
+                      <a:picLocks noChangeArrowheads="1" noChangeAspect="1"/>
+                    </pic:cNvPicPr>
+                  </pic:nvPicPr>
+                  <pic:blipFill>
+                    <a:blip r:embed="rId104"/>
+                    <a:stretch>
+                      <a:fillRect/>
+                    </a:stretch>
+                  </pic:blipFill>
+                  <pic:spPr bwMode="auto">
+                    <a:xfrm>
+                      <a:off x="0" y="0"/>
+                      <a:ext cx="5334000" cy="1887415"/>
+                    </a:xfrm>
+                    <a:prstGeom prst="rect">
+                      <a:avLst/>
+                    </a:prstGeom>
+                    <a:noFill/>
+                    <a:ln w="9525">
+                      <a:noFill/>
+                      <a:headEnd/>
+                      <a:tailEnd/>
+                    </a:ln>
+                  </pic:spPr>
+                </pic:pic>
+              </a:graphicData>
+            </a:graphic>
+          </wp:inline>
+        </w:drawing>
+      </w:r>
+    </w:p>
+    <w:p>
+      <w:pPr>
+        <w:pStyle w:val="ImageCaption"/>
+      </w:pPr>
+      <w:r>
+        <w:t xml:space="preserve">Figure 6. The fresh stations: what the two remedies from the holdout post-mortem do (registered decision rule, Section 2.7).</w:t>
+      </w:r>
+    </w:p>
+    <w:p>
+      <w:pPr>
+        <w:pStyle w:val="BodyText"/>
+      </w:pPr>
+      <w:r>
+        <w:rPr>
+          <w:i/>
+          <w:iCs/>
+        </w:rPr>
+        <w:t xml:space="preserve">Figure 6. The fresh stations: what the two remedies from the holdout post-mortem do (registered decision rule, Section 2.7).</w:t>
+      </w:r>
+    </w:p>
+    <w:p>
+      <w:pPr>
+        <w:pStyle w:val="CaptionedFigure"/>
+      </w:pPr>
+      <w:r>
+        <w:drawing>
+          <wp:inline>
+            <wp:extent cx="5334000" cy="1723292"/>
+            <wp:effectExtent b="0" l="0" r="0" t="0"/>
+            <wp:docPr descr="Figure 7. How big must a fault be? Detection against fault size on the DEV stations (injected faults, tuning set)." title="" id="108" name="Picture"/>
+            <a:graphic>
+              <a:graphicData uri="http://schemas.openxmlformats.org/drawingml/2006/picture">
+                <pic:pic>
+                  <pic:nvPicPr>
+                    <pic:cNvPr descr="figures/fig_detectability.png" id="109" name="Picture"/>
+                    <pic:cNvPicPr>
+                      <a:picLocks noChangeArrowheads="1" noChangeAspect="1"/>
+                    </pic:cNvPicPr>
+                  </pic:nvPicPr>
+                  <pic:blipFill>
+                    <a:blip r:embed="rId107"/>
+                    <a:stretch>
+                      <a:fillRect/>
+                    </a:stretch>
+                  </pic:blipFill>
+                  <pic:spPr bwMode="auto">
+                    <a:xfrm>
+                      <a:off x="0" y="0"/>
+                      <a:ext cx="5334000" cy="1723292"/>
+                    </a:xfrm>
+                    <a:prstGeom prst="rect">
+                      <a:avLst/>
+                    </a:prstGeom>
+                    <a:noFill/>
+                    <a:ln w="9525">
+                      <a:noFill/>
+                      <a:headEnd/>
+                      <a:tailEnd/>
+                    </a:ln>
+                  </pic:spPr>
+                </pic:pic>
+              </a:graphicData>
+            </a:graphic>
+          </wp:inline>
+        </w:drawing>
+      </w:r>
+    </w:p>
+    <w:p>
+      <w:pPr>
+        <w:pStyle w:val="ImageCaption"/>
+      </w:pPr>
+      <w:r>
+        <w:t xml:space="preserve">Figure 7. How big must a fault be? Detection against fault size on the DEV stations (injected faults, tuning set).</w:t>
+      </w:r>
+    </w:p>
+    <w:p>
+      <w:pPr>
+        <w:pStyle w:val="BodyText"/>
+      </w:pPr>
+      <w:r>
+        <w:rPr>
+          <w:i/>
+          <w:iCs/>
+        </w:rPr>
+        <w:t xml:space="preserve">Figure 7. How big must a fault be? Detection against fault size on the DEV stations (injected faults, tuning set).</w:t>
+      </w:r>
+    </w:p>
+    <w:p>
+      <w:pPr>
+        <w:pStyle w:val="CaptionedFigure"/>
+      </w:pPr>
+      <w:r>
+        <w:drawing>
+          <wp:inline>
+            <wp:extent cx="5334000" cy="2036618"/>
+            <wp:effectExtent b="0" l="0" r="0" t="0"/>
+            <wp:docPr descr="Figure 8. A new station on day one: with a starter from the nearest other station, and with its own data only." title="" id="111" name="Picture"/>
+            <a:graphic>
+              <a:graphicData uri="http://schemas.openxmlformats.org/drawingml/2006/picture">
+                <pic:pic>
+                  <pic:nvPicPr>
+                    <pic:cNvPr descr="figures/fig_coldstart.png" id="112" name="Picture"/>
+                    <pic:cNvPicPr>
+                      <a:picLocks noChangeArrowheads="1" noChangeAspect="1"/>
+                    </pic:cNvPicPr>
+                  </pic:nvPicPr>
+                  <pic:blipFill>
+                    <a:blip r:embed="rId110"/>
+                    <a:stretch>
+                      <a:fillRect/>
+                    </a:stretch>
+                  </pic:blipFill>
+                  <pic:spPr bwMode="auto">
+                    <a:xfrm>
+                      <a:off x="0" y="0"/>
+                      <a:ext cx="5334000" cy="2036618"/>
+                    </a:xfrm>
+                    <a:prstGeom prst="rect">
+                      <a:avLst/>
+                    </a:prstGeom>
+                    <a:noFill/>
+                    <a:ln w="9525">
+                      <a:noFill/>
+                      <a:headEnd/>
+                      <a:tailEnd/>
+                    </a:ln>
+                  </pic:spPr>
+                </pic:pic>
+              </a:graphicData>
+            </a:graphic>
+          </wp:inline>
+        </w:drawing>
+      </w:r>
+    </w:p>
+    <w:p>
+      <w:pPr>
+        <w:pStyle w:val="ImageCaption"/>
+      </w:pPr>
+      <w:r>
+        <w:t xml:space="preserve">Figure 8. A new station on day one: with a starter from the nearest other station, and with its own data only.</w:t>
+      </w:r>
+    </w:p>
+    <w:p>
+      <w:pPr>
+        <w:pStyle w:val="BodyText"/>
+      </w:pPr>
+      <w:r>
+        <w:rPr>
+          <w:i/>
+          <w:iCs/>
+        </w:rPr>
+        <w:t xml:space="preserve">Figure 8. A new station on day one: with a starter from the nearest other station, and with its own data only.</w:t>
+      </w:r>
+    </w:p>
+    <w:p>
+      <w:pPr>
+        <w:pStyle w:val="CaptionedFigure"/>
+      </w:pPr>
+      <w:r>
+        <w:drawing>
+          <wp:inline>
+            <wp:extent cx="5334000" cy="2987039"/>
+            <wp:effectExtent b="0" l="0" r="0" t="0"/>
+            <wp:docPr descr="Figure 9. Per-reading cost against the number of stations (state is per station)." title="" id="114" name="Picture"/>
+            <a:graphic>
+              <a:graphicData uri="http://schemas.openxmlformats.org/drawingml/2006/picture">
+                <pic:pic>
+                  <pic:nvPicPr>
+                    <pic:cNvPr descr="figures/fig_scale.png" id="115" name="Picture"/>
+                    <pic:cNvPicPr>
+                      <a:picLocks noChangeArrowheads="1" noChangeAspect="1"/>
+                    </pic:cNvPicPr>
+                  </pic:nvPicPr>
+                  <pic:blipFill>
+                    <a:blip r:embed="rId113"/>
+                    <a:stretch>
+                      <a:fillRect/>
+                    </a:stretch>
+                  </pic:blipFill>
+                  <pic:spPr bwMode="auto">
+                    <a:xfrm>
+                      <a:off x="0" y="0"/>
+                      <a:ext cx="5334000" cy="2987039"/>
+                    </a:xfrm>
+                    <a:prstGeom prst="rect">
+                      <a:avLst/>
+                    </a:prstGeom>
+                    <a:noFill/>
+                    <a:ln w="9525">
+                      <a:noFill/>
+                      <a:headEnd/>
+                      <a:tailEnd/>
+                    </a:ln>
+                  </pic:spPr>
+                </pic:pic>
+              </a:graphicData>
+            </a:graphic>
+          </wp:inline>
+        </w:drawing>
+      </w:r>
+    </w:p>
+    <w:p>
+      <w:pPr>
+        <w:pStyle w:val="ImageCaption"/>
+      </w:pPr>
+      <w:r>
+        <w:t xml:space="preserve">Figure 9. Per-reading cost against the number of stations (state is per station).</w:t>
+      </w:r>
+    </w:p>
+    <w:p>
+      <w:pPr>
+        <w:pStyle w:val="BodyText"/>
+      </w:pPr>
+      <w:r>
+        <w:rPr>
+          <w:i/>
+          <w:iCs/>
+        </w:rPr>
+        <w:t xml:space="preserve">Figure 9. Per-reading cost against the number of stations (state is per station).</w:t>
+      </w:r>
+    </w:p>
+    <w:p>
+      <w:pPr>
+        <w:pStyle w:val="CaptionedFigure"/>
+      </w:pPr>
+      <w:r>
+        <w:drawing>
+          <wp:inline>
+            <wp:extent cx="5334000" cy="2987039"/>
+            <wp:effectExtent b="0" l="0" r="0" t="0"/>
+            <wp:docPr descr="Figure 10. Slow drift: the share of chunks where the drift monitor claims drift, against the size of the ramp." title="" id="117" name="Picture"/>
+            <a:graphic>
+              <a:graphicData uri="http://schemas.openxmlformats.org/drawingml/2006/picture">
+                <pic:pic>
+                  <pic:nvPicPr>
+                    <pic:cNvPr descr="figures/fig_drift_power.png" id="118" name="Picture"/>
+                    <pic:cNvPicPr>
+                      <a:picLocks noChangeArrowheads="1" noChangeAspect="1"/>
+                    </pic:cNvPicPr>
+                  </pic:nvPicPr>
+                  <pic:blipFill>
+                    <a:blip r:embed="rId116"/>
+                    <a:stretch>
+                      <a:fillRect/>
+                    </a:stretch>
+                  </pic:blipFill>
+                  <pic:spPr bwMode="auto">
+                    <a:xfrm>
+                      <a:off x="0" y="0"/>
+                      <a:ext cx="5334000" cy="2987039"/>
+                    </a:xfrm>
+                    <a:prstGeom prst="rect">
+                      <a:avLst/>
+                    </a:prstGeom>
+                    <a:noFill/>
+                    <a:ln w="9525">
+                      <a:noFill/>
+                      <a:headEnd/>
+                      <a:tailEnd/>
+                    </a:ln>
+                  </pic:spPr>
+                </pic:pic>
+              </a:graphicData>
+            </a:graphic>
+          </wp:inline>
+        </w:drawing>
+      </w:r>
+    </w:p>
+    <w:p>
+      <w:pPr>
+        <w:pStyle w:val="ImageCaption"/>
+      </w:pPr>
+      <w:r>
+        <w:t xml:space="preserve">Figure 10. Slow drift: the share of chunks where the drift monitor claims drift, against the size of the ramp.</w:t>
+      </w:r>
+    </w:p>
+    <w:p>
+      <w:pPr>
+        <w:pStyle w:val="BodyText"/>
+      </w:pPr>
+      <w:r>
+        <w:rPr>
+          <w:i/>
+          <w:iCs/>
+        </w:rPr>
+        <w:t xml:space="preserve">Figure 10. Slow drift: the share of chunks where the drift monitor claims drift, against the size of the ramp.</w:t>
+      </w:r>
+    </w:p>
+    <w:bookmarkEnd w:id="119"/>
+    <w:bookmarkEnd w:id="120"/>
+    <w:bookmarkStart w:id="125" w:name="X2044a3e36d2d5b2a8916663a95641182c65a810"/>
     <w:p>
       <w:pPr>
         <w:pStyle w:val="Heading2"/>
@@ -38226,7 +38906,7 @@
         <w:t xml:space="preserve">verdicts already reported.)</w:t>
       </w:r>
     </w:p>
-    <w:bookmarkStart w:id="90" w:name="the-three-windows"/>
+    <w:bookmarkStart w:id="121" w:name="the-three-windows"/>
     <w:p>
       <w:pPr>
         <w:pStyle w:val="Heading3"/>
@@ -38517,8 +39197,8 @@
         </w:tc>
       </w:tr>
     </w:tbl>
-    <w:bookmarkEnd w:id="90"/>
-    <w:bookmarkStart w:id="91" w:name="Xe40d6a0b54f3756887c834b5aaba6f2374833dc"/>
+    <w:bookmarkEnd w:id="121"/>
+    <w:bookmarkStart w:id="122" w:name="Xe40d6a0b54f3756887c834b5aaba6f2374833dc"/>
     <w:p>
       <w:pPr>
         <w:pStyle w:val="Heading3"/>
@@ -38643,8 +39323,8 @@
         <w:t xml:space="preserve">evaluated honestly. Re-running them on this holdout would turn it into a tuning set, so they are listed as next work.</w:t>
       </w:r>
     </w:p>
-    <w:bookmarkEnd w:id="91"/>
-    <w:bookmarkStart w:id="92" w:name="what-it-says-about-the-claim"/>
+    <w:bookmarkEnd w:id="122"/>
+    <w:bookmarkStart w:id="123" w:name="what-it-says-about-the-claim"/>
     <w:p>
       <w:pPr>
         <w:pStyle w:val="Heading3"/>
@@ -38700,8 +39380,8 @@
         <w:t xml:space="preserve">. The textbook rules baseline gets 95 of those 98 windows wrong.</w:t>
       </w:r>
     </w:p>
-    <w:bookmarkEnd w:id="92"/>
-    <w:bookmarkStart w:id="93" w:name="X668bf211504a1007173a5e749946da4f1cbd0fa"/>
+    <w:bookmarkEnd w:id="123"/>
+    <w:bookmarkStart w:id="124" w:name="X668bf211504a1007173a5e749946da4f1cbd0fa"/>
     <w:p>
       <w:pPr>
         <w:pStyle w:val="Heading3"/>
@@ -38917,9 +39597,9 @@
         <w:t xml:space="preserve">channels or the health score drops. We take that trade because sustained saturation is real weather more often than a stuck sensor is, and we say so.</w:t>
       </w:r>
     </w:p>
-    <w:bookmarkEnd w:id="93"/>
-    <w:bookmarkEnd w:id="94"/>
-    <w:bookmarkStart w:id="100" w:name="X0c6babe05ada4703930d11639828e5b6cecbbdf"/>
+    <w:bookmarkEnd w:id="124"/>
+    <w:bookmarkEnd w:id="125"/>
+    <w:bookmarkStart w:id="131" w:name="X0c6babe05ada4703930d11639828e5b6cecbbdf"/>
     <w:p>
       <w:pPr>
         <w:pStyle w:val="Heading2"/>
@@ -38928,7 +39608,7 @@
         <w:t xml:space="preserve">6. Limitations: what we do not claim and cannot see</w:t>
       </w:r>
     </w:p>
-    <w:bookmarkStart w:id="95" w:name="about-the-data"/>
+    <w:bookmarkStart w:id="126" w:name="about-the-data"/>
     <w:p>
       <w:pPr>
         <w:pStyle w:val="Heading3"/>
@@ -39099,8 +39779,8 @@
         <w:t xml:space="preserve">proof that we are right or that they are.</w:t>
       </w:r>
     </w:p>
-    <w:bookmarkEnd w:id="95"/>
-    <w:bookmarkStart w:id="96" w:name="about-the-results"/>
+    <w:bookmarkEnd w:id="126"/>
+    <w:bookmarkStart w:id="127" w:name="about-the-results"/>
     <w:p>
       <w:pPr>
         <w:pStyle w:val="Heading3"/>
@@ -39298,8 +39978,8 @@
         <w:t xml:space="preserve">records when, and the protocol was committed before.</w:t>
       </w:r>
     </w:p>
-    <w:bookmarkEnd w:id="96"/>
-    <w:bookmarkStart w:id="97" w:name="about-novelty"/>
+    <w:bookmarkEnd w:id="127"/>
+    <w:bookmarkStart w:id="128" w:name="about-novelty"/>
     <w:p>
       <w:pPr>
         <w:pStyle w:val="Heading3"/>
@@ -39445,8 +40125,8 @@
         <w:t xml:space="preserve">The wet-bulb check is a soft flag only.</w:t>
       </w:r>
     </w:p>
-    <w:bookmarkEnd w:id="97"/>
-    <w:bookmarkStart w:id="98" w:name="about-the-hardware-and-deployment"/>
+    <w:bookmarkEnd w:id="128"/>
+    <w:bookmarkStart w:id="129" w:name="about-the-hardware-and-deployment"/>
     <w:p>
       <w:pPr>
         <w:pStyle w:val="Heading3"/>
@@ -39604,8 +40284,8 @@
         <w:t xml:space="preserve">review and a long field trial.</w:t>
       </w:r>
     </w:p>
-    <w:bookmarkEnd w:id="98"/>
-    <w:bookmarkStart w:id="99" w:name="what-the-system-cannot-see"/>
+    <w:bookmarkEnd w:id="129"/>
+    <w:bookmarkStart w:id="130" w:name="what-the-system-cannot-see"/>
     <w:p>
       <w:pPr>
         <w:pStyle w:val="Heading3"/>
@@ -39933,9 +40613,9 @@
         <w:t xml:space="preserve">neighbour stations, a forecast model, a calibration record. By design we use none.</w:t>
       </w:r>
     </w:p>
-    <w:bookmarkEnd w:id="99"/>
-    <w:bookmarkEnd w:id="100"/>
-    <w:bookmarkStart w:id="106" w:name="related-work-and-what-is-ours"/>
+    <w:bookmarkEnd w:id="130"/>
+    <w:bookmarkEnd w:id="131"/>
+    <w:bookmarkStart w:id="137" w:name="related-work-and-what-is-ours"/>
     <w:p>
       <w:pPr>
         <w:pStyle w:val="Heading2"/>
@@ -39944,7 +40624,7 @@
         <w:t xml:space="preserve">7. Related work and what is ours</w:t>
       </w:r>
     </w:p>
-    <w:bookmarkStart w:id="101" w:name="what-is-standard"/>
+    <w:bookmarkStart w:id="132" w:name="what-is-standard"/>
     <w:p>
       <w:pPr>
         <w:pStyle w:val="Heading3"/>
@@ -40293,8 +40973,8 @@
         </w:tc>
       </w:tr>
     </w:tbl>
-    <w:bookmarkEnd w:id="101"/>
-    <w:bookmarkStart w:id="102" w:name="what-we-adapted"/>
+    <w:bookmarkEnd w:id="132"/>
+    <w:bookmarkStart w:id="133" w:name="what-we-adapted"/>
     <w:p>
       <w:pPr>
         <w:pStyle w:val="Heading3"/>
@@ -40663,8 +41343,8 @@
         </w:tc>
       </w:tr>
     </w:tbl>
-    <w:bookmarkEnd w:id="102"/>
-    <w:bookmarkStart w:id="103" w:name="what-is-ours"/>
+    <w:bookmarkEnd w:id="133"/>
+    <w:bookmarkStart w:id="134" w:name="what-is-ours"/>
     <w:p>
       <w:pPr>
         <w:pStyle w:val="Heading3"/>
@@ -41087,8 +41767,8 @@
         <w:t xml:space="preserve">That is a measured boundary, not a claim of a working detector.</w:t>
       </w:r>
     </w:p>
-    <w:bookmarkEnd w:id="103"/>
-    <w:bookmarkStart w:id="104" w:name="the-field-on-this-problem-statement"/>
+    <w:bookmarkEnd w:id="134"/>
+    <w:bookmarkStart w:id="135" w:name="the-field-on-this-problem-statement"/>
     <w:p>
       <w:pPr>
         <w:pStyle w:val="Heading3"/>
@@ -42053,8 +42733,8 @@
         <w:t xml:space="preserve">data, an agreement check against operational QC flags, or a stated list of what it cannot do.</w:t>
       </w:r>
     </w:p>
-    <w:bookmarkEnd w:id="104"/>
-    <w:bookmarkStart w:id="105" w:name="X76134177c3d160d01bb5613acfea090322b7d6d"/>
+    <w:bookmarkEnd w:id="135"/>
+    <w:bookmarkStart w:id="136" w:name="X76134177c3d160d01bb5613acfea090322b7d6d"/>
     <w:p>
       <w:pPr>
         <w:pStyle w:val="Heading3"/>
@@ -42314,9 +42994,9 @@
         </w:tc>
       </w:tr>
     </w:tbl>
-    <w:bookmarkEnd w:id="105"/>
-    <w:bookmarkEnd w:id="106"/>
-    <w:bookmarkStart w:id="110" w:name="reproducing-this-report"/>
+    <w:bookmarkEnd w:id="136"/>
+    <w:bookmarkEnd w:id="137"/>
+    <w:bookmarkStart w:id="141" w:name="reproducing-this-report"/>
     <w:p>
       <w:pPr>
         <w:pStyle w:val="Heading2"/>
@@ -42345,7 +43025,7 @@
         <w:t xml:space="preserve">.</w:t>
       </w:r>
     </w:p>
-    <w:bookmarkStart w:id="107" w:name="does-it-work"/>
+    <w:bookmarkStart w:id="138" w:name="does-it-work"/>
     <w:p>
       <w:pPr>
         <w:pStyle w:val="Heading3"/>
@@ -42401,8 +43081,8 @@
         <w:t xml:space="preserve"># 400+ tests, including the C++ edge-parity tests (needs g++)</w:t>
       </w:r>
     </w:p>
-    <w:bookmarkEnd w:id="107"/>
-    <w:bookmarkStart w:id="108" w:name="the-evidence"/>
+    <w:bookmarkEnd w:id="138"/>
+    <w:bookmarkStart w:id="139" w:name="the-evidence"/>
     <w:p>
       <w:pPr>
         <w:pStyle w:val="Heading3"/>
@@ -42734,7 +43414,7 @@
               <w:rPr>
                 <w:rStyle w:val="VerbatimChar"/>
               </w:rPr>
-              <w:t xml:space="preserve">python make_summary.py results/dev_run4.json results/holdout_run2.json results/fresh_run1.json --scale results/scale.json --coldstart results/coldstart.json --readme README.md --numbers docs/JUDGE_QA.md docs/SUBMISSION_TEXT.md</w:t>
+              <w:t xml:space="preserve">python make_summary.py results/dev_run4.json results/holdout_run2.json results/fresh_run1.json --scale results/scale.json --coldstart results/coldstart.json --sensitivity results/sensitivity.json --readme README.md --numbers docs/JUDGE_QA.md docs/SUBMISSION_TEXT.md</w:t>
             </w:r>
           </w:p>
         </w:tc>
@@ -42912,6 +43592,76 @@
                 <w:rStyle w:val="VerbatimChar"/>
               </w:rPr>
               <w:t xml:space="preserve">results/scale.json</w:t>
+            </w:r>
+          </w:p>
+        </w:tc>
+      </w:tr>
+      <w:tr>
+        <w:tc>
+          <w:tcPr/>
+          <w:p>
+            <w:pPr>
+              <w:pStyle w:val="Compact"/>
+            </w:pPr>
+            <w:r>
+              <w:t xml:space="preserve">How big must a fault be? (detection against fault size, DEV)</w:t>
+            </w:r>
+          </w:p>
+        </w:tc>
+        <w:tc>
+          <w:tcPr/>
+          <w:p>
+            <w:pPr>
+              <w:pStyle w:val="Compact"/>
+            </w:pPr>
+            <w:r>
+              <w:rPr>
+                <w:rStyle w:val="VerbatimChar"/>
+              </w:rPr>
+              <w:t xml:space="preserve">python evaluate_sensitivity.py --workers 4</w:t>
+            </w:r>
+            <w:r>
+              <w:t xml:space="preserve"> </w:t>
+            </w:r>
+            <w:r>
+              <w:t xml:space="preserve">(</w:t>
+            </w:r>
+            <w:r>
+              <w:rPr>
+                <w:rStyle w:val="VerbatimChar"/>
+              </w:rPr>
+              <w:t xml:space="preserve">--estimate</w:t>
+            </w:r>
+            <w:r>
+              <w:t xml:space="preserve"> </w:t>
+            </w:r>
+            <w:r>
+              <w:t xml:space="preserve">first)</w:t>
+            </w:r>
+          </w:p>
+        </w:tc>
+        <w:tc>
+          <w:tcPr/>
+          <w:p>
+            <w:pPr>
+              <w:pStyle w:val="Compact"/>
+            </w:pPr>
+            <w:r>
+              <w:t xml:space="preserve">3 min</w:t>
+            </w:r>
+          </w:p>
+        </w:tc>
+        <w:tc>
+          <w:tcPr/>
+          <w:p>
+            <w:pPr>
+              <w:pStyle w:val="Compact"/>
+            </w:pPr>
+            <w:r>
+              <w:rPr>
+                <w:rStyle w:val="VerbatimChar"/>
+              </w:rPr>
+              <w:t xml:space="preserve">results/sensitivity.json</w:t>
             </w:r>
           </w:p>
         </w:tc>
@@ -43445,8 +44195,8 @@
         <w:t xml:space="preserve">are for tuning loops only.</w:t>
       </w:r>
     </w:p>
-    <w:bookmarkEnd w:id="108"/>
-    <w:bookmarkStart w:id="109" w:name="determinism"/>
+    <w:bookmarkEnd w:id="139"/>
+    <w:bookmarkStart w:id="140" w:name="determinism"/>
     <w:p>
       <w:pPr>
         <w:pStyle w:val="Heading3"/>
@@ -43484,9 +44234,9 @@
         <w:t xml:space="preserve">the Isolation Forest scores.</w:t>
       </w:r>
     </w:p>
-    <w:bookmarkEnd w:id="109"/>
-    <w:bookmarkEnd w:id="110"/>
-    <w:bookmarkStart w:id="111" w:name="references"/>
+    <w:bookmarkEnd w:id="140"/>
+    <w:bookmarkEnd w:id="141"/>
+    <w:bookmarkStart w:id="142" w:name="references"/>
     <w:p>
       <w:pPr>
         <w:pStyle w:val="Heading2"/>
@@ -43960,8 +44710,8 @@
         <w:t xml:space="preserve">.</w:t>
       </w:r>
     </w:p>
-    <w:bookmarkEnd w:id="111"/>
-    <w:bookmarkEnd w:id="112"/>
+    <w:bookmarkEnd w:id="142"/>
+    <w:bookmarkEnd w:id="143"/>
     <w:sectPr>
       <w:footnotePr>
         <w:numRestart w:val="eachSect"/>

</xml_diff>

<commit_message>
What we do not claim: the shipped default versus the holdout, lower detection on unseen stations, cold-start scope, learning from an uploaded file
</commit_message>
<xml_diff>
--- a/docs/TECHNICAL_REPORT.docx
+++ b/docs/TECHNICAL_REPORT.docx
@@ -39975,7 +39975,250 @@
         <w:t xml:space="preserve"> </w:t>
       </w:r>
       <w:r>
-        <w:t xml:space="preserve">records when, and the protocol was committed before.</w:t>
+        <w:t xml:space="preserve">records when, and the protocol was committed before. It was read a second time (</w:t>
+      </w:r>
+      <w:r>
+        <w:rPr>
+          <w:rStyle w:val="VerbatimChar"/>
+        </w:rPr>
+        <w:t xml:space="preserve">holdout_run2</w:t>
+      </w:r>
+      <w:r>
+        <w:t xml:space="preserve">) only to re-score detection under Amendment 1;</w:t>
+      </w:r>
+      <w:r>
+        <w:t xml:space="preserve"> </w:t>
+      </w:r>
+      <w:r>
+        <w:t xml:space="preserve">every registered number reproduced exactly (</w:t>
+      </w:r>
+      <w:r>
+        <w:rPr>
+          <w:rStyle w:val="VerbatimChar"/>
+        </w:rPr>
+        <w:t xml:space="preserve">python compare_runs.py</w:t>
+      </w:r>
+      <w:r>
+        <w:t xml:space="preserve">).</w:t>
+      </w:r>
+    </w:p>
+    <w:p>
+      <w:pPr>
+        <w:pStyle w:val="Compact"/>
+        <w:numPr>
+          <w:ilvl w:val="0"/>
+          <w:numId w:val="1013"/>
+        </w:numPr>
+      </w:pPr>
+      <w:r>
+        <w:rPr>
+          <w:b/>
+          <w:bCs/>
+        </w:rPr>
+        <w:t xml:space="preserve">The shipped default is not exactly what the holdout ran.</w:t>
+      </w:r>
+      <w:r>
+        <w:t xml:space="preserve"> </w:t>
+      </w:r>
+      <w:r>
+        <w:t xml:space="preserve">After the fresh-station test, one remedy (the ceiling-aware frozen rule) was adopted by a</w:t>
+      </w:r>
+      <w:r>
+        <w:t xml:space="preserve"> </w:t>
+      </w:r>
+      <w:r>
+        <w:t xml:space="preserve">rule registered before that test. The evaluation’s</w:t>
+      </w:r>
+      <w:r>
+        <w:t xml:space="preserve"> </w:t>
+      </w:r>
+      <w:r>
+        <w:rPr>
+          <w:rStyle w:val="VerbatimChar"/>
+        </w:rPr>
+        <w:t xml:space="preserve">full</w:t>
+      </w:r>
+      <w:r>
+        <w:t xml:space="preserve"> </w:t>
+      </w:r>
+      <w:r>
+        <w:t xml:space="preserve">configuration still forces it off, so every reported number reproduces; the remedy’s own numbers</w:t>
+      </w:r>
+      <w:r>
+        <w:t xml:space="preserve"> </w:t>
+      </w:r>
+      <w:r>
+        <w:t xml:space="preserve">are on the fresh stations only, and it changed nothing on DEV. The frozen pipeline still gets a</w:t>
+      </w:r>
+      <w:r>
+        <w:t xml:space="preserve"> </w:t>
+      </w:r>
+      <w:r>
+        <w:rPr>
+          <w:rStyle w:val="VerbatimChar"/>
+        </w:rPr>
+        <w:t xml:space="preserve">FAULT</w:t>
+      </w:r>
+      <w:r>
+        <w:t xml:space="preserve"> </w:t>
+      </w:r>
+      <w:r>
+        <w:t xml:space="preserve">in 3 of 98 and 3 of 139 real extreme-weather windows on</w:t>
+      </w:r>
+      <w:r>
+        <w:t xml:space="preserve"> </w:t>
+      </w:r>
+      <w:r>
+        <w:t xml:space="preserve">unseen stations.</w:t>
+      </w:r>
+    </w:p>
+    <w:p>
+      <w:pPr>
+        <w:pStyle w:val="Compact"/>
+        <w:numPr>
+          <w:ilvl w:val="0"/>
+          <w:numId w:val="1013"/>
+        </w:numPr>
+      </w:pPr>
+      <w:r>
+        <w:rPr>
+          <w:b/>
+          <w:bCs/>
+        </w:rPr>
+        <w:t xml:space="preserve">Detection is lower on unseen stations than on DEV,</w:t>
+      </w:r>
+      <w:r>
+        <w:t xml:space="preserve"> </w:t>
+      </w:r>
+      <w:r>
+        <w:t xml:space="preserve">and most detections of spikes, level shifts, noise bursts and wrong clocks are</w:t>
+      </w:r>
+      <w:r>
+        <w:t xml:space="preserve"> </w:t>
+      </w:r>
+      <w:r>
+        <w:rPr>
+          <w:rStyle w:val="VerbatimChar"/>
+        </w:rPr>
+        <w:t xml:space="preserve">SUSPECT</w:t>
+      </w:r>
+      <w:r>
+        <w:t xml:space="preserve">, not</w:t>
+      </w:r>
+      <w:r>
+        <w:t xml:space="preserve"> </w:t>
+      </w:r>
+      <w:r>
+        <w:rPr>
+          <w:rStyle w:val="VerbatimChar"/>
+        </w:rPr>
+        <w:t xml:space="preserve">FAULT</w:t>
+      </w:r>
+      <w:r>
+        <w:t xml:space="preserve">.</w:t>
+      </w:r>
+      <w:r>
+        <w:t xml:space="preserve"> </w:t>
+      </w:r>
+      <w:r>
+        <w:t xml:space="preserve">Simpler detectors beat the full pipeline on some fault types (see</w:t>
+      </w:r>
+      <w:r>
+        <w:t xml:space="preserve"> </w:t>
+      </w:r>
+      <w:r>
+        <w:rPr>
+          <w:rStyle w:val="VerbatimChar"/>
+        </w:rPr>
+        <w:t xml:space="preserve">results/REPORT.md</w:t>
+      </w:r>
+      <w:r>
+        <w:t xml:space="preserve">).</w:t>
+      </w:r>
+    </w:p>
+    <w:p>
+      <w:pPr>
+        <w:pStyle w:val="Compact"/>
+        <w:numPr>
+          <w:ilvl w:val="0"/>
+          <w:numId w:val="1013"/>
+        </w:numPr>
+      </w:pPr>
+      <w:r>
+        <w:rPr>
+          <w:b/>
+          <w:bCs/>
+        </w:rPr>
+        <w:t xml:space="preserve">The cold-start study covers six stations,</w:t>
+      </w:r>
+      <w:r>
+        <w:t xml:space="preserve"> </w:t>
+      </w:r>
+      <w:r>
+        <w:t xml:space="preserve">each borrowing from its nearest neighbour among the other five. A new station in a climate none of them share may</w:t>
+      </w:r>
+      <w:r>
+        <w:t xml:space="preserve"> </w:t>
+      </w:r>
+      <w:r>
+        <w:t xml:space="preserve">need more of its own history.</w:t>
+      </w:r>
+    </w:p>
+    <w:p>
+      <w:pPr>
+        <w:pStyle w:val="Compact"/>
+        <w:numPr>
+          <w:ilvl w:val="0"/>
+          <w:numId w:val="1013"/>
+        </w:numPr>
+      </w:pPr>
+      <w:r>
+        <w:rPr>
+          <w:b/>
+          <w:bCs/>
+        </w:rPr>
+        <w:t xml:space="preserve">“Learn from the first half of the file”</w:t>
+      </w:r>
+      <w:r>
+        <w:rPr>
+          <w:b/>
+          <w:bCs/>
+        </w:rPr>
+        <w:t xml:space="preserve"> </w:t>
+      </w:r>
+      <w:r>
+        <w:rPr>
+          <w:b/>
+          <w:bCs/>
+        </w:rPr>
+        <w:t xml:space="preserve">trusts that half.</w:t>
+      </w:r>
+      <w:r>
+        <w:t xml:space="preserve"> </w:t>
+      </w:r>
+      <w:r>
+        <w:t xml:space="preserve">Bring your own CSV learns a new station from the first half of its file; a stuck sensor or a storm in</w:t>
+      </w:r>
+      <w:r>
+        <w:t xml:space="preserve"> </w:t>
+      </w:r>
+      <w:r>
+        <w:t xml:space="preserve">that half is learned as normal.</w:t>
+      </w:r>
+      <w:r>
+        <w:t xml:space="preserve"> </w:t>
+      </w:r>
+      <w:r>
+        <w:rPr>
+          <w:rStyle w:val="VerbatimChar"/>
+        </w:rPr>
+        <w:t xml:space="preserve">evaluate_csv.py</w:t>
+      </w:r>
+      <w:r>
+        <w:t xml:space="preserve"> </w:t>
+      </w:r>
+      <w:r>
+        <w:t xml:space="preserve">is the careful offline version.</w:t>
       </w:r>
     </w:p>
     <w:bookmarkEnd w:id="127"/>

</xml_diff>